<commit_message>
added all the protocol codes to file
</commit_message>
<xml_diff>
--- a/TriviaProtocol.docx
+++ b/TriviaProtocol.docx
@@ -1,6 +1,6 @@
 
 <file path=word/document.xml><?xml version="1.0" encoding="utf-8"?>
-<w:document xmlns:wpc="http://schemas.microsoft.com/office/word/2010/wordprocessingCanvas" xmlns:cx="http://schemas.microsoft.com/office/drawing/2014/chartex" xmlns:cx1="http://schemas.microsoft.com/office/drawing/2015/9/8/chartex" xmlns:cx2="http://schemas.microsoft.com/office/drawing/2015/10/21/chartex" xmlns:cx3="http://schemas.microsoft.com/office/drawing/2016/5/9/chartex" xmlns:cx4="http://schemas.microsoft.com/office/drawing/2016/5/10/chartex" xmlns:cx5="http://schemas.microsoft.com/office/drawing/2016/5/11/chartex" xmlns:cx6="http://schemas.microsoft.com/office/drawing/2016/5/12/chartex" xmlns:cx7="http://schemas.microsoft.com/office/drawing/2016/5/13/chartex" xmlns:cx8="http://schemas.microsoft.com/office/drawing/2016/5/14/chartex" xmlns:mc="http://schemas.openxmlformats.org/markup-compatibility/2006" xmlns:aink="http://schemas.microsoft.com/office/drawing/2016/ink" xmlns:am3d="http://schemas.microsoft.com/office/drawing/2017/model3d" xmlns:o="urn:schemas-microsoft-com:office:office" xmlns:oel="http://schemas.microsoft.com/office/2019/extlst" xmlns:r="http://schemas.openxmlformats.org/officeDocument/2006/relationships" xmlns:m="http://schemas.openxmlformats.org/officeDocument/2006/math" xmlns:v="urn:schemas-microsoft-com:vml" xmlns:wp14="http://schemas.microsoft.com/office/word/2010/wordprocessingDrawing" xmlns:wp="http://schemas.openxmlformats.org/drawingml/2006/wordprocessingDrawing" xmlns:w10="urn:schemas-microsoft-com:office:word" xmlns:w="http://schemas.openxmlformats.org/wordprocessingml/2006/main" xmlns:w14="http://schemas.microsoft.com/office/word/2010/wordml" xmlns:w15="http://schemas.microsoft.com/office/word/2012/wordml" xmlns:w16cex="http://schemas.microsoft.com/office/word/2018/wordml/cex" xmlns:w16cid="http://schemas.microsoft.com/office/word/2016/wordml/cid" xmlns:w16="http://schemas.microsoft.com/office/word/2018/wordml" xmlns:w16sdtdh="http://schemas.microsoft.com/office/word/2020/wordml/sdtdatahash" xmlns:w16se="http://schemas.microsoft.com/office/word/2015/wordml/symex" xmlns:wpg="http://schemas.microsoft.com/office/word/2010/wordprocessingGroup" xmlns:wpi="http://schemas.microsoft.com/office/word/2010/wordprocessingInk" xmlns:wne="http://schemas.microsoft.com/office/word/2006/wordml" xmlns:wps="http://schemas.microsoft.com/office/word/2010/wordprocessingShape" mc:Ignorable="w14 w15 w16se w16cid w16 w16cex w16sdtdh wp14">
+<w:document xmlns:wpc="http://schemas.microsoft.com/office/word/2010/wordprocessingCanvas" xmlns:cx="http://schemas.microsoft.com/office/drawing/2014/chartex" xmlns:cx1="http://schemas.microsoft.com/office/drawing/2015/9/8/chartex" xmlns:cx2="http://schemas.microsoft.com/office/drawing/2015/10/21/chartex" xmlns:cx3="http://schemas.microsoft.com/office/drawing/2016/5/9/chartex" xmlns:cx4="http://schemas.microsoft.com/office/drawing/2016/5/10/chartex" xmlns:cx5="http://schemas.microsoft.com/office/drawing/2016/5/11/chartex" xmlns:cx6="http://schemas.microsoft.com/office/drawing/2016/5/12/chartex" xmlns:cx7="http://schemas.microsoft.com/office/drawing/2016/5/13/chartex" xmlns:cx8="http://schemas.microsoft.com/office/drawing/2016/5/14/chartex" xmlns:mc="http://schemas.openxmlformats.org/markup-compatibility/2006" xmlns:aink="http://schemas.microsoft.com/office/drawing/2016/ink" xmlns:am3d="http://schemas.microsoft.com/office/drawing/2017/model3d" xmlns:o="urn:schemas-microsoft-com:office:office" xmlns:r="http://schemas.openxmlformats.org/officeDocument/2006/relationships" xmlns:m="http://schemas.openxmlformats.org/officeDocument/2006/math" xmlns:v="urn:schemas-microsoft-com:vml" xmlns:wp14="http://schemas.microsoft.com/office/word/2010/wordprocessingDrawing" xmlns:wp="http://schemas.openxmlformats.org/drawingml/2006/wordprocessingDrawing" xmlns:w10="urn:schemas-microsoft-com:office:word" xmlns:w="http://schemas.openxmlformats.org/wordprocessingml/2006/main" xmlns:w14="http://schemas.microsoft.com/office/word/2010/wordml" xmlns:w15="http://schemas.microsoft.com/office/word/2012/wordml" xmlns:w16cid="http://schemas.microsoft.com/office/word/2016/wordml/cid" xmlns:w16se="http://schemas.microsoft.com/office/word/2015/wordml/symex" xmlns:wpg="http://schemas.microsoft.com/office/word/2010/wordprocessingGroup" xmlns:wpi="http://schemas.microsoft.com/office/word/2010/wordprocessingInk" xmlns:wne="http://schemas.microsoft.com/office/word/2006/wordml" xmlns:wps="http://schemas.microsoft.com/office/word/2010/wordprocessingShape" mc:Ignorable="w14 w15 w16se w16cid wp14">
   <w:body>
     <w:p>
       <w:pPr>
@@ -259,12 +259,16 @@
         <w:bidi w:val="0"/>
         <w:ind w:left="2510"/>
         <w:rPr>
-          <w:sz w:val="24"/>
-          <w:szCs w:val="24"/>
-        </w:rPr>
-      </w:pPr>
-      <w:r>
-        <w:rPr>
+          <w:b/>
+          <w:bCs/>
+          <w:sz w:val="24"/>
+          <w:szCs w:val="24"/>
+        </w:rPr>
+      </w:pPr>
+      <w:r>
+        <w:rPr>
+          <w:b/>
+          <w:bCs/>
           <w:sz w:val="24"/>
           <w:szCs w:val="24"/>
         </w:rPr>
@@ -605,7 +609,23 @@
           <w:sz w:val="24"/>
           <w:szCs w:val="24"/>
         </w:rPr>
-        <w:t xml:space="preserve"> username is already exist in the system</w:t>
+        <w:t xml:space="preserve"> username is already </w:t>
+      </w:r>
+      <w:proofErr w:type="gramStart"/>
+      <w:r>
+        <w:rPr>
+          <w:sz w:val="24"/>
+          <w:szCs w:val="24"/>
+        </w:rPr>
+        <w:t>exist</w:t>
+      </w:r>
+      <w:proofErr w:type="gramEnd"/>
+      <w:r>
+        <w:rPr>
+          <w:sz w:val="24"/>
+          <w:szCs w:val="24"/>
+        </w:rPr>
+        <w:t xml:space="preserve"> in the system</w:t>
       </w:r>
       <w:r>
         <w:rPr>
@@ -689,19 +709,99 @@
     </w:p>
     <w:p>
       <w:pPr>
-        <w:bidi w:val="0"/>
-        <w:ind w:left="1080" w:firstLine="360"/>
-        <w:rPr>
-          <w:sz w:val="24"/>
-          <w:szCs w:val="24"/>
-        </w:rPr>
-      </w:pPr>
-      <w:r>
-        <w:rPr>
-          <w:sz w:val="24"/>
-          <w:szCs w:val="24"/>
-        </w:rPr>
-        <w:t>1.</w:t>
+        <w:pStyle w:val="a3"/>
+        <w:numPr>
+          <w:ilvl w:val="0"/>
+          <w:numId w:val="4"/>
+        </w:numPr>
+        <w:bidi w:val="0"/>
+        <w:rPr>
+          <w:sz w:val="24"/>
+          <w:szCs w:val="24"/>
+        </w:rPr>
+      </w:pPr>
+      <w:r>
+        <w:rPr>
+          <w:sz w:val="24"/>
+          <w:szCs w:val="24"/>
+        </w:rPr>
+        <w:t xml:space="preserve">Password is not strong </w:t>
+      </w:r>
+      <w:r>
+        <w:rPr>
+          <w:sz w:val="24"/>
+          <w:szCs w:val="24"/>
+        </w:rPr>
+        <w:t>enough</w:t>
+      </w:r>
+    </w:p>
+    <w:p>
+      <w:pPr>
+        <w:pStyle w:val="a3"/>
+        <w:bidi w:val="0"/>
+        <w:ind w:left="1800"/>
+        <w:rPr>
+          <w:sz w:val="24"/>
+          <w:szCs w:val="24"/>
+        </w:rPr>
+      </w:pPr>
+    </w:p>
+    <w:p>
+      <w:pPr>
+        <w:bidi w:val="0"/>
+        <w:rPr>
+          <w:b/>
+          <w:bCs/>
+          <w:sz w:val="28"/>
+          <w:szCs w:val="28"/>
+          <w:u w:val="single"/>
+        </w:rPr>
+      </w:pPr>
+      <w:r>
+        <w:rPr>
+          <w:b/>
+          <w:bCs/>
+          <w:sz w:val="28"/>
+          <w:szCs w:val="28"/>
+          <w:u w:val="single"/>
+        </w:rPr>
+        <w:t>Logout:</w:t>
+      </w:r>
+    </w:p>
+    <w:p>
+      <w:pPr>
+        <w:bidi w:val="0"/>
+        <w:rPr>
+          <w:sz w:val="24"/>
+          <w:szCs w:val="24"/>
+          <w:u w:val="single"/>
+        </w:rPr>
+      </w:pPr>
+      <w:r>
+        <w:rPr>
+          <w:sz w:val="24"/>
+          <w:szCs w:val="24"/>
+          <w:u w:val="single"/>
+        </w:rPr>
+        <w:t>Codes range 300-399</w:t>
+      </w:r>
+    </w:p>
+    <w:p>
+      <w:pPr>
+        <w:bidi w:val="0"/>
+        <w:rPr>
+          <w:sz w:val="24"/>
+          <w:szCs w:val="24"/>
+        </w:rPr>
+      </w:pPr>
+      <w:r>
+        <w:rPr>
+          <w:b/>
+          <w:bCs/>
+          <w:sz w:val="24"/>
+          <w:szCs w:val="24"/>
+        </w:rPr>
+        <w:t>300</w:t>
       </w:r>
       <w:r>
         <w:rPr>
@@ -715,65 +815,1259 @@
           <w:sz w:val="24"/>
           <w:szCs w:val="24"/>
         </w:rPr>
-        <w:t xml:space="preserve">Password is not strong </w:t>
-      </w:r>
-      <w:r>
-        <w:rPr>
-          <w:sz w:val="24"/>
-          <w:szCs w:val="24"/>
-        </w:rPr>
-        <w:t>enough</w:t>
-      </w:r>
-    </w:p>
-    <w:p>
-      <w:pPr>
-        <w:bidi w:val="0"/>
-        <w:rPr>
-          <w:sz w:val="24"/>
-          <w:szCs w:val="24"/>
-        </w:rPr>
-      </w:pPr>
-      <w:r>
-        <w:rPr>
-          <w:sz w:val="24"/>
-          <w:szCs w:val="24"/>
-        </w:rPr>
-        <w:t>Logout:</w:t>
-      </w:r>
-    </w:p>
-    <w:p>
-      <w:pPr>
-        <w:bidi w:val="0"/>
-        <w:rPr>
-          <w:sz w:val="24"/>
-          <w:szCs w:val="24"/>
-        </w:rPr>
-      </w:pPr>
-      <w:r>
-        <w:rPr>
-          <w:sz w:val="24"/>
-          <w:szCs w:val="24"/>
-        </w:rPr>
-        <w:t>Codes range 300-399</w:t>
-      </w:r>
-    </w:p>
-    <w:p>
-      <w:pPr>
-        <w:bidi w:val="0"/>
-        <w:rPr>
-          <w:rFonts w:hint="cs"/>
-          <w:sz w:val="24"/>
-          <w:szCs w:val="24"/>
+        <w:t>-</w:t>
+      </w:r>
+      <w:r>
+        <w:rPr>
+          <w:sz w:val="24"/>
+          <w:szCs w:val="24"/>
+        </w:rPr>
+        <w:t xml:space="preserve"> logout</w:t>
+      </w:r>
+      <w:r>
+        <w:rPr>
+          <w:sz w:val="24"/>
+          <w:szCs w:val="24"/>
+        </w:rPr>
+        <w:t xml:space="preserve"> request from client</w:t>
+      </w:r>
+    </w:p>
+    <w:p>
+      <w:pPr>
+        <w:bidi w:val="0"/>
+        <w:rPr>
+          <w:sz w:val="24"/>
+          <w:szCs w:val="24"/>
+        </w:rPr>
+      </w:pPr>
+      <w:r>
+        <w:rPr>
+          <w:b/>
+          <w:bCs/>
+          <w:sz w:val="24"/>
+          <w:szCs w:val="24"/>
+        </w:rPr>
+        <w:t xml:space="preserve">301 - </w:t>
+      </w:r>
+      <w:r>
+        <w:rPr>
+          <w:sz w:val="24"/>
+          <w:szCs w:val="24"/>
+        </w:rPr>
+        <w:t>logout accept from server</w:t>
+      </w:r>
+    </w:p>
+    <w:p>
+      <w:pPr>
+        <w:bidi w:val="0"/>
+        <w:rPr>
+          <w:sz w:val="24"/>
+          <w:szCs w:val="24"/>
+        </w:rPr>
+      </w:pPr>
+      <w:r>
+        <w:rPr>
+          <w:b/>
+          <w:bCs/>
+          <w:sz w:val="24"/>
+          <w:szCs w:val="24"/>
+        </w:rPr>
+        <w:t>305</w:t>
+      </w:r>
+      <w:r>
+        <w:rPr>
+          <w:sz w:val="24"/>
+          <w:szCs w:val="24"/>
+        </w:rPr>
+        <w:t xml:space="preserve"> – logout error from server</w:t>
+      </w:r>
+    </w:p>
+    <w:p>
+      <w:pPr>
+        <w:bidi w:val="0"/>
+        <w:rPr>
+          <w:sz w:val="28"/>
+          <w:szCs w:val="28"/>
+        </w:rPr>
+      </w:pPr>
+    </w:p>
+    <w:p>
+      <w:pPr>
+        <w:bidi w:val="0"/>
+        <w:rPr>
+          <w:sz w:val="28"/>
+          <w:szCs w:val="28"/>
+        </w:rPr>
+      </w:pPr>
+    </w:p>
+    <w:p>
+      <w:pPr>
+        <w:bidi w:val="0"/>
+        <w:rPr>
+          <w:b/>
+          <w:bCs/>
+          <w:sz w:val="28"/>
+          <w:szCs w:val="28"/>
+          <w:u w:val="single"/>
+        </w:rPr>
+      </w:pPr>
+      <w:r>
+        <w:rPr>
+          <w:b/>
+          <w:bCs/>
+          <w:sz w:val="28"/>
+          <w:szCs w:val="28"/>
+          <w:u w:val="single"/>
+        </w:rPr>
+        <w:lastRenderedPageBreak/>
+        <w:t>Get Rooms</w:t>
+      </w:r>
+    </w:p>
+    <w:p>
+      <w:pPr>
+        <w:bidi w:val="0"/>
+        <w:rPr>
+          <w:sz w:val="24"/>
+          <w:szCs w:val="24"/>
+          <w:u w:val="single"/>
+        </w:rPr>
+      </w:pPr>
+      <w:r>
+        <w:rPr>
+          <w:sz w:val="24"/>
+          <w:szCs w:val="24"/>
+          <w:u w:val="single"/>
+        </w:rPr>
+        <w:t>Code range 400 – 499</w:t>
+      </w:r>
+    </w:p>
+    <w:p>
+      <w:pPr>
+        <w:bidi w:val="0"/>
+        <w:rPr>
+          <w:sz w:val="24"/>
+          <w:szCs w:val="24"/>
+        </w:rPr>
+      </w:pPr>
+      <w:r>
+        <w:rPr>
+          <w:b/>
+          <w:bCs/>
+          <w:sz w:val="24"/>
+          <w:szCs w:val="24"/>
+        </w:rPr>
+        <w:t>4</w:t>
+      </w:r>
+      <w:r>
+        <w:rPr>
+          <w:b/>
+          <w:bCs/>
+          <w:sz w:val="24"/>
+          <w:szCs w:val="24"/>
+        </w:rPr>
+        <w:t>00</w:t>
+      </w:r>
+      <w:r>
+        <w:rPr>
+          <w:sz w:val="24"/>
+          <w:szCs w:val="24"/>
+        </w:rPr>
+        <w:t xml:space="preserve"> </w:t>
+      </w:r>
+      <w:r>
+        <w:rPr>
+          <w:sz w:val="24"/>
+          <w:szCs w:val="24"/>
+        </w:rPr>
+        <w:t xml:space="preserve">- </w:t>
+      </w:r>
+      <w:r>
+        <w:rPr>
+          <w:sz w:val="24"/>
+          <w:szCs w:val="24"/>
+        </w:rPr>
+        <w:t>get rooms</w:t>
+      </w:r>
+      <w:r>
+        <w:rPr>
+          <w:sz w:val="24"/>
+          <w:szCs w:val="24"/>
+        </w:rPr>
+        <w:t xml:space="preserve"> request from client</w:t>
+      </w:r>
+    </w:p>
+    <w:p>
+      <w:pPr>
+        <w:bidi w:val="0"/>
+        <w:rPr>
+          <w:sz w:val="24"/>
+          <w:szCs w:val="24"/>
+        </w:rPr>
+      </w:pPr>
+      <w:r>
+        <w:rPr>
+          <w:b/>
+          <w:bCs/>
+          <w:sz w:val="24"/>
+          <w:szCs w:val="24"/>
+        </w:rPr>
+        <w:t>4</w:t>
+      </w:r>
+      <w:r>
+        <w:rPr>
+          <w:b/>
+          <w:bCs/>
+          <w:sz w:val="24"/>
+          <w:szCs w:val="24"/>
+        </w:rPr>
+        <w:t xml:space="preserve">01 </w:t>
+      </w:r>
+      <w:r>
+        <w:rPr>
+          <w:b/>
+          <w:bCs/>
+          <w:sz w:val="24"/>
+          <w:szCs w:val="24"/>
+        </w:rPr>
+        <w:t>-</w:t>
+      </w:r>
+      <w:r>
+        <w:rPr>
+          <w:b/>
+          <w:bCs/>
+          <w:sz w:val="24"/>
+          <w:szCs w:val="24"/>
+        </w:rPr>
+        <w:t xml:space="preserve"> </w:t>
+      </w:r>
+      <w:r>
+        <w:rPr>
+          <w:sz w:val="24"/>
+          <w:szCs w:val="24"/>
+        </w:rPr>
+        <w:t>get rooms</w:t>
+      </w:r>
+      <w:r>
+        <w:rPr>
+          <w:sz w:val="24"/>
+          <w:szCs w:val="24"/>
+        </w:rPr>
+        <w:t xml:space="preserve"> accept from server</w:t>
+      </w:r>
+    </w:p>
+    <w:p>
+      <w:pPr>
+        <w:bidi w:val="0"/>
+        <w:rPr>
+          <w:sz w:val="24"/>
+          <w:szCs w:val="24"/>
+        </w:rPr>
+      </w:pPr>
+      <w:r>
+        <w:rPr>
+          <w:b/>
+          <w:bCs/>
+          <w:sz w:val="24"/>
+          <w:szCs w:val="24"/>
+        </w:rPr>
+        <w:t>4</w:t>
+      </w:r>
+      <w:r>
+        <w:rPr>
+          <w:b/>
+          <w:bCs/>
+          <w:sz w:val="24"/>
+          <w:szCs w:val="24"/>
+        </w:rPr>
+        <w:t>05</w:t>
+      </w:r>
+      <w:r>
+        <w:rPr>
+          <w:sz w:val="24"/>
+          <w:szCs w:val="24"/>
+        </w:rPr>
+        <w:t xml:space="preserve"> </w:t>
+      </w:r>
+      <w:r>
+        <w:rPr>
+          <w:sz w:val="24"/>
+          <w:szCs w:val="24"/>
+        </w:rPr>
+        <w:t>-</w:t>
+      </w:r>
+      <w:r>
+        <w:rPr>
+          <w:sz w:val="24"/>
+          <w:szCs w:val="24"/>
+        </w:rPr>
+        <w:t xml:space="preserve"> </w:t>
+      </w:r>
+      <w:r>
+        <w:rPr>
+          <w:sz w:val="24"/>
+          <w:szCs w:val="24"/>
+        </w:rPr>
+        <w:t xml:space="preserve">get rooms </w:t>
+      </w:r>
+      <w:r>
+        <w:rPr>
+          <w:sz w:val="24"/>
+          <w:szCs w:val="24"/>
+        </w:rPr>
+        <w:t>error from server</w:t>
+      </w:r>
+    </w:p>
+    <w:p>
+      <w:pPr>
+        <w:bidi w:val="0"/>
+        <w:rPr>
+          <w:sz w:val="24"/>
+          <w:szCs w:val="24"/>
+        </w:rPr>
+      </w:pPr>
+    </w:p>
+    <w:p>
+      <w:pPr>
+        <w:bidi w:val="0"/>
+        <w:rPr>
+          <w:b/>
+          <w:bCs/>
+          <w:sz w:val="28"/>
+          <w:szCs w:val="28"/>
+          <w:u w:val="single"/>
+        </w:rPr>
+      </w:pPr>
+      <w:r>
+        <w:rPr>
+          <w:b/>
+          <w:bCs/>
+          <w:sz w:val="28"/>
+          <w:szCs w:val="28"/>
+          <w:u w:val="single"/>
+        </w:rPr>
+        <w:t xml:space="preserve">Get </w:t>
+      </w:r>
+      <w:r>
+        <w:rPr>
+          <w:b/>
+          <w:bCs/>
+          <w:sz w:val="28"/>
+          <w:szCs w:val="28"/>
+          <w:u w:val="single"/>
+        </w:rPr>
+        <w:t xml:space="preserve">Player </w:t>
+      </w:r>
+      <w:proofErr w:type="gramStart"/>
+      <w:r>
+        <w:rPr>
+          <w:b/>
+          <w:bCs/>
+          <w:sz w:val="28"/>
+          <w:szCs w:val="28"/>
+          <w:u w:val="single"/>
+        </w:rPr>
+        <w:t>In</w:t>
+      </w:r>
+      <w:proofErr w:type="gramEnd"/>
+      <w:r>
+        <w:rPr>
+          <w:b/>
+          <w:bCs/>
+          <w:sz w:val="28"/>
+          <w:szCs w:val="28"/>
+          <w:u w:val="single"/>
+        </w:rPr>
+        <w:t xml:space="preserve"> Room</w:t>
+      </w:r>
+    </w:p>
+    <w:p>
+      <w:pPr>
+        <w:bidi w:val="0"/>
+        <w:rPr>
+          <w:sz w:val="24"/>
+          <w:szCs w:val="24"/>
+          <w:u w:val="single"/>
+        </w:rPr>
+      </w:pPr>
+      <w:r>
+        <w:rPr>
+          <w:sz w:val="24"/>
+          <w:szCs w:val="24"/>
+          <w:u w:val="single"/>
+        </w:rPr>
+        <w:t xml:space="preserve">Code range </w:t>
+      </w:r>
+      <w:r>
+        <w:rPr>
+          <w:sz w:val="24"/>
+          <w:szCs w:val="24"/>
+          <w:u w:val="single"/>
+        </w:rPr>
+        <w:t>5</w:t>
+      </w:r>
+      <w:r>
+        <w:rPr>
+          <w:sz w:val="24"/>
+          <w:szCs w:val="24"/>
+          <w:u w:val="single"/>
+        </w:rPr>
+        <w:t xml:space="preserve">00 – </w:t>
+      </w:r>
+      <w:r>
+        <w:rPr>
+          <w:sz w:val="24"/>
+          <w:szCs w:val="24"/>
+          <w:u w:val="single"/>
+        </w:rPr>
+        <w:t>5</w:t>
+      </w:r>
+      <w:r>
+        <w:rPr>
+          <w:sz w:val="24"/>
+          <w:szCs w:val="24"/>
+          <w:u w:val="single"/>
+        </w:rPr>
+        <w:t>99</w:t>
+      </w:r>
+    </w:p>
+    <w:p>
+      <w:pPr>
+        <w:bidi w:val="0"/>
+        <w:rPr>
+          <w:sz w:val="24"/>
+          <w:szCs w:val="24"/>
+        </w:rPr>
+      </w:pPr>
+      <w:r>
+        <w:rPr>
+          <w:b/>
+          <w:bCs/>
+          <w:sz w:val="24"/>
+          <w:szCs w:val="24"/>
+        </w:rPr>
+        <w:t>5</w:t>
+      </w:r>
+      <w:r>
+        <w:rPr>
+          <w:b/>
+          <w:bCs/>
+          <w:sz w:val="24"/>
+          <w:szCs w:val="24"/>
+        </w:rPr>
+        <w:t>00</w:t>
+      </w:r>
+      <w:r>
+        <w:rPr>
+          <w:sz w:val="24"/>
+          <w:szCs w:val="24"/>
+        </w:rPr>
+        <w:t xml:space="preserve"> </w:t>
+      </w:r>
+      <w:r>
+        <w:rPr>
+          <w:sz w:val="24"/>
+          <w:szCs w:val="24"/>
+        </w:rPr>
+        <w:t>-</w:t>
+      </w:r>
+      <w:r>
+        <w:rPr>
+          <w:sz w:val="24"/>
+          <w:szCs w:val="24"/>
+        </w:rPr>
+        <w:t xml:space="preserve"> get </w:t>
+      </w:r>
+      <w:r>
+        <w:rPr>
+          <w:sz w:val="24"/>
+          <w:szCs w:val="24"/>
+        </w:rPr>
+        <w:t>player in room</w:t>
+      </w:r>
+      <w:r>
+        <w:rPr>
+          <w:sz w:val="24"/>
+          <w:szCs w:val="24"/>
+        </w:rPr>
+        <w:t xml:space="preserve"> request from client</w:t>
+      </w:r>
+    </w:p>
+    <w:p>
+      <w:pPr>
+        <w:bidi w:val="0"/>
+        <w:rPr>
+          <w:sz w:val="24"/>
+          <w:szCs w:val="24"/>
+        </w:rPr>
+      </w:pPr>
+      <w:r>
+        <w:rPr>
+          <w:b/>
+          <w:bCs/>
+          <w:sz w:val="24"/>
+          <w:szCs w:val="24"/>
+        </w:rPr>
+        <w:t>5</w:t>
+      </w:r>
+      <w:r>
+        <w:rPr>
+          <w:b/>
+          <w:bCs/>
+          <w:sz w:val="24"/>
+          <w:szCs w:val="24"/>
+        </w:rPr>
+        <w:t xml:space="preserve">01 </w:t>
+      </w:r>
+      <w:r>
+        <w:rPr>
+          <w:b/>
+          <w:bCs/>
+          <w:sz w:val="24"/>
+          <w:szCs w:val="24"/>
+        </w:rPr>
+        <w:t>-</w:t>
+      </w:r>
+      <w:r>
+        <w:rPr>
+          <w:b/>
+          <w:bCs/>
+          <w:sz w:val="24"/>
+          <w:szCs w:val="24"/>
+        </w:rPr>
+        <w:t xml:space="preserve"> </w:t>
+      </w:r>
+      <w:r>
+        <w:rPr>
+          <w:sz w:val="24"/>
+          <w:szCs w:val="24"/>
+        </w:rPr>
+        <w:t>get player in room accept from server</w:t>
+      </w:r>
+    </w:p>
+    <w:p>
+      <w:pPr>
+        <w:bidi w:val="0"/>
+        <w:rPr>
+          <w:sz w:val="24"/>
+          <w:szCs w:val="24"/>
+        </w:rPr>
+      </w:pPr>
+      <w:r>
+        <w:rPr>
+          <w:b/>
+          <w:bCs/>
+          <w:sz w:val="24"/>
+          <w:szCs w:val="24"/>
+        </w:rPr>
+        <w:t>5</w:t>
+      </w:r>
+      <w:r>
+        <w:rPr>
+          <w:b/>
+          <w:bCs/>
+          <w:sz w:val="24"/>
+          <w:szCs w:val="24"/>
+        </w:rPr>
+        <w:t>05</w:t>
+      </w:r>
+      <w:r>
+        <w:rPr>
+          <w:sz w:val="24"/>
+          <w:szCs w:val="24"/>
+        </w:rPr>
+        <w:t xml:space="preserve"> </w:t>
+      </w:r>
+      <w:r>
+        <w:rPr>
+          <w:sz w:val="24"/>
+          <w:szCs w:val="24"/>
+        </w:rPr>
+        <w:t xml:space="preserve">- </w:t>
+      </w:r>
+      <w:r>
+        <w:rPr>
+          <w:sz w:val="24"/>
+          <w:szCs w:val="24"/>
+        </w:rPr>
+        <w:t>get player in room error from server</w:t>
+      </w:r>
+    </w:p>
+    <w:p>
+      <w:pPr>
+        <w:bidi w:val="0"/>
+        <w:rPr>
+          <w:sz w:val="24"/>
+          <w:szCs w:val="24"/>
+        </w:rPr>
+      </w:pPr>
+    </w:p>
+    <w:p>
+      <w:pPr>
+        <w:bidi w:val="0"/>
+        <w:rPr>
+          <w:b/>
+          <w:bCs/>
+          <w:sz w:val="28"/>
+          <w:szCs w:val="28"/>
+          <w:u w:val="single"/>
+        </w:rPr>
+      </w:pPr>
+      <w:r>
+        <w:rPr>
+          <w:b/>
+          <w:bCs/>
+          <w:sz w:val="28"/>
+          <w:szCs w:val="28"/>
+          <w:u w:val="single"/>
+        </w:rPr>
+        <w:t>Join Room</w:t>
+      </w:r>
+    </w:p>
+    <w:p>
+      <w:pPr>
+        <w:bidi w:val="0"/>
+        <w:rPr>
+          <w:sz w:val="24"/>
+          <w:szCs w:val="24"/>
+          <w:u w:val="single"/>
+        </w:rPr>
+      </w:pPr>
+      <w:r>
+        <w:rPr>
+          <w:sz w:val="24"/>
+          <w:szCs w:val="24"/>
+          <w:u w:val="single"/>
+        </w:rPr>
+        <w:t xml:space="preserve">Code range </w:t>
+      </w:r>
+      <w:r>
+        <w:rPr>
+          <w:sz w:val="24"/>
+          <w:szCs w:val="24"/>
+          <w:u w:val="single"/>
+        </w:rPr>
+        <w:t>6</w:t>
+      </w:r>
+      <w:r>
+        <w:rPr>
+          <w:sz w:val="24"/>
+          <w:szCs w:val="24"/>
+          <w:u w:val="single"/>
+        </w:rPr>
+        <w:t xml:space="preserve">00 – </w:t>
+      </w:r>
+      <w:r>
+        <w:rPr>
+          <w:sz w:val="24"/>
+          <w:szCs w:val="24"/>
+          <w:u w:val="single"/>
+        </w:rPr>
+        <w:t>6</w:t>
+      </w:r>
+      <w:r>
+        <w:rPr>
+          <w:sz w:val="24"/>
+          <w:szCs w:val="24"/>
+          <w:u w:val="single"/>
+        </w:rPr>
+        <w:t>99</w:t>
+      </w:r>
+    </w:p>
+    <w:p>
+      <w:pPr>
+        <w:bidi w:val="0"/>
+        <w:rPr>
+          <w:sz w:val="24"/>
+          <w:szCs w:val="24"/>
+        </w:rPr>
+      </w:pPr>
+      <w:r>
+        <w:rPr>
+          <w:b/>
+          <w:bCs/>
+          <w:sz w:val="24"/>
+          <w:szCs w:val="24"/>
+        </w:rPr>
+        <w:t>6</w:t>
+      </w:r>
+      <w:r>
+        <w:rPr>
+          <w:b/>
+          <w:bCs/>
+          <w:sz w:val="24"/>
+          <w:szCs w:val="24"/>
+        </w:rPr>
+        <w:t>00</w:t>
+      </w:r>
+      <w:r>
+        <w:rPr>
+          <w:sz w:val="24"/>
+          <w:szCs w:val="24"/>
+        </w:rPr>
+        <w:t xml:space="preserve"> - get player in room request from client</w:t>
+      </w:r>
+    </w:p>
+    <w:p>
+      <w:pPr>
+        <w:bidi w:val="0"/>
+        <w:rPr>
+          <w:sz w:val="24"/>
+          <w:szCs w:val="24"/>
+        </w:rPr>
+      </w:pPr>
+      <w:r>
+        <w:rPr>
+          <w:b/>
+          <w:bCs/>
+          <w:sz w:val="24"/>
+          <w:szCs w:val="24"/>
+        </w:rPr>
+        <w:t>6</w:t>
+      </w:r>
+      <w:r>
+        <w:rPr>
+          <w:b/>
+          <w:bCs/>
+          <w:sz w:val="24"/>
+          <w:szCs w:val="24"/>
+        </w:rPr>
+        <w:t xml:space="preserve">01 - </w:t>
+      </w:r>
+      <w:r>
+        <w:rPr>
+          <w:sz w:val="24"/>
+          <w:szCs w:val="24"/>
+        </w:rPr>
+        <w:t>get player in room accept from server</w:t>
+      </w:r>
+    </w:p>
+    <w:p>
+      <w:pPr>
+        <w:bidi w:val="0"/>
+        <w:rPr>
+          <w:sz w:val="24"/>
+          <w:szCs w:val="24"/>
+        </w:rPr>
+      </w:pPr>
+      <w:r>
+        <w:rPr>
+          <w:b/>
+          <w:bCs/>
+          <w:sz w:val="24"/>
+          <w:szCs w:val="24"/>
+        </w:rPr>
+        <w:t>6</w:t>
+      </w:r>
+      <w:r>
+        <w:rPr>
+          <w:b/>
+          <w:bCs/>
+          <w:sz w:val="24"/>
+          <w:szCs w:val="24"/>
+        </w:rPr>
+        <w:t>05</w:t>
+      </w:r>
+      <w:r>
+        <w:rPr>
+          <w:sz w:val="24"/>
+          <w:szCs w:val="24"/>
+        </w:rPr>
+        <w:t xml:space="preserve"> - get player in room error from server</w:t>
+      </w:r>
+    </w:p>
+    <w:p>
+      <w:pPr>
+        <w:bidi w:val="0"/>
+        <w:rPr>
+          <w:sz w:val="24"/>
+          <w:szCs w:val="24"/>
+        </w:rPr>
+      </w:pPr>
+    </w:p>
+    <w:p>
+      <w:pPr>
+        <w:bidi w:val="0"/>
+        <w:rPr>
+          <w:b/>
+          <w:bCs/>
+          <w:sz w:val="28"/>
+          <w:szCs w:val="28"/>
+          <w:u w:val="single"/>
+        </w:rPr>
+      </w:pPr>
+      <w:r>
+        <w:rPr>
+          <w:b/>
+          <w:bCs/>
+          <w:sz w:val="28"/>
+          <w:szCs w:val="28"/>
+          <w:u w:val="single"/>
+        </w:rPr>
+        <w:t>Create</w:t>
+      </w:r>
+      <w:r>
+        <w:rPr>
+          <w:b/>
+          <w:bCs/>
+          <w:sz w:val="28"/>
+          <w:szCs w:val="28"/>
+          <w:u w:val="single"/>
+        </w:rPr>
+        <w:t xml:space="preserve"> Room</w:t>
+      </w:r>
+    </w:p>
+    <w:p>
+      <w:pPr>
+        <w:bidi w:val="0"/>
+        <w:rPr>
+          <w:sz w:val="24"/>
+          <w:szCs w:val="24"/>
+          <w:u w:val="single"/>
+        </w:rPr>
+      </w:pPr>
+      <w:r>
+        <w:rPr>
+          <w:sz w:val="24"/>
+          <w:szCs w:val="24"/>
+          <w:u w:val="single"/>
+        </w:rPr>
+        <w:t xml:space="preserve">Code range </w:t>
+      </w:r>
+      <w:r>
+        <w:rPr>
+          <w:sz w:val="24"/>
+          <w:szCs w:val="24"/>
+          <w:u w:val="single"/>
+        </w:rPr>
+        <w:t>7</w:t>
+      </w:r>
+      <w:r>
+        <w:rPr>
+          <w:sz w:val="24"/>
+          <w:szCs w:val="24"/>
+          <w:u w:val="single"/>
+        </w:rPr>
+        <w:t xml:space="preserve">00 – </w:t>
+      </w:r>
+      <w:r>
+        <w:rPr>
+          <w:sz w:val="24"/>
+          <w:szCs w:val="24"/>
+          <w:u w:val="single"/>
+        </w:rPr>
+        <w:t>7</w:t>
+      </w:r>
+      <w:r>
+        <w:rPr>
+          <w:sz w:val="24"/>
+          <w:szCs w:val="24"/>
+          <w:u w:val="single"/>
+        </w:rPr>
+        <w:t>99</w:t>
+      </w:r>
+    </w:p>
+    <w:p>
+      <w:pPr>
+        <w:bidi w:val="0"/>
+        <w:rPr>
+          <w:sz w:val="24"/>
+          <w:szCs w:val="24"/>
+        </w:rPr>
+      </w:pPr>
+      <w:r>
+        <w:rPr>
+          <w:b/>
+          <w:bCs/>
+          <w:sz w:val="24"/>
+          <w:szCs w:val="24"/>
+        </w:rPr>
+        <w:t>7</w:t>
+      </w:r>
+      <w:r>
+        <w:rPr>
+          <w:b/>
+          <w:bCs/>
+          <w:sz w:val="24"/>
+          <w:szCs w:val="24"/>
+        </w:rPr>
+        <w:t>00</w:t>
+      </w:r>
+      <w:r>
+        <w:rPr>
+          <w:sz w:val="24"/>
+          <w:szCs w:val="24"/>
+        </w:rPr>
+        <w:t xml:space="preserve"> </w:t>
+      </w:r>
+      <w:r>
+        <w:rPr>
+          <w:sz w:val="24"/>
+          <w:szCs w:val="24"/>
+        </w:rPr>
+        <w:t>–</w:t>
+      </w:r>
+      <w:r>
+        <w:rPr>
+          <w:sz w:val="24"/>
+          <w:szCs w:val="24"/>
+        </w:rPr>
+        <w:t xml:space="preserve"> </w:t>
+      </w:r>
+      <w:r>
+        <w:rPr>
+          <w:sz w:val="24"/>
+          <w:szCs w:val="24"/>
+        </w:rPr>
+        <w:t>create room</w:t>
+      </w:r>
+      <w:r>
+        <w:rPr>
+          <w:sz w:val="24"/>
+          <w:szCs w:val="24"/>
+        </w:rPr>
+        <w:t xml:space="preserve"> request from client</w:t>
+      </w:r>
+    </w:p>
+    <w:p>
+      <w:pPr>
+        <w:bidi w:val="0"/>
+        <w:rPr>
+          <w:sz w:val="24"/>
+          <w:szCs w:val="24"/>
+        </w:rPr>
+      </w:pPr>
+      <w:r>
+        <w:rPr>
+          <w:b/>
+          <w:bCs/>
+          <w:sz w:val="24"/>
+          <w:szCs w:val="24"/>
+        </w:rPr>
+        <w:t>7</w:t>
+      </w:r>
+      <w:r>
+        <w:rPr>
+          <w:b/>
+          <w:bCs/>
+          <w:sz w:val="24"/>
+          <w:szCs w:val="24"/>
+        </w:rPr>
+        <w:t xml:space="preserve">01 - </w:t>
+      </w:r>
+      <w:r>
+        <w:rPr>
+          <w:sz w:val="24"/>
+          <w:szCs w:val="24"/>
+        </w:rPr>
+        <w:t xml:space="preserve">create room </w:t>
+      </w:r>
+      <w:r>
+        <w:rPr>
+          <w:sz w:val="24"/>
+          <w:szCs w:val="24"/>
+        </w:rPr>
+        <w:t>accept from server</w:t>
+      </w:r>
+    </w:p>
+    <w:p>
+      <w:pPr>
+        <w:bidi w:val="0"/>
+        <w:rPr>
+          <w:sz w:val="24"/>
+          <w:szCs w:val="24"/>
+        </w:rPr>
+      </w:pPr>
+      <w:r>
+        <w:rPr>
+          <w:b/>
+          <w:bCs/>
+          <w:sz w:val="24"/>
+          <w:szCs w:val="24"/>
+        </w:rPr>
+        <w:t>7</w:t>
+      </w:r>
+      <w:r>
+        <w:rPr>
+          <w:b/>
+          <w:bCs/>
+          <w:sz w:val="24"/>
+          <w:szCs w:val="24"/>
+        </w:rPr>
+        <w:t>05</w:t>
+      </w:r>
+      <w:r>
+        <w:rPr>
+          <w:sz w:val="24"/>
+          <w:szCs w:val="24"/>
+        </w:rPr>
+        <w:t xml:space="preserve"> - </w:t>
+      </w:r>
+      <w:r>
+        <w:rPr>
+          <w:sz w:val="24"/>
+          <w:szCs w:val="24"/>
+        </w:rPr>
+        <w:t xml:space="preserve">create room </w:t>
+      </w:r>
+      <w:r>
+        <w:rPr>
+          <w:sz w:val="24"/>
+          <w:szCs w:val="24"/>
+        </w:rPr>
+        <w:t>error from server</w:t>
+      </w:r>
+    </w:p>
+    <w:p>
+      <w:pPr>
+        <w:bidi w:val="0"/>
+        <w:rPr>
+          <w:sz w:val="24"/>
+          <w:szCs w:val="24"/>
+        </w:rPr>
+      </w:pPr>
+    </w:p>
+    <w:p>
+      <w:pPr>
+        <w:bidi w:val="0"/>
+        <w:rPr>
+          <w:b/>
+          <w:bCs/>
+          <w:sz w:val="28"/>
+          <w:szCs w:val="28"/>
+          <w:u w:val="single"/>
+        </w:rPr>
+      </w:pPr>
+      <w:r>
+        <w:rPr>
+          <w:b/>
+          <w:bCs/>
+          <w:sz w:val="28"/>
+          <w:szCs w:val="28"/>
+          <w:u w:val="single"/>
+        </w:rPr>
+        <w:t>Get High Score</w:t>
+      </w:r>
+    </w:p>
+    <w:p>
+      <w:pPr>
+        <w:bidi w:val="0"/>
+        <w:rPr>
+          <w:sz w:val="24"/>
+          <w:szCs w:val="24"/>
+          <w:u w:val="single"/>
+        </w:rPr>
+      </w:pPr>
+      <w:r>
+        <w:rPr>
+          <w:sz w:val="24"/>
+          <w:szCs w:val="24"/>
+          <w:u w:val="single"/>
+        </w:rPr>
+        <w:t xml:space="preserve">Code range </w:t>
+      </w:r>
+      <w:r>
+        <w:rPr>
+          <w:sz w:val="24"/>
+          <w:szCs w:val="24"/>
+          <w:u w:val="single"/>
+        </w:rPr>
+        <w:t>8</w:t>
+      </w:r>
+      <w:r>
+        <w:rPr>
+          <w:sz w:val="24"/>
+          <w:szCs w:val="24"/>
+          <w:u w:val="single"/>
+        </w:rPr>
+        <w:t xml:space="preserve">00 – </w:t>
+      </w:r>
+      <w:r>
+        <w:rPr>
+          <w:sz w:val="24"/>
+          <w:szCs w:val="24"/>
+          <w:u w:val="single"/>
+        </w:rPr>
+        <w:t>8</w:t>
+      </w:r>
+      <w:r>
+        <w:rPr>
+          <w:sz w:val="24"/>
+          <w:szCs w:val="24"/>
+          <w:u w:val="single"/>
+        </w:rPr>
+        <w:t>99</w:t>
+      </w:r>
+    </w:p>
+    <w:p>
+      <w:pPr>
+        <w:bidi w:val="0"/>
+        <w:rPr>
+          <w:sz w:val="24"/>
+          <w:szCs w:val="24"/>
+        </w:rPr>
+      </w:pPr>
+      <w:r>
+        <w:rPr>
+          <w:b/>
+          <w:bCs/>
+          <w:sz w:val="24"/>
+          <w:szCs w:val="24"/>
+        </w:rPr>
+        <w:t>8</w:t>
+      </w:r>
+      <w:r>
+        <w:rPr>
+          <w:b/>
+          <w:bCs/>
+          <w:sz w:val="24"/>
+          <w:szCs w:val="24"/>
+        </w:rPr>
+        <w:t>00</w:t>
+      </w:r>
+      <w:r>
+        <w:rPr>
+          <w:sz w:val="24"/>
+          <w:szCs w:val="24"/>
+        </w:rPr>
+        <w:t xml:space="preserve"> – </w:t>
+      </w:r>
+      <w:r>
+        <w:rPr>
+          <w:sz w:val="24"/>
+          <w:szCs w:val="24"/>
+        </w:rPr>
+        <w:t xml:space="preserve">get high score </w:t>
+      </w:r>
+      <w:r>
+        <w:rPr>
+          <w:sz w:val="24"/>
+          <w:szCs w:val="24"/>
+        </w:rPr>
+        <w:t>request from client</w:t>
+      </w:r>
+    </w:p>
+    <w:p>
+      <w:pPr>
+        <w:bidi w:val="0"/>
+        <w:rPr>
+          <w:sz w:val="24"/>
+          <w:szCs w:val="24"/>
+        </w:rPr>
+      </w:pPr>
+      <w:r>
+        <w:rPr>
+          <w:b/>
+          <w:bCs/>
+          <w:sz w:val="24"/>
+          <w:szCs w:val="24"/>
+        </w:rPr>
+        <w:t>8</w:t>
+      </w:r>
+      <w:r>
+        <w:rPr>
+          <w:b/>
+          <w:bCs/>
+          <w:sz w:val="24"/>
+          <w:szCs w:val="24"/>
+        </w:rPr>
+        <w:t xml:space="preserve">01 - </w:t>
+      </w:r>
+      <w:r>
+        <w:rPr>
+          <w:sz w:val="24"/>
+          <w:szCs w:val="24"/>
+        </w:rPr>
+        <w:t>get high score accept from server</w:t>
+      </w:r>
+    </w:p>
+    <w:p>
+      <w:pPr>
+        <w:bidi w:val="0"/>
+        <w:rPr>
+          <w:sz w:val="24"/>
+          <w:szCs w:val="24"/>
+        </w:rPr>
+      </w:pPr>
+      <w:r>
+        <w:rPr>
+          <w:b/>
+          <w:bCs/>
+          <w:sz w:val="24"/>
+          <w:szCs w:val="24"/>
+        </w:rPr>
+        <w:t>8</w:t>
+      </w:r>
+      <w:r>
+        <w:rPr>
+          <w:b/>
+          <w:bCs/>
+          <w:sz w:val="24"/>
+          <w:szCs w:val="24"/>
+        </w:rPr>
+        <w:t>05</w:t>
+      </w:r>
+      <w:r>
+        <w:rPr>
+          <w:sz w:val="24"/>
+          <w:szCs w:val="24"/>
+        </w:rPr>
+        <w:t xml:space="preserve"> - get high sc</w:t>
+      </w:r>
+      <w:bookmarkStart w:id="0" w:name="_GoBack"/>
+      <w:bookmarkEnd w:id="0"/>
+      <w:r>
+        <w:rPr>
+          <w:sz w:val="24"/>
+          <w:szCs w:val="24"/>
+        </w:rPr>
+        <w:t>ore error from server</w:t>
+      </w:r>
+    </w:p>
+    <w:p>
+      <w:pPr>
+        <w:bidi w:val="0"/>
+        <w:rPr>
+          <w:sz w:val="24"/>
+          <w:szCs w:val="24"/>
+        </w:rPr>
+      </w:pPr>
+    </w:p>
+    <w:p>
+      <w:pPr>
+        <w:bidi w:val="0"/>
+        <w:rPr>
+          <w:sz w:val="24"/>
+          <w:szCs w:val="24"/>
+        </w:rPr>
+      </w:pPr>
+    </w:p>
+    <w:p>
+      <w:pPr>
+        <w:bidi w:val="0"/>
+        <w:rPr>
+          <w:sz w:val="24"/>
+          <w:szCs w:val="24"/>
+        </w:rPr>
+      </w:pPr>
+    </w:p>
+    <w:p>
+      <w:pPr>
+        <w:bidi w:val="0"/>
+        <w:rPr>
+          <w:sz w:val="24"/>
+          <w:szCs w:val="24"/>
+        </w:rPr>
+      </w:pPr>
+    </w:p>
+    <w:p>
+      <w:pPr>
+        <w:bidi w:val="0"/>
+        <w:rPr>
+          <w:sz w:val="28"/>
+          <w:szCs w:val="28"/>
           <w:rtl/>
         </w:rPr>
       </w:pPr>
-      <w:r>
-        <w:rPr>
-          <w:sz w:val="24"/>
-          <w:szCs w:val="24"/>
-        </w:rPr>
-        <w:t xml:space="preserve">300 – logout </w:t>
-      </w:r>
     </w:p>
     <w:sectPr>
       <w:pgSz w:w="11906" w:h="16838"/>
@@ -788,8 +2082,97 @@
 </file>
 
 <file path=word/numbering.xml><?xml version="1.0" encoding="utf-8"?>
-<w:numbering xmlns:wpc="http://schemas.microsoft.com/office/word/2010/wordprocessingCanvas" xmlns:cx="http://schemas.microsoft.com/office/drawing/2014/chartex" xmlns:cx1="http://schemas.microsoft.com/office/drawing/2015/9/8/chartex" xmlns:cx2="http://schemas.microsoft.com/office/drawing/2015/10/21/chartex" xmlns:cx3="http://schemas.microsoft.com/office/drawing/2016/5/9/chartex" xmlns:cx4="http://schemas.microsoft.com/office/drawing/2016/5/10/chartex" xmlns:cx5="http://schemas.microsoft.com/office/drawing/2016/5/11/chartex" xmlns:cx6="http://schemas.microsoft.com/office/drawing/2016/5/12/chartex" xmlns:cx7="http://schemas.microsoft.com/office/drawing/2016/5/13/chartex" xmlns:cx8="http://schemas.microsoft.com/office/drawing/2016/5/14/chartex" xmlns:mc="http://schemas.openxmlformats.org/markup-compatibility/2006" xmlns:aink="http://schemas.microsoft.com/office/drawing/2016/ink" xmlns:am3d="http://schemas.microsoft.com/office/drawing/2017/model3d" xmlns:o="urn:schemas-microsoft-com:office:office" xmlns:oel="http://schemas.microsoft.com/office/2019/extlst" xmlns:r="http://schemas.openxmlformats.org/officeDocument/2006/relationships" xmlns:m="http://schemas.openxmlformats.org/officeDocument/2006/math" xmlns:v="urn:schemas-microsoft-com:vml" xmlns:wp14="http://schemas.microsoft.com/office/word/2010/wordprocessingDrawing" xmlns:wp="http://schemas.openxmlformats.org/drawingml/2006/wordprocessingDrawing" xmlns:w10="urn:schemas-microsoft-com:office:word" xmlns:w="http://schemas.openxmlformats.org/wordprocessingml/2006/main" xmlns:w14="http://schemas.microsoft.com/office/word/2010/wordml" xmlns:w15="http://schemas.microsoft.com/office/word/2012/wordml" xmlns:w16cex="http://schemas.microsoft.com/office/word/2018/wordml/cex" xmlns:w16cid="http://schemas.microsoft.com/office/word/2016/wordml/cid" xmlns:w16="http://schemas.microsoft.com/office/word/2018/wordml" xmlns:w16sdtdh="http://schemas.microsoft.com/office/word/2020/wordml/sdtdatahash" xmlns:w16se="http://schemas.microsoft.com/office/word/2015/wordml/symex" xmlns:wpg="http://schemas.microsoft.com/office/word/2010/wordprocessingGroup" xmlns:wpi="http://schemas.microsoft.com/office/word/2010/wordprocessingInk" xmlns:wne="http://schemas.microsoft.com/office/word/2006/wordml" xmlns:wps="http://schemas.microsoft.com/office/word/2010/wordprocessingShape" mc:Ignorable="w14 w15 w16se w16cid w16 w16cex w16sdtdh wp14">
+<w:numbering xmlns:wpc="http://schemas.microsoft.com/office/word/2010/wordprocessingCanvas" xmlns:cx="http://schemas.microsoft.com/office/drawing/2014/chartex" xmlns:cx1="http://schemas.microsoft.com/office/drawing/2015/9/8/chartex" xmlns:cx2="http://schemas.microsoft.com/office/drawing/2015/10/21/chartex" xmlns:cx3="http://schemas.microsoft.com/office/drawing/2016/5/9/chartex" xmlns:cx4="http://schemas.microsoft.com/office/drawing/2016/5/10/chartex" xmlns:cx5="http://schemas.microsoft.com/office/drawing/2016/5/11/chartex" xmlns:cx6="http://schemas.microsoft.com/office/drawing/2016/5/12/chartex" xmlns:cx7="http://schemas.microsoft.com/office/drawing/2016/5/13/chartex" xmlns:cx8="http://schemas.microsoft.com/office/drawing/2016/5/14/chartex" xmlns:mc="http://schemas.openxmlformats.org/markup-compatibility/2006" xmlns:aink="http://schemas.microsoft.com/office/drawing/2016/ink" xmlns:am3d="http://schemas.microsoft.com/office/drawing/2017/model3d" xmlns:o="urn:schemas-microsoft-com:office:office" xmlns:r="http://schemas.openxmlformats.org/officeDocument/2006/relationships" xmlns:m="http://schemas.openxmlformats.org/officeDocument/2006/math" xmlns:v="urn:schemas-microsoft-com:vml" xmlns:wp14="http://schemas.microsoft.com/office/word/2010/wordprocessingDrawing" xmlns:wp="http://schemas.openxmlformats.org/drawingml/2006/wordprocessingDrawing" xmlns:w10="urn:schemas-microsoft-com:office:word" xmlns:w="http://schemas.openxmlformats.org/wordprocessingml/2006/main" xmlns:w14="http://schemas.microsoft.com/office/word/2010/wordml" xmlns:w15="http://schemas.microsoft.com/office/word/2012/wordml" xmlns:w16cid="http://schemas.microsoft.com/office/word/2016/wordml/cid" xmlns:w16se="http://schemas.microsoft.com/office/word/2015/wordml/symex" xmlns:wpg="http://schemas.microsoft.com/office/word/2010/wordprocessingGroup" xmlns:wpi="http://schemas.microsoft.com/office/word/2010/wordprocessingInk" xmlns:wne="http://schemas.microsoft.com/office/word/2006/wordml" xmlns:wps="http://schemas.microsoft.com/office/word/2010/wordprocessingShape" mc:Ignorable="w14 w15 w16se w16cid wp14">
   <w:abstractNum w:abstractNumId="0" w15:restartNumberingAfterBreak="0">
+    <w:nsid w:val="0C5845CB"/>
+    <w:multiLevelType w:val="hybridMultilevel"/>
+    <w:tmpl w:val="7CB8060A"/>
+    <w:lvl w:ilvl="0" w:tplc="C1906964">
+      <w:start w:val="1"/>
+      <w:numFmt w:val="decimal"/>
+      <w:lvlText w:val="%1."/>
+      <w:lvlJc w:val="left"/>
+      <w:pPr>
+        <w:ind w:left="1800" w:hanging="360"/>
+      </w:pPr>
+      <w:rPr>
+        <w:rFonts w:hint="default"/>
+      </w:rPr>
+    </w:lvl>
+    <w:lvl w:ilvl="1" w:tplc="04090019" w:tentative="1">
+      <w:start w:val="1"/>
+      <w:numFmt w:val="lowerLetter"/>
+      <w:lvlText w:val="%2."/>
+      <w:lvlJc w:val="left"/>
+      <w:pPr>
+        <w:ind w:left="2520" w:hanging="360"/>
+      </w:pPr>
+    </w:lvl>
+    <w:lvl w:ilvl="2" w:tplc="0409001B" w:tentative="1">
+      <w:start w:val="1"/>
+      <w:numFmt w:val="lowerRoman"/>
+      <w:lvlText w:val="%3."/>
+      <w:lvlJc w:val="right"/>
+      <w:pPr>
+        <w:ind w:left="3240" w:hanging="180"/>
+      </w:pPr>
+    </w:lvl>
+    <w:lvl w:ilvl="3" w:tplc="0409000F" w:tentative="1">
+      <w:start w:val="1"/>
+      <w:numFmt w:val="decimal"/>
+      <w:lvlText w:val="%4."/>
+      <w:lvlJc w:val="left"/>
+      <w:pPr>
+        <w:ind w:left="3960" w:hanging="360"/>
+      </w:pPr>
+    </w:lvl>
+    <w:lvl w:ilvl="4" w:tplc="04090019" w:tentative="1">
+      <w:start w:val="1"/>
+      <w:numFmt w:val="lowerLetter"/>
+      <w:lvlText w:val="%5."/>
+      <w:lvlJc w:val="left"/>
+      <w:pPr>
+        <w:ind w:left="4680" w:hanging="360"/>
+      </w:pPr>
+    </w:lvl>
+    <w:lvl w:ilvl="5" w:tplc="0409001B" w:tentative="1">
+      <w:start w:val="1"/>
+      <w:numFmt w:val="lowerRoman"/>
+      <w:lvlText w:val="%6."/>
+      <w:lvlJc w:val="right"/>
+      <w:pPr>
+        <w:ind w:left="5400" w:hanging="180"/>
+      </w:pPr>
+    </w:lvl>
+    <w:lvl w:ilvl="6" w:tplc="0409000F" w:tentative="1">
+      <w:start w:val="1"/>
+      <w:numFmt w:val="decimal"/>
+      <w:lvlText w:val="%7."/>
+      <w:lvlJc w:val="left"/>
+      <w:pPr>
+        <w:ind w:left="6120" w:hanging="360"/>
+      </w:pPr>
+    </w:lvl>
+    <w:lvl w:ilvl="7" w:tplc="04090019" w:tentative="1">
+      <w:start w:val="1"/>
+      <w:numFmt w:val="lowerLetter"/>
+      <w:lvlText w:val="%8."/>
+      <w:lvlJc w:val="left"/>
+      <w:pPr>
+        <w:ind w:left="6840" w:hanging="360"/>
+      </w:pPr>
+    </w:lvl>
+    <w:lvl w:ilvl="8" w:tplc="0409001B" w:tentative="1">
+      <w:start w:val="1"/>
+      <w:numFmt w:val="lowerRoman"/>
+      <w:lvlText w:val="%9."/>
+      <w:lvlJc w:val="right"/>
+      <w:pPr>
+        <w:ind w:left="7560" w:hanging="180"/>
+      </w:pPr>
+    </w:lvl>
+  </w:abstractNum>
+  <w:abstractNum w:abstractNumId="1" w15:restartNumberingAfterBreak="0">
     <w:nsid w:val="25432AAA"/>
     <w:multiLevelType w:val="hybridMultilevel"/>
     <w:tmpl w:val="5D947264"/>
@@ -878,7 +2261,7 @@
       </w:pPr>
     </w:lvl>
   </w:abstractNum>
-  <w:abstractNum w:abstractNumId="1" w15:restartNumberingAfterBreak="0">
+  <w:abstractNum w:abstractNumId="2" w15:restartNumberingAfterBreak="0">
     <w:nsid w:val="29A72D05"/>
     <w:multiLevelType w:val="hybridMultilevel"/>
     <w:tmpl w:val="BA140AC0"/>
@@ -967,7 +2350,7 @@
       </w:pPr>
     </w:lvl>
   </w:abstractNum>
-  <w:abstractNum w:abstractNumId="2" w15:restartNumberingAfterBreak="0">
+  <w:abstractNum w:abstractNumId="3" w15:restartNumberingAfterBreak="0">
     <w:nsid w:val="31814F24"/>
     <w:multiLevelType w:val="hybridMultilevel"/>
     <w:tmpl w:val="4F1C5F34"/>
@@ -1056,20 +2439,23 @@
       </w:pPr>
     </w:lvl>
   </w:abstractNum>
-  <w:num w:numId="1" w16cid:durableId="1586039653">
+  <w:num w:numId="1">
+    <w:abstractNumId w:val="3"/>
+  </w:num>
+  <w:num w:numId="2">
+    <w:abstractNumId w:val="1"/>
+  </w:num>
+  <w:num w:numId="3">
     <w:abstractNumId w:val="2"/>
   </w:num>
-  <w:num w:numId="2" w16cid:durableId="825165958">
+  <w:num w:numId="4">
     <w:abstractNumId w:val="0"/>
-  </w:num>
-  <w:num w:numId="3" w16cid:durableId="557323220">
-    <w:abstractNumId w:val="1"/>
   </w:num>
 </w:numbering>
 </file>
 
 <file path=word/styles.xml><?xml version="1.0" encoding="utf-8"?>
-<w:styles xmlns:mc="http://schemas.openxmlformats.org/markup-compatibility/2006" xmlns:r="http://schemas.openxmlformats.org/officeDocument/2006/relationships" xmlns:w="http://schemas.openxmlformats.org/wordprocessingml/2006/main" xmlns:w14="http://schemas.microsoft.com/office/word/2010/wordml" xmlns:w15="http://schemas.microsoft.com/office/word/2012/wordml" xmlns:w16cex="http://schemas.microsoft.com/office/word/2018/wordml/cex" xmlns:w16cid="http://schemas.microsoft.com/office/word/2016/wordml/cid" xmlns:w16="http://schemas.microsoft.com/office/word/2018/wordml" xmlns:w16sdtdh="http://schemas.microsoft.com/office/word/2020/wordml/sdtdatahash" xmlns:w16se="http://schemas.microsoft.com/office/word/2015/wordml/symex" mc:Ignorable="w14 w15 w16se w16cid w16 w16cex w16sdtdh">
+<w:styles xmlns:mc="http://schemas.openxmlformats.org/markup-compatibility/2006" xmlns:r="http://schemas.openxmlformats.org/officeDocument/2006/relationships" xmlns:w="http://schemas.openxmlformats.org/wordprocessingml/2006/main" xmlns:w14="http://schemas.microsoft.com/office/word/2010/wordml" xmlns:w15="http://schemas.microsoft.com/office/word/2012/wordml" xmlns:w16cid="http://schemas.microsoft.com/office/word/2016/wordml/cid" xmlns:w16se="http://schemas.microsoft.com/office/word/2015/wordml/symex" mc:Ignorable="w14 w15 w16se w16cid">
   <w:docDefaults>
     <w:rPrDefault>
       <w:rPr>
@@ -1085,7 +2471,7 @@
       </w:pPr>
     </w:pPrDefault>
   </w:docDefaults>
-  <w:latentStyles w:defLockedState="0" w:defUIPriority="99" w:defSemiHidden="0" w:defUnhideWhenUsed="0" w:defQFormat="0" w:count="376">
+  <w:latentStyles w:defLockedState="0" w:defUIPriority="99" w:defSemiHidden="0" w:defUnhideWhenUsed="0" w:defQFormat="0" w:count="375">
     <w:lsdException w:name="Normal" w:uiPriority="0" w:qFormat="1"/>
     <w:lsdException w:name="heading 1" w:uiPriority="9" w:qFormat="1"/>
     <w:lsdException w:name="heading 2" w:semiHidden="1" w:uiPriority="9" w:unhideWhenUsed="1" w:qFormat="1"/>
@@ -1461,11 +2847,11 @@
     <w:lsdException w:name="Smart Hyperlink" w:semiHidden="1" w:unhideWhenUsed="1"/>
     <w:lsdException w:name="Hashtag" w:semiHidden="1" w:unhideWhenUsed="1"/>
     <w:lsdException w:name="Unresolved Mention" w:semiHidden="1" w:unhideWhenUsed="1"/>
-    <w:lsdException w:name="Smart Link" w:semiHidden="1" w:unhideWhenUsed="1"/>
   </w:latentStyles>
   <w:style w:type="paragraph" w:default="1" w:styleId="a">
     <w:name w:val="Normal"/>
     <w:qFormat/>
+    <w:rsid w:val="00D1514D"/>
     <w:pPr>
       <w:bidi/>
     </w:pPr>

</xml_diff>

<commit_message>
Update protocol docx file
</commit_message>
<xml_diff>
--- a/TriviaProtocol.docx
+++ b/TriviaProtocol.docx
@@ -1,6 +1,6 @@
 
 <file path=word/document.xml><?xml version="1.0" encoding="utf-8"?>
-<w:document xmlns:wpc="http://schemas.microsoft.com/office/word/2010/wordprocessingCanvas" xmlns:cx="http://schemas.microsoft.com/office/drawing/2014/chartex" xmlns:cx1="http://schemas.microsoft.com/office/drawing/2015/9/8/chartex" xmlns:cx2="http://schemas.microsoft.com/office/drawing/2015/10/21/chartex" xmlns:cx3="http://schemas.microsoft.com/office/drawing/2016/5/9/chartex" xmlns:cx4="http://schemas.microsoft.com/office/drawing/2016/5/10/chartex" xmlns:cx5="http://schemas.microsoft.com/office/drawing/2016/5/11/chartex" xmlns:cx6="http://schemas.microsoft.com/office/drawing/2016/5/12/chartex" xmlns:cx7="http://schemas.microsoft.com/office/drawing/2016/5/13/chartex" xmlns:cx8="http://schemas.microsoft.com/office/drawing/2016/5/14/chartex" xmlns:mc="http://schemas.openxmlformats.org/markup-compatibility/2006" xmlns:aink="http://schemas.microsoft.com/office/drawing/2016/ink" xmlns:am3d="http://schemas.microsoft.com/office/drawing/2017/model3d" xmlns:o="urn:schemas-microsoft-com:office:office" xmlns:r="http://schemas.openxmlformats.org/officeDocument/2006/relationships" xmlns:m="http://schemas.openxmlformats.org/officeDocument/2006/math" xmlns:v="urn:schemas-microsoft-com:vml" xmlns:wp14="http://schemas.microsoft.com/office/word/2010/wordprocessingDrawing" xmlns:wp="http://schemas.openxmlformats.org/drawingml/2006/wordprocessingDrawing" xmlns:w10="urn:schemas-microsoft-com:office:word" xmlns:w="http://schemas.openxmlformats.org/wordprocessingml/2006/main" xmlns:w14="http://schemas.microsoft.com/office/word/2010/wordml" xmlns:w15="http://schemas.microsoft.com/office/word/2012/wordml" xmlns:w16cid="http://schemas.microsoft.com/office/word/2016/wordml/cid" xmlns:w16se="http://schemas.microsoft.com/office/word/2015/wordml/symex" xmlns:wpg="http://schemas.microsoft.com/office/word/2010/wordprocessingGroup" xmlns:wpi="http://schemas.microsoft.com/office/word/2010/wordprocessingInk" xmlns:wne="http://schemas.microsoft.com/office/word/2006/wordml" xmlns:wps="http://schemas.microsoft.com/office/word/2010/wordprocessingShape" mc:Ignorable="w14 w15 w16se w16cid wp14">
+<w:document xmlns:wpc="http://schemas.microsoft.com/office/word/2010/wordprocessingCanvas" xmlns:cx="http://schemas.microsoft.com/office/drawing/2014/chartex" xmlns:cx1="http://schemas.microsoft.com/office/drawing/2015/9/8/chartex" xmlns:cx2="http://schemas.microsoft.com/office/drawing/2015/10/21/chartex" xmlns:cx3="http://schemas.microsoft.com/office/drawing/2016/5/9/chartex" xmlns:cx4="http://schemas.microsoft.com/office/drawing/2016/5/10/chartex" xmlns:cx5="http://schemas.microsoft.com/office/drawing/2016/5/11/chartex" xmlns:cx6="http://schemas.microsoft.com/office/drawing/2016/5/12/chartex" xmlns:cx7="http://schemas.microsoft.com/office/drawing/2016/5/13/chartex" xmlns:cx8="http://schemas.microsoft.com/office/drawing/2016/5/14/chartex" xmlns:mc="http://schemas.openxmlformats.org/markup-compatibility/2006" xmlns:aink="http://schemas.microsoft.com/office/drawing/2016/ink" xmlns:am3d="http://schemas.microsoft.com/office/drawing/2017/model3d" xmlns:o="urn:schemas-microsoft-com:office:office" xmlns:oel="http://schemas.microsoft.com/office/2019/extlst" xmlns:r="http://schemas.openxmlformats.org/officeDocument/2006/relationships" xmlns:m="http://schemas.openxmlformats.org/officeDocument/2006/math" xmlns:v="urn:schemas-microsoft-com:vml" xmlns:wp14="http://schemas.microsoft.com/office/word/2010/wordprocessingDrawing" xmlns:wp="http://schemas.openxmlformats.org/drawingml/2006/wordprocessingDrawing" xmlns:w10="urn:schemas-microsoft-com:office:word" xmlns:w="http://schemas.openxmlformats.org/wordprocessingml/2006/main" xmlns:w14="http://schemas.microsoft.com/office/word/2010/wordml" xmlns:w15="http://schemas.microsoft.com/office/word/2012/wordml" xmlns:w16cex="http://schemas.microsoft.com/office/word/2018/wordml/cex" xmlns:w16cid="http://schemas.microsoft.com/office/word/2016/wordml/cid" xmlns:w16="http://schemas.microsoft.com/office/word/2018/wordml" xmlns:w16du="http://schemas.microsoft.com/office/word/2023/wordml/word16du" xmlns:w16sdtdh="http://schemas.microsoft.com/office/word/2020/wordml/sdtdatahash" xmlns:w16se="http://schemas.microsoft.com/office/word/2015/wordml/symex" xmlns:wpg="http://schemas.microsoft.com/office/word/2010/wordprocessingGroup" xmlns:wpi="http://schemas.microsoft.com/office/word/2010/wordprocessingInk" xmlns:wne="http://schemas.microsoft.com/office/word/2006/wordml" xmlns:wps="http://schemas.microsoft.com/office/word/2010/wordprocessingShape" mc:Ignorable="w14 w15 w16se w16cid w16 w16cex w16sdtdh w16du wp14">
   <w:body>
     <w:p>
       <w:pPr>
@@ -44,19 +44,16 @@
           <w:bCs/>
           <w:sz w:val="28"/>
           <w:szCs w:val="28"/>
-          <w:u w:val="single"/>
-        </w:rPr>
-      </w:pPr>
-      <w:r>
-        <w:rPr>
-          <w:rFonts w:hint="cs"/>
+        </w:rPr>
+      </w:pPr>
+      <w:r>
+        <w:rPr>
           <w:b/>
           <w:bCs/>
           <w:sz w:val="28"/>
           <w:szCs w:val="28"/>
-          <w:u w:val="single"/>
-        </w:rPr>
-        <w:t>L</w:t>
+        </w:rPr>
+        <w:t xml:space="preserve">Authors: </w:t>
       </w:r>
       <w:r>
         <w:rPr>
@@ -64,6 +61,38 @@
           <w:bCs/>
           <w:sz w:val="28"/>
           <w:szCs w:val="28"/>
+        </w:rPr>
+        <w:t>Gavriel Linoy and Liam Meir</w:t>
+      </w:r>
+    </w:p>
+    <w:p>
+      <w:pPr>
+        <w:bidi w:val="0"/>
+        <w:rPr>
+          <w:b/>
+          <w:bCs/>
+          <w:sz w:val="28"/>
+          <w:szCs w:val="28"/>
+          <w:u w:val="single"/>
+        </w:rPr>
+      </w:pPr>
+      <w:r>
+        <w:rPr>
+          <w:rFonts w:hint="cs"/>
+          <w:b/>
+          <w:bCs/>
+          <w:sz w:val="28"/>
+          <w:szCs w:val="28"/>
+          <w:u w:val="single"/>
+        </w:rPr>
+        <w:t>L</w:t>
+      </w:r>
+      <w:r>
+        <w:rPr>
+          <w:b/>
+          <w:bCs/>
+          <w:sz w:val="28"/>
+          <w:szCs w:val="28"/>
           <w:u w:val="single"/>
         </w:rPr>
         <w:t>ogin:</w:t>
@@ -101,7 +130,7 @@
           <w:szCs w:val="24"/>
           <w:u w:val="single"/>
         </w:rPr>
-        <w:t>s range 100 – 199</w:t>
+        <w:t>s range 10 – 19</w:t>
       </w:r>
     </w:p>
     <w:p>
@@ -122,7 +151,7 @@
           <w:szCs w:val="24"/>
           <w:rtl/>
         </w:rPr>
-        <w:t>100</w:t>
+        <w:t>10</w:t>
       </w:r>
       <w:r>
         <w:rPr>
@@ -164,7 +193,7 @@
           <w:sz w:val="24"/>
           <w:szCs w:val="24"/>
         </w:rPr>
-        <w:t>101 -</w:t>
+        <w:t>11 -</w:t>
       </w:r>
       <w:r>
         <w:rPr>
@@ -196,7 +225,7 @@
           <w:sz w:val="24"/>
           <w:szCs w:val="24"/>
         </w:rPr>
-        <w:t>105</w:t>
+        <w:t>15</w:t>
       </w:r>
       <w:r>
         <w:rPr>
@@ -342,7 +371,27 @@
           <w:szCs w:val="28"/>
           <w:u w:val="single"/>
         </w:rPr>
-        <w:t>Signup:</w:t>
+        <w:t>Sign</w:t>
+      </w:r>
+      <w:r>
+        <w:rPr>
+          <w:b/>
+          <w:bCs/>
+          <w:sz w:val="28"/>
+          <w:szCs w:val="28"/>
+          <w:u w:val="single"/>
+        </w:rPr>
+        <w:t>u</w:t>
+      </w:r>
+      <w:r>
+        <w:rPr>
+          <w:b/>
+          <w:bCs/>
+          <w:sz w:val="28"/>
+          <w:szCs w:val="28"/>
+          <w:u w:val="single"/>
+        </w:rPr>
+        <w:t>p:</w:t>
       </w:r>
     </w:p>
     <w:p>
@@ -377,7 +426,7 @@
           <w:szCs w:val="24"/>
           <w:u w:val="single"/>
         </w:rPr>
-        <w:t>s range 200 - 299</w:t>
+        <w:t>s range 20 - 29</w:t>
       </w:r>
     </w:p>
     <w:p>
@@ -402,7 +451,7 @@
           <w:sz w:val="24"/>
           <w:szCs w:val="24"/>
         </w:rPr>
-        <w:t>0 -</w:t>
+        <w:t xml:space="preserve"> -</w:t>
       </w:r>
       <w:r>
         <w:rPr>
@@ -450,7 +499,7 @@
           <w:sz w:val="24"/>
           <w:szCs w:val="24"/>
         </w:rPr>
-        <w:t>201</w:t>
+        <w:t>21</w:t>
       </w:r>
       <w:r>
         <w:rPr>
@@ -508,7 +557,7 @@
           <w:sz w:val="24"/>
           <w:szCs w:val="24"/>
         </w:rPr>
-        <w:t>205</w:t>
+        <w:t>25</w:t>
       </w:r>
       <w:r>
         <w:rPr>
@@ -578,126 +627,6 @@
           <w:szCs w:val="24"/>
         </w:rPr>
         <w:t>s:</w:t>
-      </w:r>
-      <w:r>
-        <w:rPr>
-          <w:sz w:val="24"/>
-          <w:szCs w:val="24"/>
-        </w:rPr>
-        <w:t xml:space="preserve"> </w:t>
-      </w:r>
-    </w:p>
-    <w:p>
-      <w:pPr>
-        <w:pStyle w:val="a3"/>
-        <w:bidi w:val="0"/>
-        <w:ind w:firstLine="720"/>
-        <w:rPr>
-          <w:sz w:val="24"/>
-          <w:szCs w:val="24"/>
-        </w:rPr>
-      </w:pPr>
-      <w:r>
-        <w:rPr>
-          <w:sz w:val="24"/>
-          <w:szCs w:val="24"/>
-        </w:rPr>
-        <w:t>1.</w:t>
-      </w:r>
-      <w:r>
-        <w:rPr>
-          <w:sz w:val="24"/>
-          <w:szCs w:val="24"/>
-        </w:rPr>
-        <w:t xml:space="preserve"> username is already </w:t>
-      </w:r>
-      <w:proofErr w:type="gramStart"/>
-      <w:r>
-        <w:rPr>
-          <w:sz w:val="24"/>
-          <w:szCs w:val="24"/>
-        </w:rPr>
-        <w:t>exist</w:t>
-      </w:r>
-      <w:proofErr w:type="gramEnd"/>
-      <w:r>
-        <w:rPr>
-          <w:sz w:val="24"/>
-          <w:szCs w:val="24"/>
-        </w:rPr>
-        <w:t xml:space="preserve"> in the system</w:t>
-      </w:r>
-      <w:r>
-        <w:rPr>
-          <w:sz w:val="24"/>
-          <w:szCs w:val="24"/>
-        </w:rPr>
-        <w:t xml:space="preserve"> </w:t>
-      </w:r>
-    </w:p>
-    <w:p>
-      <w:pPr>
-        <w:bidi w:val="0"/>
-        <w:rPr>
-          <w:b/>
-          <w:bCs/>
-          <w:sz w:val="24"/>
-          <w:szCs w:val="24"/>
-          <w:rtl/>
-        </w:rPr>
-      </w:pPr>
-      <w:r>
-        <w:rPr>
-          <w:rFonts w:hint="cs"/>
-          <w:b/>
-          <w:bCs/>
-          <w:sz w:val="24"/>
-          <w:szCs w:val="24"/>
-          <w:rtl/>
-        </w:rPr>
-        <w:t>210</w:t>
-      </w:r>
-      <w:r>
-        <w:rPr>
-          <w:b/>
-          <w:bCs/>
-          <w:sz w:val="24"/>
-          <w:szCs w:val="24"/>
-        </w:rPr>
-        <w:t xml:space="preserve"> -</w:t>
-      </w:r>
-      <w:r>
-        <w:rPr>
-          <w:rFonts w:hint="cs"/>
-          <w:sz w:val="24"/>
-          <w:szCs w:val="24"/>
-          <w:rtl/>
-        </w:rPr>
-        <w:t xml:space="preserve"> </w:t>
-      </w:r>
-      <w:r>
-        <w:rPr>
-          <w:sz w:val="24"/>
-          <w:szCs w:val="24"/>
-        </w:rPr>
-        <w:t>signup error response from server</w:t>
-      </w:r>
-    </w:p>
-    <w:p>
-      <w:pPr>
-        <w:bidi w:val="0"/>
-        <w:ind w:left="360" w:firstLine="360"/>
-        <w:rPr>
-          <w:sz w:val="24"/>
-          <w:szCs w:val="24"/>
-        </w:rPr>
-      </w:pPr>
-      <w:r>
-        <w:rPr>
-          <w:sz w:val="24"/>
-          <w:szCs w:val="24"/>
-        </w:rPr>
-        <w:t>Reasons:</w:t>
       </w:r>
       <w:r>
         <w:rPr>
@@ -712,7 +641,7 @@
         <w:pStyle w:val="a3"/>
         <w:numPr>
           <w:ilvl w:val="0"/>
-          <w:numId w:val="4"/>
+          <w:numId w:val="5"/>
         </w:numPr>
         <w:bidi w:val="0"/>
         <w:rPr>
@@ -725,26 +654,58 @@
           <w:sz w:val="24"/>
           <w:szCs w:val="24"/>
         </w:rPr>
-        <w:t xml:space="preserve">Password is not strong </w:t>
-      </w:r>
-      <w:r>
-        <w:rPr>
-          <w:sz w:val="24"/>
-          <w:szCs w:val="24"/>
-        </w:rPr>
-        <w:t>enough</w:t>
+        <w:t>username is already exist in the system</w:t>
+      </w:r>
+      <w:r>
+        <w:rPr>
+          <w:sz w:val="24"/>
+          <w:szCs w:val="24"/>
+        </w:rPr>
+        <w:t xml:space="preserve"> </w:t>
       </w:r>
     </w:p>
     <w:p>
       <w:pPr>
         <w:pStyle w:val="a3"/>
         <w:bidi w:val="0"/>
-        <w:ind w:left="1800"/>
-        <w:rPr>
-          <w:sz w:val="24"/>
-          <w:szCs w:val="24"/>
-        </w:rPr>
-      </w:pPr>
+        <w:ind w:left="2870"/>
+        <w:rPr>
+          <w:b/>
+          <w:bCs/>
+          <w:sz w:val="24"/>
+          <w:szCs w:val="24"/>
+        </w:rPr>
+      </w:pPr>
+      <w:r>
+        <w:rPr>
+          <w:b/>
+          <w:bCs/>
+          <w:sz w:val="24"/>
+          <w:szCs w:val="24"/>
+        </w:rPr>
+        <w:t>or</w:t>
+      </w:r>
+    </w:p>
+    <w:p>
+      <w:pPr>
+        <w:pStyle w:val="a3"/>
+        <w:numPr>
+          <w:ilvl w:val="0"/>
+          <w:numId w:val="5"/>
+        </w:numPr>
+        <w:bidi w:val="0"/>
+        <w:rPr>
+          <w:sz w:val="24"/>
+          <w:szCs w:val="24"/>
+        </w:rPr>
+      </w:pPr>
+      <w:r>
+        <w:rPr>
+          <w:sz w:val="24"/>
+          <w:szCs w:val="24"/>
+        </w:rPr>
+        <w:t>Password is not strong enough</w:t>
+      </w:r>
     </w:p>
     <w:p>
       <w:pPr>
@@ -783,25 +744,25 @@
           <w:szCs w:val="24"/>
           <w:u w:val="single"/>
         </w:rPr>
-        <w:t>Codes range 300-399</w:t>
-      </w:r>
-    </w:p>
-    <w:p>
-      <w:pPr>
-        <w:bidi w:val="0"/>
-        <w:rPr>
-          <w:sz w:val="24"/>
-          <w:szCs w:val="24"/>
-        </w:rPr>
-      </w:pPr>
-      <w:r>
-        <w:rPr>
-          <w:b/>
-          <w:bCs/>
-          <w:sz w:val="24"/>
-          <w:szCs w:val="24"/>
-        </w:rPr>
-        <w:t>300</w:t>
+        <w:t>Codes range 30-39</w:t>
+      </w:r>
+    </w:p>
+    <w:p>
+      <w:pPr>
+        <w:bidi w:val="0"/>
+        <w:rPr>
+          <w:sz w:val="24"/>
+          <w:szCs w:val="24"/>
+        </w:rPr>
+      </w:pPr>
+      <w:r>
+        <w:rPr>
+          <w:b/>
+          <w:bCs/>
+          <w:sz w:val="24"/>
+          <w:szCs w:val="24"/>
+        </w:rPr>
+        <w:t>30</w:t>
       </w:r>
       <w:r>
         <w:rPr>
@@ -847,32 +808,55 @@
           <w:sz w:val="24"/>
           <w:szCs w:val="24"/>
         </w:rPr>
-        <w:t xml:space="preserve">301 - </w:t>
-      </w:r>
-      <w:r>
-        <w:rPr>
-          <w:sz w:val="24"/>
-          <w:szCs w:val="24"/>
-        </w:rPr>
-        <w:t>logout accept from server</w:t>
-      </w:r>
-    </w:p>
-    <w:p>
-      <w:pPr>
-        <w:bidi w:val="0"/>
-        <w:rPr>
-          <w:sz w:val="24"/>
-          <w:szCs w:val="24"/>
-        </w:rPr>
-      </w:pPr>
-      <w:r>
-        <w:rPr>
-          <w:b/>
-          <w:bCs/>
-          <w:sz w:val="24"/>
-          <w:szCs w:val="24"/>
-        </w:rPr>
-        <w:t>305</w:t>
+        <w:t>3</w:t>
+      </w:r>
+      <w:r>
+        <w:rPr>
+          <w:b/>
+          <w:bCs/>
+          <w:sz w:val="24"/>
+          <w:szCs w:val="24"/>
+        </w:rPr>
+        <w:t xml:space="preserve">1 - </w:t>
+      </w:r>
+      <w:r>
+        <w:rPr>
+          <w:sz w:val="24"/>
+          <w:szCs w:val="24"/>
+        </w:rPr>
+        <w:t xml:space="preserve">logout </w:t>
+      </w:r>
+      <w:r>
+        <w:rPr>
+          <w:sz w:val="24"/>
+          <w:szCs w:val="24"/>
+        </w:rPr>
+        <w:t xml:space="preserve">response </w:t>
+      </w:r>
+      <w:r>
+        <w:rPr>
+          <w:sz w:val="24"/>
+          <w:szCs w:val="24"/>
+        </w:rPr>
+        <w:t>from server</w:t>
+      </w:r>
+    </w:p>
+    <w:p>
+      <w:pPr>
+        <w:bidi w:val="0"/>
+        <w:rPr>
+          <w:sz w:val="24"/>
+          <w:szCs w:val="24"/>
+        </w:rPr>
+      </w:pPr>
+      <w:r>
+        <w:rPr>
+          <w:b/>
+          <w:bCs/>
+          <w:sz w:val="24"/>
+          <w:szCs w:val="24"/>
+        </w:rPr>
+        <w:t>35</w:t>
       </w:r>
       <w:r>
         <w:rPr>
@@ -904,240 +888,32 @@
       <w:pPr>
         <w:bidi w:val="0"/>
         <w:rPr>
-          <w:b/>
-          <w:bCs/>
           <w:sz w:val="28"/>
           <w:szCs w:val="28"/>
-          <w:u w:val="single"/>
-        </w:rPr>
-      </w:pPr>
-      <w:r>
-        <w:rPr>
-          <w:b/>
-          <w:bCs/>
+        </w:rPr>
+      </w:pPr>
+    </w:p>
+    <w:p>
+      <w:pPr>
+        <w:bidi w:val="0"/>
+        <w:rPr>
           <w:sz w:val="28"/>
           <w:szCs w:val="28"/>
-          <w:u w:val="single"/>
-        </w:rPr>
-        <w:lastRenderedPageBreak/>
-        <w:t>Get Rooms</w:t>
-      </w:r>
-    </w:p>
-    <w:p>
-      <w:pPr>
-        <w:bidi w:val="0"/>
-        <w:rPr>
-          <w:sz w:val="24"/>
-          <w:szCs w:val="24"/>
-          <w:u w:val="single"/>
-        </w:rPr>
-      </w:pPr>
-      <w:r>
-        <w:rPr>
-          <w:sz w:val="24"/>
-          <w:szCs w:val="24"/>
-          <w:u w:val="single"/>
-        </w:rPr>
-        <w:t>Code range 400 – 499</w:t>
-      </w:r>
-    </w:p>
-    <w:p>
-      <w:pPr>
-        <w:bidi w:val="0"/>
-        <w:rPr>
-          <w:sz w:val="24"/>
-          <w:szCs w:val="24"/>
-        </w:rPr>
-      </w:pPr>
-      <w:r>
-        <w:rPr>
-          <w:b/>
-          <w:bCs/>
-          <w:sz w:val="24"/>
-          <w:szCs w:val="24"/>
-        </w:rPr>
-        <w:t>4</w:t>
-      </w:r>
-      <w:r>
-        <w:rPr>
-          <w:b/>
-          <w:bCs/>
-          <w:sz w:val="24"/>
-          <w:szCs w:val="24"/>
-        </w:rPr>
-        <w:t>00</w:t>
-      </w:r>
-      <w:r>
-        <w:rPr>
-          <w:sz w:val="24"/>
-          <w:szCs w:val="24"/>
-        </w:rPr>
-        <w:t xml:space="preserve"> </w:t>
-      </w:r>
-      <w:r>
-        <w:rPr>
-          <w:sz w:val="24"/>
-          <w:szCs w:val="24"/>
-        </w:rPr>
-        <w:t xml:space="preserve">- </w:t>
-      </w:r>
-      <w:r>
-        <w:rPr>
-          <w:sz w:val="24"/>
-          <w:szCs w:val="24"/>
-        </w:rPr>
-        <w:t>get rooms</w:t>
-      </w:r>
-      <w:r>
-        <w:rPr>
-          <w:sz w:val="24"/>
-          <w:szCs w:val="24"/>
-        </w:rPr>
-        <w:t xml:space="preserve"> request from client</w:t>
-      </w:r>
-    </w:p>
-    <w:p>
-      <w:pPr>
-        <w:bidi w:val="0"/>
-        <w:rPr>
-          <w:sz w:val="24"/>
-          <w:szCs w:val="24"/>
-        </w:rPr>
-      </w:pPr>
-      <w:r>
-        <w:rPr>
-          <w:b/>
-          <w:bCs/>
-          <w:sz w:val="24"/>
-          <w:szCs w:val="24"/>
-        </w:rPr>
-        <w:t>4</w:t>
-      </w:r>
-      <w:r>
-        <w:rPr>
-          <w:b/>
-          <w:bCs/>
-          <w:sz w:val="24"/>
-          <w:szCs w:val="24"/>
-        </w:rPr>
-        <w:t xml:space="preserve">01 </w:t>
-      </w:r>
-      <w:r>
-        <w:rPr>
-          <w:b/>
-          <w:bCs/>
-          <w:sz w:val="24"/>
-          <w:szCs w:val="24"/>
-        </w:rPr>
-        <w:t>-</w:t>
-      </w:r>
-      <w:r>
-        <w:rPr>
-          <w:b/>
-          <w:bCs/>
-          <w:sz w:val="24"/>
-          <w:szCs w:val="24"/>
-        </w:rPr>
-        <w:t xml:space="preserve"> </w:t>
-      </w:r>
-      <w:r>
-        <w:rPr>
-          <w:sz w:val="24"/>
-          <w:szCs w:val="24"/>
-        </w:rPr>
-        <w:t>get rooms</w:t>
-      </w:r>
-      <w:r>
-        <w:rPr>
-          <w:sz w:val="24"/>
-          <w:szCs w:val="24"/>
-        </w:rPr>
-        <w:t xml:space="preserve"> accept from server</w:t>
-      </w:r>
-    </w:p>
-    <w:p>
-      <w:pPr>
-        <w:bidi w:val="0"/>
-        <w:rPr>
-          <w:sz w:val="24"/>
-          <w:szCs w:val="24"/>
-        </w:rPr>
-      </w:pPr>
-      <w:r>
-        <w:rPr>
-          <w:b/>
-          <w:bCs/>
-          <w:sz w:val="24"/>
-          <w:szCs w:val="24"/>
-        </w:rPr>
-        <w:t>4</w:t>
-      </w:r>
-      <w:r>
-        <w:rPr>
-          <w:b/>
-          <w:bCs/>
-          <w:sz w:val="24"/>
-          <w:szCs w:val="24"/>
-        </w:rPr>
-        <w:t>05</w:t>
-      </w:r>
-      <w:r>
-        <w:rPr>
-          <w:sz w:val="24"/>
-          <w:szCs w:val="24"/>
-        </w:rPr>
-        <w:t xml:space="preserve"> </w:t>
-      </w:r>
-      <w:r>
-        <w:rPr>
-          <w:sz w:val="24"/>
-          <w:szCs w:val="24"/>
-        </w:rPr>
-        <w:t>-</w:t>
-      </w:r>
-      <w:r>
-        <w:rPr>
-          <w:sz w:val="24"/>
-          <w:szCs w:val="24"/>
-        </w:rPr>
-        <w:t xml:space="preserve"> </w:t>
-      </w:r>
-      <w:r>
-        <w:rPr>
-          <w:sz w:val="24"/>
-          <w:szCs w:val="24"/>
-        </w:rPr>
-        <w:t xml:space="preserve">get rooms </w:t>
-      </w:r>
-      <w:r>
-        <w:rPr>
-          <w:sz w:val="24"/>
-          <w:szCs w:val="24"/>
-        </w:rPr>
-        <w:t>error from server</w:t>
-      </w:r>
-    </w:p>
-    <w:p>
-      <w:pPr>
-        <w:bidi w:val="0"/>
-        <w:rPr>
-          <w:sz w:val="24"/>
-          <w:szCs w:val="24"/>
-        </w:rPr>
-      </w:pPr>
-    </w:p>
-    <w:p>
-      <w:pPr>
-        <w:bidi w:val="0"/>
-        <w:rPr>
-          <w:b/>
-          <w:bCs/>
+        </w:rPr>
+      </w:pPr>
+    </w:p>
+    <w:p>
+      <w:pPr>
+        <w:bidi w:val="0"/>
+        <w:rPr>
           <w:sz w:val="28"/>
           <w:szCs w:val="28"/>
-          <w:u w:val="single"/>
-        </w:rPr>
-      </w:pPr>
-      <w:r>
+        </w:rPr>
+      </w:pPr>
+    </w:p>
+    <w:p>
+      <w:pPr>
+        <w:bidi w:val="0"/>
         <w:rPr>
           <w:b/>
           <w:bCs/>
@@ -1145,8 +921,7 @@
           <w:szCs w:val="28"/>
           <w:u w:val="single"/>
         </w:rPr>
-        <w:t xml:space="preserve">Get </w:t>
-      </w:r>
+      </w:pPr>
       <w:r>
         <w:rPr>
           <w:b/>
@@ -1155,10 +930,183 @@
           <w:szCs w:val="28"/>
           <w:u w:val="single"/>
         </w:rPr>
-        <w:t xml:space="preserve">Player </w:t>
-      </w:r>
-      <w:proofErr w:type="gramStart"/>
-      <w:r>
+        <w:t>Get Rooms</w:t>
+      </w:r>
+    </w:p>
+    <w:p>
+      <w:pPr>
+        <w:bidi w:val="0"/>
+        <w:rPr>
+          <w:sz w:val="24"/>
+          <w:szCs w:val="24"/>
+          <w:u w:val="single"/>
+        </w:rPr>
+      </w:pPr>
+      <w:r>
+        <w:rPr>
+          <w:sz w:val="24"/>
+          <w:szCs w:val="24"/>
+          <w:u w:val="single"/>
+        </w:rPr>
+        <w:t>Code range 40 – 49</w:t>
+      </w:r>
+    </w:p>
+    <w:p>
+      <w:pPr>
+        <w:bidi w:val="0"/>
+        <w:rPr>
+          <w:sz w:val="24"/>
+          <w:szCs w:val="24"/>
+        </w:rPr>
+      </w:pPr>
+      <w:r>
+        <w:rPr>
+          <w:b/>
+          <w:bCs/>
+          <w:sz w:val="24"/>
+          <w:szCs w:val="24"/>
+        </w:rPr>
+        <w:t>4</w:t>
+      </w:r>
+      <w:r>
+        <w:rPr>
+          <w:b/>
+          <w:bCs/>
+          <w:sz w:val="24"/>
+          <w:szCs w:val="24"/>
+        </w:rPr>
+        <w:t>0</w:t>
+      </w:r>
+      <w:r>
+        <w:rPr>
+          <w:sz w:val="24"/>
+          <w:szCs w:val="24"/>
+        </w:rPr>
+        <w:t xml:space="preserve"> </w:t>
+      </w:r>
+      <w:r>
+        <w:rPr>
+          <w:sz w:val="24"/>
+          <w:szCs w:val="24"/>
+        </w:rPr>
+        <w:t xml:space="preserve">- </w:t>
+      </w:r>
+      <w:r>
+        <w:rPr>
+          <w:sz w:val="24"/>
+          <w:szCs w:val="24"/>
+        </w:rPr>
+        <w:t>get rooms request from client</w:t>
+      </w:r>
+    </w:p>
+    <w:p>
+      <w:pPr>
+        <w:bidi w:val="0"/>
+        <w:rPr>
+          <w:sz w:val="24"/>
+          <w:szCs w:val="24"/>
+        </w:rPr>
+      </w:pPr>
+      <w:r>
+        <w:rPr>
+          <w:b/>
+          <w:bCs/>
+          <w:sz w:val="24"/>
+          <w:szCs w:val="24"/>
+        </w:rPr>
+        <w:t xml:space="preserve">41 </w:t>
+      </w:r>
+      <w:r>
+        <w:rPr>
+          <w:b/>
+          <w:bCs/>
+          <w:sz w:val="24"/>
+          <w:szCs w:val="24"/>
+        </w:rPr>
+        <w:t>-</w:t>
+      </w:r>
+      <w:r>
+        <w:rPr>
+          <w:b/>
+          <w:bCs/>
+          <w:sz w:val="24"/>
+          <w:szCs w:val="24"/>
+        </w:rPr>
+        <w:t xml:space="preserve"> </w:t>
+      </w:r>
+      <w:r>
+        <w:rPr>
+          <w:sz w:val="24"/>
+          <w:szCs w:val="24"/>
+        </w:rPr>
+        <w:t xml:space="preserve">get rooms </w:t>
+      </w:r>
+      <w:r>
+        <w:rPr>
+          <w:sz w:val="24"/>
+          <w:szCs w:val="24"/>
+        </w:rPr>
+        <w:t xml:space="preserve">response </w:t>
+      </w:r>
+      <w:r>
+        <w:rPr>
+          <w:sz w:val="24"/>
+          <w:szCs w:val="24"/>
+        </w:rPr>
+        <w:t>from server</w:t>
+      </w:r>
+    </w:p>
+    <w:p>
+      <w:pPr>
+        <w:bidi w:val="0"/>
+        <w:rPr>
+          <w:sz w:val="24"/>
+          <w:szCs w:val="24"/>
+        </w:rPr>
+      </w:pPr>
+      <w:r>
+        <w:rPr>
+          <w:b/>
+          <w:bCs/>
+          <w:sz w:val="24"/>
+          <w:szCs w:val="24"/>
+        </w:rPr>
+        <w:t>45</w:t>
+      </w:r>
+      <w:r>
+        <w:rPr>
+          <w:sz w:val="24"/>
+          <w:szCs w:val="24"/>
+        </w:rPr>
+        <w:t xml:space="preserve"> </w:t>
+      </w:r>
+      <w:r>
+        <w:rPr>
+          <w:sz w:val="24"/>
+          <w:szCs w:val="24"/>
+        </w:rPr>
+        <w:t>-</w:t>
+      </w:r>
+      <w:r>
+        <w:rPr>
+          <w:sz w:val="24"/>
+          <w:szCs w:val="24"/>
+        </w:rPr>
+        <w:t xml:space="preserve"> get rooms error from server</w:t>
+      </w:r>
+    </w:p>
+    <w:p>
+      <w:pPr>
+        <w:bidi w:val="0"/>
+        <w:rPr>
+          <w:sz w:val="24"/>
+          <w:szCs w:val="24"/>
+        </w:rPr>
+      </w:pPr>
+    </w:p>
+    <w:p>
+      <w:pPr>
+        <w:bidi w:val="0"/>
         <w:rPr>
           <w:b/>
           <w:bCs/>
@@ -1166,9 +1114,7 @@
           <w:szCs w:val="28"/>
           <w:u w:val="single"/>
         </w:rPr>
-        <w:t>In</w:t>
-      </w:r>
-      <w:proofErr w:type="gramEnd"/>
+      </w:pPr>
       <w:r>
         <w:rPr>
           <w:b/>
@@ -1177,84 +1123,52 @@
           <w:szCs w:val="28"/>
           <w:u w:val="single"/>
         </w:rPr>
-        <w:t xml:space="preserve"> Room</w:t>
-      </w:r>
-    </w:p>
-    <w:p>
-      <w:pPr>
-        <w:bidi w:val="0"/>
-        <w:rPr>
-          <w:sz w:val="24"/>
-          <w:szCs w:val="24"/>
-          <w:u w:val="single"/>
-        </w:rPr>
-      </w:pPr>
-      <w:r>
-        <w:rPr>
-          <w:sz w:val="24"/>
-          <w:szCs w:val="24"/>
-          <w:u w:val="single"/>
-        </w:rPr>
-        <w:t xml:space="preserve">Code range </w:t>
-      </w:r>
-      <w:r>
-        <w:rPr>
-          <w:sz w:val="24"/>
-          <w:szCs w:val="24"/>
-          <w:u w:val="single"/>
+        <w:t>Get Player In Room</w:t>
+      </w:r>
+    </w:p>
+    <w:p>
+      <w:pPr>
+        <w:bidi w:val="0"/>
+        <w:rPr>
+          <w:sz w:val="24"/>
+          <w:szCs w:val="24"/>
+          <w:u w:val="single"/>
+        </w:rPr>
+      </w:pPr>
+      <w:r>
+        <w:rPr>
+          <w:sz w:val="24"/>
+          <w:szCs w:val="24"/>
+          <w:u w:val="single"/>
+        </w:rPr>
+        <w:t>Code range 50 – 59</w:t>
+      </w:r>
+    </w:p>
+    <w:p>
+      <w:pPr>
+        <w:bidi w:val="0"/>
+        <w:rPr>
+          <w:sz w:val="24"/>
+          <w:szCs w:val="24"/>
+        </w:rPr>
+      </w:pPr>
+      <w:r>
+        <w:rPr>
+          <w:b/>
+          <w:bCs/>
+          <w:sz w:val="24"/>
+          <w:szCs w:val="24"/>
         </w:rPr>
         <w:t>5</w:t>
       </w:r>
       <w:r>
         <w:rPr>
-          <w:sz w:val="24"/>
-          <w:szCs w:val="24"/>
-          <w:u w:val="single"/>
-        </w:rPr>
-        <w:t xml:space="preserve">00 – </w:t>
-      </w:r>
-      <w:r>
-        <w:rPr>
-          <w:sz w:val="24"/>
-          <w:szCs w:val="24"/>
-          <w:u w:val="single"/>
-        </w:rPr>
-        <w:t>5</w:t>
-      </w:r>
-      <w:r>
-        <w:rPr>
-          <w:sz w:val="24"/>
-          <w:szCs w:val="24"/>
-          <w:u w:val="single"/>
-        </w:rPr>
-        <w:t>99</w:t>
-      </w:r>
-    </w:p>
-    <w:p>
-      <w:pPr>
-        <w:bidi w:val="0"/>
-        <w:rPr>
-          <w:sz w:val="24"/>
-          <w:szCs w:val="24"/>
-        </w:rPr>
-      </w:pPr>
-      <w:r>
-        <w:rPr>
-          <w:b/>
-          <w:bCs/>
-          <w:sz w:val="24"/>
-          <w:szCs w:val="24"/>
-        </w:rPr>
-        <w:t>5</w:t>
-      </w:r>
-      <w:r>
-        <w:rPr>
-          <w:b/>
-          <w:bCs/>
-          <w:sz w:val="24"/>
-          <w:szCs w:val="24"/>
-        </w:rPr>
-        <w:t>00</w:t>
+          <w:b/>
+          <w:bCs/>
+          <w:sz w:val="24"/>
+          <w:szCs w:val="24"/>
+        </w:rPr>
+        <w:t>0</w:t>
       </w:r>
       <w:r>
         <w:rPr>
@@ -1275,48 +1189,25 @@
           <w:sz w:val="24"/>
           <w:szCs w:val="24"/>
         </w:rPr>
-        <w:t xml:space="preserve"> get </w:t>
-      </w:r>
-      <w:r>
-        <w:rPr>
-          <w:sz w:val="24"/>
-          <w:szCs w:val="24"/>
-        </w:rPr>
-        <w:t>player in room</w:t>
-      </w:r>
-      <w:r>
-        <w:rPr>
-          <w:sz w:val="24"/>
-          <w:szCs w:val="24"/>
-        </w:rPr>
-        <w:t xml:space="preserve"> request from client</w:t>
-      </w:r>
-    </w:p>
-    <w:p>
-      <w:pPr>
-        <w:bidi w:val="0"/>
-        <w:rPr>
-          <w:sz w:val="24"/>
-          <w:szCs w:val="24"/>
-        </w:rPr>
-      </w:pPr>
-      <w:r>
-        <w:rPr>
-          <w:b/>
-          <w:bCs/>
-          <w:sz w:val="24"/>
-          <w:szCs w:val="24"/>
-        </w:rPr>
-        <w:t>5</w:t>
-      </w:r>
-      <w:r>
-        <w:rPr>
-          <w:b/>
-          <w:bCs/>
-          <w:sz w:val="24"/>
-          <w:szCs w:val="24"/>
-        </w:rPr>
-        <w:t xml:space="preserve">01 </w:t>
+        <w:t xml:space="preserve"> get player in room request from client</w:t>
+      </w:r>
+    </w:p>
+    <w:p>
+      <w:pPr>
+        <w:bidi w:val="0"/>
+        <w:rPr>
+          <w:sz w:val="24"/>
+          <w:szCs w:val="24"/>
+        </w:rPr>
+      </w:pPr>
+      <w:r>
+        <w:rPr>
+          <w:b/>
+          <w:bCs/>
+          <w:sz w:val="24"/>
+          <w:szCs w:val="24"/>
+        </w:rPr>
+        <w:t xml:space="preserve">51 </w:t>
       </w:r>
       <w:r>
         <w:rPr>
@@ -1341,55 +1232,46 @@
           <w:sz w:val="24"/>
           <w:szCs w:val="24"/>
         </w:rPr>
-        <w:t>get player in room accept from server</w:t>
-      </w:r>
-    </w:p>
-    <w:p>
-      <w:pPr>
-        <w:bidi w:val="0"/>
-        <w:rPr>
-          <w:sz w:val="24"/>
-          <w:szCs w:val="24"/>
-        </w:rPr>
-      </w:pPr>
-      <w:r>
-        <w:rPr>
-          <w:b/>
-          <w:bCs/>
-          <w:sz w:val="24"/>
-          <w:szCs w:val="24"/>
-        </w:rPr>
-        <w:t>5</w:t>
-      </w:r>
-      <w:r>
-        <w:rPr>
-          <w:b/>
-          <w:bCs/>
-          <w:sz w:val="24"/>
-          <w:szCs w:val="24"/>
-        </w:rPr>
-        <w:t>05</w:t>
-      </w:r>
-      <w:r>
-        <w:rPr>
-          <w:sz w:val="24"/>
-          <w:szCs w:val="24"/>
-        </w:rPr>
-        <w:t xml:space="preserve"> </w:t>
-      </w:r>
-      <w:r>
-        <w:rPr>
-          <w:sz w:val="24"/>
-          <w:szCs w:val="24"/>
-        </w:rPr>
-        <w:t xml:space="preserve">- </w:t>
-      </w:r>
-      <w:r>
-        <w:rPr>
-          <w:sz w:val="24"/>
-          <w:szCs w:val="24"/>
-        </w:rPr>
-        <w:t>get player in room error from server</w:t>
+        <w:t xml:space="preserve">get player in room </w:t>
+      </w:r>
+      <w:r>
+        <w:rPr>
+          <w:sz w:val="24"/>
+          <w:szCs w:val="24"/>
+        </w:rPr>
+        <w:t xml:space="preserve">response </w:t>
+      </w:r>
+      <w:r>
+        <w:rPr>
+          <w:sz w:val="24"/>
+          <w:szCs w:val="24"/>
+        </w:rPr>
+        <w:t>from server</w:t>
+      </w:r>
+    </w:p>
+    <w:p>
+      <w:pPr>
+        <w:bidi w:val="0"/>
+        <w:rPr>
+          <w:sz w:val="24"/>
+          <w:szCs w:val="24"/>
+        </w:rPr>
+      </w:pPr>
+      <w:r>
+        <w:rPr>
+          <w:b/>
+          <w:bCs/>
+          <w:sz w:val="24"/>
+          <w:szCs w:val="24"/>
+        </w:rPr>
+        <w:t>55</w:t>
+      </w:r>
+      <w:r>
+        <w:rPr>
+          <w:sz w:val="24"/>
+          <w:szCs w:val="24"/>
+        </w:rPr>
+        <w:t xml:space="preserve"> - get player in room error from server</w:t>
       </w:r>
     </w:p>
     <w:p>
@@ -1438,66 +1320,34 @@
           <w:szCs w:val="24"/>
           <w:u w:val="single"/>
         </w:rPr>
-        <w:t xml:space="preserve">Code range </w:t>
-      </w:r>
-      <w:r>
-        <w:rPr>
-          <w:sz w:val="24"/>
-          <w:szCs w:val="24"/>
-          <w:u w:val="single"/>
+        <w:t>Code range 60 – 69</w:t>
+      </w:r>
+    </w:p>
+    <w:p>
+      <w:pPr>
+        <w:bidi w:val="0"/>
+        <w:rPr>
+          <w:sz w:val="24"/>
+          <w:szCs w:val="24"/>
+        </w:rPr>
+      </w:pPr>
+      <w:r>
+        <w:rPr>
+          <w:b/>
+          <w:bCs/>
+          <w:sz w:val="24"/>
+          <w:szCs w:val="24"/>
         </w:rPr>
         <w:t>6</w:t>
       </w:r>
       <w:r>
         <w:rPr>
-          <w:sz w:val="24"/>
-          <w:szCs w:val="24"/>
-          <w:u w:val="single"/>
-        </w:rPr>
-        <w:t xml:space="preserve">00 – </w:t>
-      </w:r>
-      <w:r>
-        <w:rPr>
-          <w:sz w:val="24"/>
-          <w:szCs w:val="24"/>
-          <w:u w:val="single"/>
-        </w:rPr>
-        <w:t>6</w:t>
-      </w:r>
-      <w:r>
-        <w:rPr>
-          <w:sz w:val="24"/>
-          <w:szCs w:val="24"/>
-          <w:u w:val="single"/>
-        </w:rPr>
-        <w:t>99</w:t>
-      </w:r>
-    </w:p>
-    <w:p>
-      <w:pPr>
-        <w:bidi w:val="0"/>
-        <w:rPr>
-          <w:sz w:val="24"/>
-          <w:szCs w:val="24"/>
-        </w:rPr>
-      </w:pPr>
-      <w:r>
-        <w:rPr>
-          <w:b/>
-          <w:bCs/>
-          <w:sz w:val="24"/>
-          <w:szCs w:val="24"/>
-        </w:rPr>
-        <w:t>6</w:t>
-      </w:r>
-      <w:r>
-        <w:rPr>
-          <w:b/>
-          <w:bCs/>
-          <w:sz w:val="24"/>
-          <w:szCs w:val="24"/>
-        </w:rPr>
-        <w:t>00</w:t>
+          <w:b/>
+          <w:bCs/>
+          <w:sz w:val="24"/>
+          <w:szCs w:val="24"/>
+        </w:rPr>
+        <w:t>0</w:t>
       </w:r>
       <w:r>
         <w:rPr>
@@ -1522,50 +1372,46 @@
           <w:sz w:val="24"/>
           <w:szCs w:val="24"/>
         </w:rPr>
-        <w:t>6</w:t>
-      </w:r>
-      <w:r>
-        <w:rPr>
-          <w:b/>
-          <w:bCs/>
-          <w:sz w:val="24"/>
-          <w:szCs w:val="24"/>
-        </w:rPr>
-        <w:t xml:space="preserve">01 - </w:t>
-      </w:r>
-      <w:r>
-        <w:rPr>
-          <w:sz w:val="24"/>
-          <w:szCs w:val="24"/>
-        </w:rPr>
-        <w:t>get player in room accept from server</w:t>
-      </w:r>
-    </w:p>
-    <w:p>
-      <w:pPr>
-        <w:bidi w:val="0"/>
-        <w:rPr>
-          <w:sz w:val="24"/>
-          <w:szCs w:val="24"/>
-        </w:rPr>
-      </w:pPr>
-      <w:r>
-        <w:rPr>
-          <w:b/>
-          <w:bCs/>
-          <w:sz w:val="24"/>
-          <w:szCs w:val="24"/>
-        </w:rPr>
-        <w:t>6</w:t>
-      </w:r>
-      <w:r>
-        <w:rPr>
-          <w:b/>
-          <w:bCs/>
-          <w:sz w:val="24"/>
-          <w:szCs w:val="24"/>
-        </w:rPr>
-        <w:t>05</w:t>
+        <w:t xml:space="preserve">61 - </w:t>
+      </w:r>
+      <w:r>
+        <w:rPr>
+          <w:sz w:val="24"/>
+          <w:szCs w:val="24"/>
+        </w:rPr>
+        <w:t xml:space="preserve">get player in room </w:t>
+      </w:r>
+      <w:r>
+        <w:rPr>
+          <w:sz w:val="24"/>
+          <w:szCs w:val="24"/>
+        </w:rPr>
+        <w:t xml:space="preserve">response </w:t>
+      </w:r>
+      <w:r>
+        <w:rPr>
+          <w:sz w:val="24"/>
+          <w:szCs w:val="24"/>
+        </w:rPr>
+        <w:t>from server</w:t>
+      </w:r>
+    </w:p>
+    <w:p>
+      <w:pPr>
+        <w:bidi w:val="0"/>
+        <w:rPr>
+          <w:sz w:val="24"/>
+          <w:szCs w:val="24"/>
+        </w:rPr>
+      </w:pPr>
+      <w:r>
+        <w:rPr>
+          <w:b/>
+          <w:bCs/>
+          <w:sz w:val="24"/>
+          <w:szCs w:val="24"/>
+        </w:rPr>
+        <w:t>65</w:t>
       </w:r>
       <w:r>
         <w:rPr>
@@ -1690,7 +1536,7 @@
           <w:sz w:val="24"/>
           <w:szCs w:val="24"/>
         </w:rPr>
-        <w:t>00</w:t>
+        <w:t>0</w:t>
       </w:r>
       <w:r>
         <w:rPr>
@@ -1752,7 +1598,7 @@
           <w:sz w:val="24"/>
           <w:szCs w:val="24"/>
         </w:rPr>
-        <w:t xml:space="preserve">01 - </w:t>
+        <w:t xml:space="preserve">1 - </w:t>
       </w:r>
       <w:r>
         <w:rPr>
@@ -1766,7 +1612,14 @@
           <w:sz w:val="24"/>
           <w:szCs w:val="24"/>
         </w:rPr>
-        <w:t>accept from server</w:t>
+        <w:t xml:space="preserve">response </w:t>
+      </w:r>
+      <w:r>
+        <w:rPr>
+          <w:sz w:val="24"/>
+          <w:szCs w:val="24"/>
+        </w:rPr>
+        <w:t>from server</w:t>
       </w:r>
     </w:p>
     <w:p>
@@ -1793,7 +1646,7 @@
           <w:sz w:val="24"/>
           <w:szCs w:val="24"/>
         </w:rPr>
-        <w:t>05</w:t>
+        <w:t>5</w:t>
       </w:r>
       <w:r>
         <w:rPr>
@@ -1863,6 +1716,155 @@
           <w:szCs w:val="24"/>
           <w:u w:val="single"/>
         </w:rPr>
+        <w:t>Code range 80 – 89</w:t>
+      </w:r>
+    </w:p>
+    <w:p>
+      <w:pPr>
+        <w:bidi w:val="0"/>
+        <w:rPr>
+          <w:sz w:val="24"/>
+          <w:szCs w:val="24"/>
+        </w:rPr>
+      </w:pPr>
+      <w:r>
+        <w:rPr>
+          <w:b/>
+          <w:bCs/>
+          <w:sz w:val="24"/>
+          <w:szCs w:val="24"/>
+        </w:rPr>
+        <w:t>8</w:t>
+      </w:r>
+      <w:r>
+        <w:rPr>
+          <w:b/>
+          <w:bCs/>
+          <w:sz w:val="24"/>
+          <w:szCs w:val="24"/>
+        </w:rPr>
+        <w:t>0</w:t>
+      </w:r>
+      <w:r>
+        <w:rPr>
+          <w:sz w:val="24"/>
+          <w:szCs w:val="24"/>
+        </w:rPr>
+        <w:t xml:space="preserve"> – get high score request from client</w:t>
+      </w:r>
+    </w:p>
+    <w:p>
+      <w:pPr>
+        <w:bidi w:val="0"/>
+        <w:rPr>
+          <w:sz w:val="24"/>
+          <w:szCs w:val="24"/>
+        </w:rPr>
+      </w:pPr>
+      <w:r>
+        <w:rPr>
+          <w:b/>
+          <w:bCs/>
+          <w:sz w:val="24"/>
+          <w:szCs w:val="24"/>
+        </w:rPr>
+        <w:t xml:space="preserve">81 - </w:t>
+      </w:r>
+      <w:r>
+        <w:rPr>
+          <w:sz w:val="24"/>
+          <w:szCs w:val="24"/>
+        </w:rPr>
+        <w:t xml:space="preserve">get high score </w:t>
+      </w:r>
+      <w:r>
+        <w:rPr>
+          <w:sz w:val="24"/>
+          <w:szCs w:val="24"/>
+        </w:rPr>
+        <w:t xml:space="preserve">response </w:t>
+      </w:r>
+      <w:r>
+        <w:rPr>
+          <w:sz w:val="24"/>
+          <w:szCs w:val="24"/>
+        </w:rPr>
+        <w:t>from server</w:t>
+      </w:r>
+    </w:p>
+    <w:p>
+      <w:pPr>
+        <w:bidi w:val="0"/>
+        <w:rPr>
+          <w:sz w:val="24"/>
+          <w:szCs w:val="24"/>
+        </w:rPr>
+      </w:pPr>
+      <w:r>
+        <w:rPr>
+          <w:b/>
+          <w:bCs/>
+          <w:sz w:val="24"/>
+          <w:szCs w:val="24"/>
+        </w:rPr>
+        <w:lastRenderedPageBreak/>
+        <w:t>85</w:t>
+      </w:r>
+      <w:r>
+        <w:rPr>
+          <w:sz w:val="24"/>
+          <w:szCs w:val="24"/>
+        </w:rPr>
+        <w:t xml:space="preserve"> - get high score error from server</w:t>
+      </w:r>
+    </w:p>
+    <w:p>
+      <w:pPr>
+        <w:bidi w:val="0"/>
+        <w:rPr>
+          <w:b/>
+          <w:bCs/>
+          <w:sz w:val="28"/>
+          <w:szCs w:val="28"/>
+          <w:u w:val="single"/>
+        </w:rPr>
+      </w:pPr>
+      <w:r>
+        <w:rPr>
+          <w:b/>
+          <w:bCs/>
+          <w:sz w:val="28"/>
+          <w:szCs w:val="28"/>
+          <w:u w:val="single"/>
+        </w:rPr>
+        <w:t xml:space="preserve">Get </w:t>
+      </w:r>
+      <w:r>
+        <w:rPr>
+          <w:b/>
+          <w:bCs/>
+          <w:sz w:val="28"/>
+          <w:szCs w:val="28"/>
+          <w:u w:val="single"/>
+        </w:rPr>
+        <w:t>Personal  Stats</w:t>
+      </w:r>
+    </w:p>
+    <w:p>
+      <w:pPr>
+        <w:bidi w:val="0"/>
+        <w:rPr>
+          <w:sz w:val="24"/>
+          <w:szCs w:val="24"/>
+          <w:u w:val="single"/>
+        </w:rPr>
+      </w:pPr>
+      <w:r>
+        <w:rPr>
+          <w:sz w:val="24"/>
+          <w:szCs w:val="24"/>
+          <w:u w:val="single"/>
+        </w:rPr>
         <w:t xml:space="preserve">Code range </w:t>
       </w:r>
       <w:r>
@@ -1871,63 +1873,13 @@
           <w:szCs w:val="24"/>
           <w:u w:val="single"/>
         </w:rPr>
-        <w:t>8</w:t>
-      </w:r>
-      <w:r>
-        <w:rPr>
-          <w:sz w:val="24"/>
-          <w:szCs w:val="24"/>
-          <w:u w:val="single"/>
-        </w:rPr>
-        <w:t xml:space="preserve">00 – </w:t>
-      </w:r>
-      <w:r>
-        <w:rPr>
-          <w:sz w:val="24"/>
-          <w:szCs w:val="24"/>
-          <w:u w:val="single"/>
-        </w:rPr>
-        <w:t>8</w:t>
-      </w:r>
-      <w:r>
-        <w:rPr>
-          <w:sz w:val="24"/>
-          <w:szCs w:val="24"/>
-          <w:u w:val="single"/>
-        </w:rPr>
-        <w:t>99</w:t>
-      </w:r>
-    </w:p>
-    <w:p>
-      <w:pPr>
-        <w:bidi w:val="0"/>
-        <w:rPr>
-          <w:sz w:val="24"/>
-          <w:szCs w:val="24"/>
-        </w:rPr>
-      </w:pPr>
-      <w:r>
-        <w:rPr>
-          <w:b/>
-          <w:bCs/>
-          <w:sz w:val="24"/>
-          <w:szCs w:val="24"/>
-        </w:rPr>
-        <w:t>8</w:t>
-      </w:r>
-      <w:r>
-        <w:rPr>
-          <w:b/>
-          <w:bCs/>
-          <w:sz w:val="24"/>
-          <w:szCs w:val="24"/>
-        </w:rPr>
-        <w:t>00</w:t>
-      </w:r>
-      <w:r>
-        <w:rPr>
-          <w:sz w:val="24"/>
-          <w:szCs w:val="24"/>
+        <w:t>90</w:t>
+      </w:r>
+      <w:r>
+        <w:rPr>
+          <w:sz w:val="24"/>
+          <w:szCs w:val="24"/>
+          <w:u w:val="single"/>
         </w:rPr>
         <w:t xml:space="preserve"> – </w:t>
       </w:r>
@@ -1935,92 +1887,1240 @@
         <w:rPr>
           <w:sz w:val="24"/>
           <w:szCs w:val="24"/>
-        </w:rPr>
-        <w:t xml:space="preserve">get high score </w:t>
-      </w:r>
-      <w:r>
-        <w:rPr>
-          <w:sz w:val="24"/>
-          <w:szCs w:val="24"/>
-        </w:rPr>
-        <w:t>request from client</w:t>
-      </w:r>
-    </w:p>
-    <w:p>
-      <w:pPr>
-        <w:bidi w:val="0"/>
-        <w:rPr>
-          <w:sz w:val="24"/>
-          <w:szCs w:val="24"/>
-        </w:rPr>
-      </w:pPr>
-      <w:r>
-        <w:rPr>
-          <w:b/>
-          <w:bCs/>
-          <w:sz w:val="24"/>
-          <w:szCs w:val="24"/>
-        </w:rPr>
-        <w:t>8</w:t>
-      </w:r>
-      <w:r>
-        <w:rPr>
-          <w:b/>
-          <w:bCs/>
-          <w:sz w:val="24"/>
-          <w:szCs w:val="24"/>
-        </w:rPr>
-        <w:t xml:space="preserve">01 - </w:t>
-      </w:r>
-      <w:r>
-        <w:rPr>
-          <w:sz w:val="24"/>
-          <w:szCs w:val="24"/>
-        </w:rPr>
-        <w:t>get high score accept from server</w:t>
-      </w:r>
-    </w:p>
-    <w:p>
-      <w:pPr>
-        <w:bidi w:val="0"/>
-        <w:rPr>
-          <w:sz w:val="24"/>
-          <w:szCs w:val="24"/>
-        </w:rPr>
-      </w:pPr>
-      <w:r>
-        <w:rPr>
-          <w:b/>
-          <w:bCs/>
-          <w:sz w:val="24"/>
-          <w:szCs w:val="24"/>
-        </w:rPr>
-        <w:t>8</w:t>
-      </w:r>
-      <w:r>
-        <w:rPr>
-          <w:b/>
-          <w:bCs/>
-          <w:sz w:val="24"/>
-          <w:szCs w:val="24"/>
-        </w:rPr>
-        <w:t>05</w:t>
-      </w:r>
-      <w:r>
-        <w:rPr>
-          <w:sz w:val="24"/>
-          <w:szCs w:val="24"/>
-        </w:rPr>
-        <w:t xml:space="preserve"> - get high sc</w:t>
-      </w:r>
-      <w:bookmarkStart w:id="0" w:name="_GoBack"/>
-      <w:bookmarkEnd w:id="0"/>
-      <w:r>
-        <w:rPr>
-          <w:sz w:val="24"/>
-          <w:szCs w:val="24"/>
-        </w:rPr>
-        <w:t>ore error from server</w:t>
+          <w:u w:val="single"/>
+        </w:rPr>
+        <w:t>9</w:t>
+      </w:r>
+      <w:r>
+        <w:rPr>
+          <w:sz w:val="24"/>
+          <w:szCs w:val="24"/>
+          <w:u w:val="single"/>
+        </w:rPr>
+        <w:t>9</w:t>
+      </w:r>
+    </w:p>
+    <w:p>
+      <w:pPr>
+        <w:bidi w:val="0"/>
+        <w:rPr>
+          <w:sz w:val="24"/>
+          <w:szCs w:val="24"/>
+        </w:rPr>
+      </w:pPr>
+      <w:r>
+        <w:rPr>
+          <w:b/>
+          <w:bCs/>
+          <w:sz w:val="24"/>
+          <w:szCs w:val="24"/>
+        </w:rPr>
+        <w:t>9</w:t>
+      </w:r>
+      <w:r>
+        <w:rPr>
+          <w:b/>
+          <w:bCs/>
+          <w:sz w:val="24"/>
+          <w:szCs w:val="24"/>
+        </w:rPr>
+        <w:t>0</w:t>
+      </w:r>
+      <w:r>
+        <w:rPr>
+          <w:sz w:val="24"/>
+          <w:szCs w:val="24"/>
+        </w:rPr>
+        <w:t xml:space="preserve"> – get </w:t>
+      </w:r>
+      <w:r>
+        <w:rPr>
+          <w:sz w:val="24"/>
+          <w:szCs w:val="24"/>
+        </w:rPr>
+        <w:t>personal</w:t>
+      </w:r>
+      <w:r>
+        <w:rPr>
+          <w:sz w:val="24"/>
+          <w:szCs w:val="24"/>
+        </w:rPr>
+        <w:t xml:space="preserve"> </w:t>
+      </w:r>
+      <w:r>
+        <w:rPr>
+          <w:sz w:val="24"/>
+          <w:szCs w:val="24"/>
+        </w:rPr>
+        <w:t>statistics</w:t>
+      </w:r>
+      <w:r>
+        <w:rPr>
+          <w:sz w:val="24"/>
+          <w:szCs w:val="24"/>
+        </w:rPr>
+        <w:t xml:space="preserve"> request from client</w:t>
+      </w:r>
+    </w:p>
+    <w:p>
+      <w:pPr>
+        <w:bidi w:val="0"/>
+        <w:rPr>
+          <w:b/>
+          <w:bCs/>
+          <w:sz w:val="24"/>
+          <w:szCs w:val="24"/>
+        </w:rPr>
+      </w:pPr>
+      <w:r>
+        <w:rPr>
+          <w:b/>
+          <w:bCs/>
+          <w:sz w:val="24"/>
+          <w:szCs w:val="24"/>
+        </w:rPr>
+        <w:t>9</w:t>
+      </w:r>
+      <w:r>
+        <w:rPr>
+          <w:b/>
+          <w:bCs/>
+          <w:sz w:val="24"/>
+          <w:szCs w:val="24"/>
+        </w:rPr>
+        <w:t xml:space="preserve">1 </w:t>
+      </w:r>
+      <w:r>
+        <w:rPr>
+          <w:b/>
+          <w:bCs/>
+          <w:sz w:val="24"/>
+          <w:szCs w:val="24"/>
+        </w:rPr>
+        <w:t xml:space="preserve">– </w:t>
+      </w:r>
+      <w:r>
+        <w:rPr>
+          <w:sz w:val="24"/>
+          <w:szCs w:val="24"/>
+        </w:rPr>
+        <w:t xml:space="preserve">get </w:t>
+      </w:r>
+      <w:r>
+        <w:rPr>
+          <w:sz w:val="24"/>
+          <w:szCs w:val="24"/>
+        </w:rPr>
+        <w:t xml:space="preserve">personal statistics </w:t>
+      </w:r>
+      <w:r>
+        <w:rPr>
+          <w:sz w:val="24"/>
+          <w:szCs w:val="24"/>
+        </w:rPr>
+        <w:t>response</w:t>
+      </w:r>
+      <w:r>
+        <w:rPr>
+          <w:sz w:val="24"/>
+          <w:szCs w:val="24"/>
+        </w:rPr>
+        <w:t xml:space="preserve"> from server</w:t>
+      </w:r>
+    </w:p>
+    <w:p>
+      <w:pPr>
+        <w:bidi w:val="0"/>
+        <w:rPr>
+          <w:sz w:val="24"/>
+          <w:szCs w:val="24"/>
+        </w:rPr>
+      </w:pPr>
+      <w:r>
+        <w:rPr>
+          <w:b/>
+          <w:bCs/>
+          <w:sz w:val="24"/>
+          <w:szCs w:val="24"/>
+        </w:rPr>
+        <w:t>9</w:t>
+      </w:r>
+      <w:r>
+        <w:rPr>
+          <w:b/>
+          <w:bCs/>
+          <w:sz w:val="24"/>
+          <w:szCs w:val="24"/>
+        </w:rPr>
+        <w:t>5</w:t>
+      </w:r>
+      <w:r>
+        <w:rPr>
+          <w:sz w:val="24"/>
+          <w:szCs w:val="24"/>
+        </w:rPr>
+        <w:t xml:space="preserve"> </w:t>
+      </w:r>
+      <w:r>
+        <w:rPr>
+          <w:sz w:val="24"/>
+          <w:szCs w:val="24"/>
+        </w:rPr>
+        <w:t>–</w:t>
+      </w:r>
+      <w:r>
+        <w:rPr>
+          <w:sz w:val="24"/>
+          <w:szCs w:val="24"/>
+        </w:rPr>
+        <w:t xml:space="preserve"> get</w:t>
+      </w:r>
+      <w:r>
+        <w:rPr>
+          <w:sz w:val="24"/>
+          <w:szCs w:val="24"/>
+        </w:rPr>
+        <w:t xml:space="preserve"> </w:t>
+      </w:r>
+      <w:r>
+        <w:rPr>
+          <w:sz w:val="24"/>
+          <w:szCs w:val="24"/>
+        </w:rPr>
+        <w:t>personal statistics</w:t>
+      </w:r>
+      <w:r>
+        <w:rPr>
+          <w:sz w:val="24"/>
+          <w:szCs w:val="24"/>
+        </w:rPr>
+        <w:t xml:space="preserve"> error from server</w:t>
+      </w:r>
+    </w:p>
+    <w:p>
+      <w:pPr>
+        <w:bidi w:val="0"/>
+        <w:rPr>
+          <w:sz w:val="24"/>
+          <w:szCs w:val="24"/>
+        </w:rPr>
+      </w:pPr>
+    </w:p>
+    <w:p>
+      <w:pPr>
+        <w:bidi w:val="0"/>
+        <w:rPr>
+          <w:b/>
+          <w:bCs/>
+          <w:sz w:val="28"/>
+          <w:szCs w:val="28"/>
+          <w:u w:val="single"/>
+        </w:rPr>
+      </w:pPr>
+      <w:r>
+        <w:rPr>
+          <w:b/>
+          <w:bCs/>
+          <w:sz w:val="28"/>
+          <w:szCs w:val="28"/>
+          <w:u w:val="single"/>
+        </w:rPr>
+        <w:t>Close Room</w:t>
+      </w:r>
+    </w:p>
+    <w:p>
+      <w:pPr>
+        <w:bidi w:val="0"/>
+        <w:rPr>
+          <w:sz w:val="24"/>
+          <w:szCs w:val="24"/>
+          <w:u w:val="single"/>
+        </w:rPr>
+      </w:pPr>
+      <w:r>
+        <w:rPr>
+          <w:sz w:val="24"/>
+          <w:szCs w:val="24"/>
+          <w:u w:val="single"/>
+        </w:rPr>
+        <w:t xml:space="preserve">Code range </w:t>
+      </w:r>
+      <w:r>
+        <w:rPr>
+          <w:sz w:val="24"/>
+          <w:szCs w:val="24"/>
+          <w:u w:val="single"/>
+        </w:rPr>
+        <w:t>100</w:t>
+      </w:r>
+      <w:r>
+        <w:rPr>
+          <w:sz w:val="24"/>
+          <w:szCs w:val="24"/>
+          <w:u w:val="single"/>
+        </w:rPr>
+        <w:t xml:space="preserve"> – </w:t>
+      </w:r>
+      <w:r>
+        <w:rPr>
+          <w:sz w:val="24"/>
+          <w:szCs w:val="24"/>
+          <w:u w:val="single"/>
+        </w:rPr>
+        <w:t>10</w:t>
+      </w:r>
+      <w:r>
+        <w:rPr>
+          <w:sz w:val="24"/>
+          <w:szCs w:val="24"/>
+          <w:u w:val="single"/>
+        </w:rPr>
+        <w:t>9</w:t>
+      </w:r>
+    </w:p>
+    <w:p>
+      <w:pPr>
+        <w:bidi w:val="0"/>
+        <w:rPr>
+          <w:sz w:val="24"/>
+          <w:szCs w:val="24"/>
+        </w:rPr>
+      </w:pPr>
+      <w:r>
+        <w:rPr>
+          <w:b/>
+          <w:bCs/>
+          <w:sz w:val="24"/>
+          <w:szCs w:val="24"/>
+        </w:rPr>
+        <w:t>10</w:t>
+      </w:r>
+      <w:r>
+        <w:rPr>
+          <w:b/>
+          <w:bCs/>
+          <w:sz w:val="24"/>
+          <w:szCs w:val="24"/>
+        </w:rPr>
+        <w:t>0</w:t>
+      </w:r>
+      <w:r>
+        <w:rPr>
+          <w:sz w:val="24"/>
+          <w:szCs w:val="24"/>
+        </w:rPr>
+        <w:t xml:space="preserve"> – </w:t>
+      </w:r>
+      <w:r>
+        <w:rPr>
+          <w:sz w:val="24"/>
+          <w:szCs w:val="24"/>
+        </w:rPr>
+        <w:t>close room</w:t>
+      </w:r>
+      <w:r>
+        <w:rPr>
+          <w:sz w:val="24"/>
+          <w:szCs w:val="24"/>
+        </w:rPr>
+        <w:t xml:space="preserve"> request from client</w:t>
+      </w:r>
+    </w:p>
+    <w:p>
+      <w:pPr>
+        <w:bidi w:val="0"/>
+        <w:rPr>
+          <w:sz w:val="24"/>
+          <w:szCs w:val="24"/>
+        </w:rPr>
+      </w:pPr>
+      <w:r>
+        <w:rPr>
+          <w:b/>
+          <w:bCs/>
+          <w:sz w:val="24"/>
+          <w:szCs w:val="24"/>
+        </w:rPr>
+        <w:t>10</w:t>
+      </w:r>
+      <w:r>
+        <w:rPr>
+          <w:b/>
+          <w:bCs/>
+          <w:sz w:val="24"/>
+          <w:szCs w:val="24"/>
+        </w:rPr>
+        <w:t xml:space="preserve">1 </w:t>
+      </w:r>
+      <w:r>
+        <w:rPr>
+          <w:b/>
+          <w:bCs/>
+          <w:sz w:val="24"/>
+          <w:szCs w:val="24"/>
+        </w:rPr>
+        <w:t>–</w:t>
+      </w:r>
+      <w:r>
+        <w:rPr>
+          <w:b/>
+          <w:bCs/>
+          <w:sz w:val="24"/>
+          <w:szCs w:val="24"/>
+        </w:rPr>
+        <w:t xml:space="preserve"> </w:t>
+      </w:r>
+      <w:r>
+        <w:rPr>
+          <w:sz w:val="24"/>
+          <w:szCs w:val="24"/>
+        </w:rPr>
+        <w:t>close room</w:t>
+      </w:r>
+      <w:r>
+        <w:rPr>
+          <w:sz w:val="24"/>
+          <w:szCs w:val="24"/>
+        </w:rPr>
+        <w:t xml:space="preserve"> response from server</w:t>
+      </w:r>
+    </w:p>
+    <w:p>
+      <w:pPr>
+        <w:bidi w:val="0"/>
+        <w:rPr>
+          <w:sz w:val="24"/>
+          <w:szCs w:val="24"/>
+        </w:rPr>
+      </w:pPr>
+      <w:r>
+        <w:rPr>
+          <w:b/>
+          <w:bCs/>
+          <w:sz w:val="24"/>
+          <w:szCs w:val="24"/>
+        </w:rPr>
+        <w:t>10</w:t>
+      </w:r>
+      <w:r>
+        <w:rPr>
+          <w:b/>
+          <w:bCs/>
+          <w:sz w:val="24"/>
+          <w:szCs w:val="24"/>
+        </w:rPr>
+        <w:t>5</w:t>
+      </w:r>
+      <w:r>
+        <w:rPr>
+          <w:sz w:val="24"/>
+          <w:szCs w:val="24"/>
+        </w:rPr>
+        <w:t xml:space="preserve"> </w:t>
+      </w:r>
+      <w:r>
+        <w:rPr>
+          <w:sz w:val="24"/>
+          <w:szCs w:val="24"/>
+        </w:rPr>
+        <w:t>- close room</w:t>
+      </w:r>
+      <w:r>
+        <w:rPr>
+          <w:sz w:val="24"/>
+          <w:szCs w:val="24"/>
+        </w:rPr>
+        <w:t xml:space="preserve"> error from serve</w:t>
+      </w:r>
+      <w:r>
+        <w:rPr>
+          <w:sz w:val="24"/>
+          <w:szCs w:val="24"/>
+        </w:rPr>
+        <w:t>r</w:t>
+      </w:r>
+    </w:p>
+    <w:p>
+      <w:pPr>
+        <w:bidi w:val="0"/>
+        <w:rPr>
+          <w:sz w:val="24"/>
+          <w:szCs w:val="24"/>
+        </w:rPr>
+      </w:pPr>
+    </w:p>
+    <w:p>
+      <w:pPr>
+        <w:bidi w:val="0"/>
+        <w:rPr>
+          <w:b/>
+          <w:bCs/>
+          <w:sz w:val="28"/>
+          <w:szCs w:val="28"/>
+          <w:u w:val="single"/>
+        </w:rPr>
+      </w:pPr>
+      <w:r>
+        <w:rPr>
+          <w:b/>
+          <w:bCs/>
+          <w:sz w:val="28"/>
+          <w:szCs w:val="28"/>
+          <w:u w:val="single"/>
+        </w:rPr>
+        <w:t>Start game</w:t>
+      </w:r>
+    </w:p>
+    <w:p>
+      <w:pPr>
+        <w:bidi w:val="0"/>
+        <w:rPr>
+          <w:sz w:val="24"/>
+          <w:szCs w:val="24"/>
+          <w:u w:val="single"/>
+        </w:rPr>
+      </w:pPr>
+      <w:r>
+        <w:rPr>
+          <w:sz w:val="24"/>
+          <w:szCs w:val="24"/>
+          <w:u w:val="single"/>
+        </w:rPr>
+        <w:t xml:space="preserve">Code range </w:t>
+      </w:r>
+      <w:r>
+        <w:rPr>
+          <w:sz w:val="24"/>
+          <w:szCs w:val="24"/>
+          <w:u w:val="single"/>
+        </w:rPr>
+        <w:t>110</w:t>
+      </w:r>
+      <w:r>
+        <w:rPr>
+          <w:sz w:val="24"/>
+          <w:szCs w:val="24"/>
+          <w:u w:val="single"/>
+        </w:rPr>
+        <w:t xml:space="preserve"> –</w:t>
+      </w:r>
+      <w:r>
+        <w:rPr>
+          <w:sz w:val="24"/>
+          <w:szCs w:val="24"/>
+          <w:u w:val="single"/>
+        </w:rPr>
+        <w:t xml:space="preserve"> 11</w:t>
+      </w:r>
+      <w:r>
+        <w:rPr>
+          <w:sz w:val="24"/>
+          <w:szCs w:val="24"/>
+          <w:u w:val="single"/>
+        </w:rPr>
+        <w:t>9</w:t>
+      </w:r>
+    </w:p>
+    <w:p>
+      <w:pPr>
+        <w:bidi w:val="0"/>
+        <w:rPr>
+          <w:sz w:val="24"/>
+          <w:szCs w:val="24"/>
+        </w:rPr>
+      </w:pPr>
+      <w:r>
+        <w:rPr>
+          <w:b/>
+          <w:bCs/>
+          <w:sz w:val="24"/>
+          <w:szCs w:val="24"/>
+        </w:rPr>
+        <w:t>11</w:t>
+      </w:r>
+      <w:r>
+        <w:rPr>
+          <w:b/>
+          <w:bCs/>
+          <w:sz w:val="24"/>
+          <w:szCs w:val="24"/>
+        </w:rPr>
+        <w:t>0</w:t>
+      </w:r>
+      <w:r>
+        <w:rPr>
+          <w:sz w:val="24"/>
+          <w:szCs w:val="24"/>
+        </w:rPr>
+        <w:t xml:space="preserve"> – </w:t>
+      </w:r>
+      <w:r>
+        <w:rPr>
+          <w:sz w:val="24"/>
+          <w:szCs w:val="24"/>
+        </w:rPr>
+        <w:t>start game</w:t>
+      </w:r>
+      <w:r>
+        <w:rPr>
+          <w:sz w:val="24"/>
+          <w:szCs w:val="24"/>
+        </w:rPr>
+        <w:t xml:space="preserve"> request from client</w:t>
+      </w:r>
+    </w:p>
+    <w:p>
+      <w:pPr>
+        <w:bidi w:val="0"/>
+        <w:rPr>
+          <w:sz w:val="24"/>
+          <w:szCs w:val="24"/>
+        </w:rPr>
+      </w:pPr>
+      <w:r>
+        <w:rPr>
+          <w:b/>
+          <w:bCs/>
+          <w:sz w:val="24"/>
+          <w:szCs w:val="24"/>
+        </w:rPr>
+        <w:t>1</w:t>
+      </w:r>
+      <w:r>
+        <w:rPr>
+          <w:b/>
+          <w:bCs/>
+          <w:sz w:val="24"/>
+          <w:szCs w:val="24"/>
+        </w:rPr>
+        <w:t>11</w:t>
+      </w:r>
+      <w:r>
+        <w:rPr>
+          <w:b/>
+          <w:bCs/>
+          <w:sz w:val="24"/>
+          <w:szCs w:val="24"/>
+        </w:rPr>
+        <w:t xml:space="preserve"> </w:t>
+      </w:r>
+      <w:r>
+        <w:rPr>
+          <w:b/>
+          <w:bCs/>
+          <w:sz w:val="24"/>
+          <w:szCs w:val="24"/>
+        </w:rPr>
+        <w:t>–</w:t>
+      </w:r>
+      <w:r>
+        <w:rPr>
+          <w:b/>
+          <w:bCs/>
+          <w:sz w:val="24"/>
+          <w:szCs w:val="24"/>
+        </w:rPr>
+        <w:t xml:space="preserve"> </w:t>
+      </w:r>
+      <w:r>
+        <w:rPr>
+          <w:sz w:val="24"/>
+          <w:szCs w:val="24"/>
+        </w:rPr>
+        <w:t>start game</w:t>
+      </w:r>
+      <w:r>
+        <w:rPr>
+          <w:sz w:val="24"/>
+          <w:szCs w:val="24"/>
+        </w:rPr>
+        <w:t xml:space="preserve"> response from server</w:t>
+      </w:r>
+    </w:p>
+    <w:p>
+      <w:pPr>
+        <w:bidi w:val="0"/>
+        <w:rPr>
+          <w:sz w:val="24"/>
+          <w:szCs w:val="24"/>
+        </w:rPr>
+      </w:pPr>
+      <w:r>
+        <w:rPr>
+          <w:b/>
+          <w:bCs/>
+          <w:sz w:val="24"/>
+          <w:szCs w:val="24"/>
+        </w:rPr>
+        <w:t>115</w:t>
+      </w:r>
+      <w:r>
+        <w:rPr>
+          <w:sz w:val="24"/>
+          <w:szCs w:val="24"/>
+        </w:rPr>
+        <w:t xml:space="preserve"> </w:t>
+      </w:r>
+      <w:r>
+        <w:rPr>
+          <w:sz w:val="24"/>
+          <w:szCs w:val="24"/>
+        </w:rPr>
+        <w:t>–</w:t>
+      </w:r>
+      <w:r>
+        <w:rPr>
+          <w:sz w:val="24"/>
+          <w:szCs w:val="24"/>
+        </w:rPr>
+        <w:t xml:space="preserve"> </w:t>
+      </w:r>
+      <w:r>
+        <w:rPr>
+          <w:sz w:val="24"/>
+          <w:szCs w:val="24"/>
+        </w:rPr>
+        <w:t>start game error from server</w:t>
+      </w:r>
+    </w:p>
+    <w:p>
+      <w:pPr>
+        <w:bidi w:val="0"/>
+        <w:rPr>
+          <w:sz w:val="24"/>
+          <w:szCs w:val="24"/>
+        </w:rPr>
+      </w:pPr>
+    </w:p>
+    <w:p>
+      <w:pPr>
+        <w:bidi w:val="0"/>
+        <w:rPr>
+          <w:b/>
+          <w:bCs/>
+          <w:sz w:val="28"/>
+          <w:szCs w:val="28"/>
+          <w:u w:val="single"/>
+        </w:rPr>
+      </w:pPr>
+      <w:r>
+        <w:rPr>
+          <w:b/>
+          <w:bCs/>
+          <w:sz w:val="28"/>
+          <w:szCs w:val="28"/>
+          <w:u w:val="single"/>
+        </w:rPr>
+        <w:t>Get Room State</w:t>
+      </w:r>
+    </w:p>
+    <w:p>
+      <w:pPr>
+        <w:bidi w:val="0"/>
+        <w:rPr>
+          <w:sz w:val="24"/>
+          <w:szCs w:val="24"/>
+          <w:u w:val="single"/>
+        </w:rPr>
+      </w:pPr>
+      <w:r>
+        <w:rPr>
+          <w:sz w:val="24"/>
+          <w:szCs w:val="24"/>
+          <w:u w:val="single"/>
+        </w:rPr>
+        <w:t xml:space="preserve">Code range </w:t>
+      </w:r>
+      <w:r>
+        <w:rPr>
+          <w:sz w:val="24"/>
+          <w:szCs w:val="24"/>
+          <w:u w:val="single"/>
+        </w:rPr>
+        <w:t>12</w:t>
+      </w:r>
+      <w:r>
+        <w:rPr>
+          <w:sz w:val="24"/>
+          <w:szCs w:val="24"/>
+          <w:u w:val="single"/>
+        </w:rPr>
+        <w:t>0 –</w:t>
+      </w:r>
+      <w:r>
+        <w:rPr>
+          <w:sz w:val="24"/>
+          <w:szCs w:val="24"/>
+          <w:u w:val="single"/>
+        </w:rPr>
+        <w:t>12</w:t>
+      </w:r>
+      <w:r>
+        <w:rPr>
+          <w:sz w:val="24"/>
+          <w:szCs w:val="24"/>
+          <w:u w:val="single"/>
+        </w:rPr>
+        <w:t>9</w:t>
+      </w:r>
+    </w:p>
+    <w:p>
+      <w:pPr>
+        <w:bidi w:val="0"/>
+        <w:rPr>
+          <w:sz w:val="24"/>
+          <w:szCs w:val="24"/>
+        </w:rPr>
+      </w:pPr>
+      <w:r>
+        <w:rPr>
+          <w:b/>
+          <w:bCs/>
+          <w:sz w:val="24"/>
+          <w:szCs w:val="24"/>
+        </w:rPr>
+        <w:t>12</w:t>
+      </w:r>
+      <w:r>
+        <w:rPr>
+          <w:b/>
+          <w:bCs/>
+          <w:sz w:val="24"/>
+          <w:szCs w:val="24"/>
+        </w:rPr>
+        <w:t>0</w:t>
+      </w:r>
+      <w:r>
+        <w:rPr>
+          <w:sz w:val="24"/>
+          <w:szCs w:val="24"/>
+        </w:rPr>
+        <w:t xml:space="preserve"> – get </w:t>
+      </w:r>
+      <w:r>
+        <w:rPr>
+          <w:sz w:val="24"/>
+          <w:szCs w:val="24"/>
+        </w:rPr>
+        <w:t>room state</w:t>
+      </w:r>
+      <w:r>
+        <w:rPr>
+          <w:sz w:val="24"/>
+          <w:szCs w:val="24"/>
+        </w:rPr>
+        <w:t xml:space="preserve"> request from client</w:t>
+      </w:r>
+    </w:p>
+    <w:p>
+      <w:pPr>
+        <w:bidi w:val="0"/>
+        <w:rPr>
+          <w:sz w:val="24"/>
+          <w:szCs w:val="24"/>
+        </w:rPr>
+      </w:pPr>
+      <w:r>
+        <w:rPr>
+          <w:b/>
+          <w:bCs/>
+          <w:sz w:val="24"/>
+          <w:szCs w:val="24"/>
+        </w:rPr>
+        <w:t>12</w:t>
+      </w:r>
+      <w:r>
+        <w:rPr>
+          <w:b/>
+          <w:bCs/>
+          <w:sz w:val="24"/>
+          <w:szCs w:val="24"/>
+        </w:rPr>
+        <w:t xml:space="preserve">1 - </w:t>
+      </w:r>
+      <w:r>
+        <w:rPr>
+          <w:sz w:val="24"/>
+          <w:szCs w:val="24"/>
+        </w:rPr>
+        <w:t xml:space="preserve">get </w:t>
+      </w:r>
+      <w:r>
+        <w:rPr>
+          <w:sz w:val="24"/>
+          <w:szCs w:val="24"/>
+        </w:rPr>
+        <w:t xml:space="preserve">room state </w:t>
+      </w:r>
+      <w:r>
+        <w:rPr>
+          <w:sz w:val="24"/>
+          <w:szCs w:val="24"/>
+        </w:rPr>
+        <w:t>response from server</w:t>
+      </w:r>
+    </w:p>
+    <w:p>
+      <w:pPr>
+        <w:bidi w:val="0"/>
+        <w:rPr>
+          <w:sz w:val="24"/>
+          <w:szCs w:val="24"/>
+        </w:rPr>
+      </w:pPr>
+      <w:r>
+        <w:rPr>
+          <w:b/>
+          <w:bCs/>
+          <w:sz w:val="24"/>
+          <w:szCs w:val="24"/>
+        </w:rPr>
+        <w:t>12</w:t>
+      </w:r>
+      <w:r>
+        <w:rPr>
+          <w:b/>
+          <w:bCs/>
+          <w:sz w:val="24"/>
+          <w:szCs w:val="24"/>
+        </w:rPr>
+        <w:t>5</w:t>
+      </w:r>
+      <w:r>
+        <w:rPr>
+          <w:sz w:val="24"/>
+          <w:szCs w:val="24"/>
+        </w:rPr>
+        <w:t xml:space="preserve"> </w:t>
+      </w:r>
+      <w:r>
+        <w:rPr>
+          <w:sz w:val="24"/>
+          <w:szCs w:val="24"/>
+        </w:rPr>
+        <w:t>–</w:t>
+      </w:r>
+      <w:r>
+        <w:rPr>
+          <w:sz w:val="24"/>
+          <w:szCs w:val="24"/>
+        </w:rPr>
+        <w:t xml:space="preserve"> get</w:t>
+      </w:r>
+      <w:r>
+        <w:rPr>
+          <w:sz w:val="24"/>
+          <w:szCs w:val="24"/>
+        </w:rPr>
+        <w:t xml:space="preserve"> room state</w:t>
+      </w:r>
+      <w:r>
+        <w:rPr>
+          <w:sz w:val="24"/>
+          <w:szCs w:val="24"/>
+        </w:rPr>
+        <w:t xml:space="preserve"> </w:t>
+      </w:r>
+      <w:r>
+        <w:rPr>
+          <w:sz w:val="24"/>
+          <w:szCs w:val="24"/>
+        </w:rPr>
+        <w:t>error from server</w:t>
+      </w:r>
+    </w:p>
+    <w:p>
+      <w:pPr>
+        <w:bidi w:val="0"/>
+        <w:rPr>
+          <w:sz w:val="24"/>
+          <w:szCs w:val="24"/>
+        </w:rPr>
+      </w:pPr>
+    </w:p>
+    <w:p>
+      <w:pPr>
+        <w:bidi w:val="0"/>
+        <w:rPr>
+          <w:sz w:val="24"/>
+          <w:szCs w:val="24"/>
+        </w:rPr>
+      </w:pPr>
+    </w:p>
+    <w:p>
+      <w:pPr>
+        <w:bidi w:val="0"/>
+        <w:rPr>
+          <w:sz w:val="24"/>
+          <w:szCs w:val="24"/>
+        </w:rPr>
+      </w:pPr>
+    </w:p>
+    <w:p>
+      <w:pPr>
+        <w:bidi w:val="0"/>
+        <w:rPr>
+          <w:sz w:val="24"/>
+          <w:szCs w:val="24"/>
+        </w:rPr>
+      </w:pPr>
+    </w:p>
+    <w:p>
+      <w:pPr>
+        <w:bidi w:val="0"/>
+        <w:rPr>
+          <w:sz w:val="24"/>
+          <w:szCs w:val="24"/>
+        </w:rPr>
+      </w:pPr>
+    </w:p>
+    <w:p>
+      <w:pPr>
+        <w:bidi w:val="0"/>
+        <w:rPr>
+          <w:b/>
+          <w:bCs/>
+          <w:sz w:val="28"/>
+          <w:szCs w:val="28"/>
+          <w:u w:val="single"/>
+        </w:rPr>
+      </w:pPr>
+      <w:r>
+        <w:rPr>
+          <w:b/>
+          <w:bCs/>
+          <w:sz w:val="28"/>
+          <w:szCs w:val="28"/>
+          <w:u w:val="single"/>
+        </w:rPr>
+        <w:lastRenderedPageBreak/>
+        <w:t>Leave Room</w:t>
+      </w:r>
+    </w:p>
+    <w:p>
+      <w:pPr>
+        <w:bidi w:val="0"/>
+        <w:rPr>
+          <w:sz w:val="24"/>
+          <w:szCs w:val="24"/>
+          <w:u w:val="single"/>
+        </w:rPr>
+      </w:pPr>
+      <w:r>
+        <w:rPr>
+          <w:sz w:val="24"/>
+          <w:szCs w:val="24"/>
+          <w:u w:val="single"/>
+        </w:rPr>
+        <w:t xml:space="preserve">Code range </w:t>
+      </w:r>
+      <w:r>
+        <w:rPr>
+          <w:sz w:val="24"/>
+          <w:szCs w:val="24"/>
+          <w:u w:val="single"/>
+        </w:rPr>
+        <w:t>13</w:t>
+      </w:r>
+      <w:r>
+        <w:rPr>
+          <w:sz w:val="24"/>
+          <w:szCs w:val="24"/>
+          <w:u w:val="single"/>
+        </w:rPr>
+        <w:t xml:space="preserve">0 – </w:t>
+      </w:r>
+      <w:r>
+        <w:rPr>
+          <w:sz w:val="24"/>
+          <w:szCs w:val="24"/>
+          <w:u w:val="single"/>
+        </w:rPr>
+        <w:t>13</w:t>
+      </w:r>
+      <w:r>
+        <w:rPr>
+          <w:sz w:val="24"/>
+          <w:szCs w:val="24"/>
+          <w:u w:val="single"/>
+        </w:rPr>
+        <w:t>9</w:t>
+      </w:r>
+    </w:p>
+    <w:p>
+      <w:pPr>
+        <w:bidi w:val="0"/>
+        <w:rPr>
+          <w:sz w:val="24"/>
+          <w:szCs w:val="24"/>
+        </w:rPr>
+      </w:pPr>
+      <w:r>
+        <w:rPr>
+          <w:b/>
+          <w:bCs/>
+          <w:sz w:val="24"/>
+          <w:szCs w:val="24"/>
+        </w:rPr>
+        <w:t>13</w:t>
+      </w:r>
+      <w:r>
+        <w:rPr>
+          <w:b/>
+          <w:bCs/>
+          <w:sz w:val="24"/>
+          <w:szCs w:val="24"/>
+        </w:rPr>
+        <w:t>0</w:t>
+      </w:r>
+      <w:r>
+        <w:rPr>
+          <w:sz w:val="24"/>
+          <w:szCs w:val="24"/>
+        </w:rPr>
+        <w:t xml:space="preserve"> – </w:t>
+      </w:r>
+      <w:r>
+        <w:rPr>
+          <w:sz w:val="24"/>
+          <w:szCs w:val="24"/>
+        </w:rPr>
+        <w:t>leave room</w:t>
+      </w:r>
+      <w:r>
+        <w:rPr>
+          <w:sz w:val="24"/>
+          <w:szCs w:val="24"/>
+        </w:rPr>
+        <w:t xml:space="preserve"> request from client</w:t>
+      </w:r>
+    </w:p>
+    <w:p>
+      <w:pPr>
+        <w:bidi w:val="0"/>
+        <w:rPr>
+          <w:sz w:val="24"/>
+          <w:szCs w:val="24"/>
+        </w:rPr>
+      </w:pPr>
+      <w:r>
+        <w:rPr>
+          <w:b/>
+          <w:bCs/>
+          <w:sz w:val="24"/>
+          <w:szCs w:val="24"/>
+        </w:rPr>
+        <w:t>13</w:t>
+      </w:r>
+      <w:r>
+        <w:rPr>
+          <w:b/>
+          <w:bCs/>
+          <w:sz w:val="24"/>
+          <w:szCs w:val="24"/>
+        </w:rPr>
+        <w:t xml:space="preserve">1 </w:t>
+      </w:r>
+      <w:r>
+        <w:rPr>
+          <w:b/>
+          <w:bCs/>
+          <w:sz w:val="24"/>
+          <w:szCs w:val="24"/>
+        </w:rPr>
+        <w:t>–</w:t>
+      </w:r>
+      <w:r>
+        <w:rPr>
+          <w:b/>
+          <w:bCs/>
+          <w:sz w:val="24"/>
+          <w:szCs w:val="24"/>
+        </w:rPr>
+        <w:t xml:space="preserve"> </w:t>
+      </w:r>
+      <w:r>
+        <w:rPr>
+          <w:sz w:val="24"/>
+          <w:szCs w:val="24"/>
+        </w:rPr>
+        <w:t>leave room</w:t>
+      </w:r>
+      <w:r>
+        <w:rPr>
+          <w:sz w:val="24"/>
+          <w:szCs w:val="24"/>
+        </w:rPr>
+        <w:t xml:space="preserve"> response from server</w:t>
+      </w:r>
+    </w:p>
+    <w:p>
+      <w:pPr>
+        <w:bidi w:val="0"/>
+        <w:rPr>
+          <w:sz w:val="24"/>
+          <w:szCs w:val="24"/>
+        </w:rPr>
+      </w:pPr>
+      <w:r>
+        <w:rPr>
+          <w:b/>
+          <w:bCs/>
+          <w:sz w:val="24"/>
+          <w:szCs w:val="24"/>
+        </w:rPr>
+        <w:t>13</w:t>
+      </w:r>
+      <w:r>
+        <w:rPr>
+          <w:b/>
+          <w:bCs/>
+          <w:sz w:val="24"/>
+          <w:szCs w:val="24"/>
+        </w:rPr>
+        <w:t>5</w:t>
+      </w:r>
+      <w:r>
+        <w:rPr>
+          <w:sz w:val="24"/>
+          <w:szCs w:val="24"/>
+        </w:rPr>
+        <w:t xml:space="preserve"> - </w:t>
+      </w:r>
+      <w:r>
+        <w:rPr>
+          <w:sz w:val="24"/>
+          <w:szCs w:val="24"/>
+        </w:rPr>
+        <w:t>leave</w:t>
+      </w:r>
+      <w:r>
+        <w:rPr>
+          <w:sz w:val="24"/>
+          <w:szCs w:val="24"/>
+        </w:rPr>
+        <w:t xml:space="preserve"> </w:t>
+      </w:r>
+      <w:r>
+        <w:rPr>
+          <w:sz w:val="24"/>
+          <w:szCs w:val="24"/>
+        </w:rPr>
+        <w:t xml:space="preserve">room </w:t>
+      </w:r>
+      <w:r>
+        <w:rPr>
+          <w:sz w:val="24"/>
+          <w:szCs w:val="24"/>
+        </w:rPr>
+        <w:t>erro</w:t>
+      </w:r>
+      <w:r>
+        <w:rPr>
+          <w:sz w:val="24"/>
+          <w:szCs w:val="24"/>
+        </w:rPr>
+        <w:t>r from server</w:t>
       </w:r>
     </w:p>
     <w:p>
@@ -2082,7 +3182,7 @@
 </file>
 
 <file path=word/numbering.xml><?xml version="1.0" encoding="utf-8"?>
-<w:numbering xmlns:wpc="http://schemas.microsoft.com/office/word/2010/wordprocessingCanvas" xmlns:cx="http://schemas.microsoft.com/office/drawing/2014/chartex" xmlns:cx1="http://schemas.microsoft.com/office/drawing/2015/9/8/chartex" xmlns:cx2="http://schemas.microsoft.com/office/drawing/2015/10/21/chartex" xmlns:cx3="http://schemas.microsoft.com/office/drawing/2016/5/9/chartex" xmlns:cx4="http://schemas.microsoft.com/office/drawing/2016/5/10/chartex" xmlns:cx5="http://schemas.microsoft.com/office/drawing/2016/5/11/chartex" xmlns:cx6="http://schemas.microsoft.com/office/drawing/2016/5/12/chartex" xmlns:cx7="http://schemas.microsoft.com/office/drawing/2016/5/13/chartex" xmlns:cx8="http://schemas.microsoft.com/office/drawing/2016/5/14/chartex" xmlns:mc="http://schemas.openxmlformats.org/markup-compatibility/2006" xmlns:aink="http://schemas.microsoft.com/office/drawing/2016/ink" xmlns:am3d="http://schemas.microsoft.com/office/drawing/2017/model3d" xmlns:o="urn:schemas-microsoft-com:office:office" xmlns:r="http://schemas.openxmlformats.org/officeDocument/2006/relationships" xmlns:m="http://schemas.openxmlformats.org/officeDocument/2006/math" xmlns:v="urn:schemas-microsoft-com:vml" xmlns:wp14="http://schemas.microsoft.com/office/word/2010/wordprocessingDrawing" xmlns:wp="http://schemas.openxmlformats.org/drawingml/2006/wordprocessingDrawing" xmlns:w10="urn:schemas-microsoft-com:office:word" xmlns:w="http://schemas.openxmlformats.org/wordprocessingml/2006/main" xmlns:w14="http://schemas.microsoft.com/office/word/2010/wordml" xmlns:w15="http://schemas.microsoft.com/office/word/2012/wordml" xmlns:w16cid="http://schemas.microsoft.com/office/word/2016/wordml/cid" xmlns:w16se="http://schemas.microsoft.com/office/word/2015/wordml/symex" xmlns:wpg="http://schemas.microsoft.com/office/word/2010/wordprocessingGroup" xmlns:wpi="http://schemas.microsoft.com/office/word/2010/wordprocessingInk" xmlns:wne="http://schemas.microsoft.com/office/word/2006/wordml" xmlns:wps="http://schemas.microsoft.com/office/word/2010/wordprocessingShape" mc:Ignorable="w14 w15 w16se w16cid wp14">
+<w:numbering xmlns:wpc="http://schemas.microsoft.com/office/word/2010/wordprocessingCanvas" xmlns:cx="http://schemas.microsoft.com/office/drawing/2014/chartex" xmlns:cx1="http://schemas.microsoft.com/office/drawing/2015/9/8/chartex" xmlns:cx2="http://schemas.microsoft.com/office/drawing/2015/10/21/chartex" xmlns:cx3="http://schemas.microsoft.com/office/drawing/2016/5/9/chartex" xmlns:cx4="http://schemas.microsoft.com/office/drawing/2016/5/10/chartex" xmlns:cx5="http://schemas.microsoft.com/office/drawing/2016/5/11/chartex" xmlns:cx6="http://schemas.microsoft.com/office/drawing/2016/5/12/chartex" xmlns:cx7="http://schemas.microsoft.com/office/drawing/2016/5/13/chartex" xmlns:cx8="http://schemas.microsoft.com/office/drawing/2016/5/14/chartex" xmlns:mc="http://schemas.openxmlformats.org/markup-compatibility/2006" xmlns:aink="http://schemas.microsoft.com/office/drawing/2016/ink" xmlns:am3d="http://schemas.microsoft.com/office/drawing/2017/model3d" xmlns:o="urn:schemas-microsoft-com:office:office" xmlns:oel="http://schemas.microsoft.com/office/2019/extlst" xmlns:r="http://schemas.openxmlformats.org/officeDocument/2006/relationships" xmlns:m="http://schemas.openxmlformats.org/officeDocument/2006/math" xmlns:v="urn:schemas-microsoft-com:vml" xmlns:wp14="http://schemas.microsoft.com/office/word/2010/wordprocessingDrawing" xmlns:wp="http://schemas.openxmlformats.org/drawingml/2006/wordprocessingDrawing" xmlns:w10="urn:schemas-microsoft-com:office:word" xmlns:w="http://schemas.openxmlformats.org/wordprocessingml/2006/main" xmlns:w14="http://schemas.microsoft.com/office/word/2010/wordml" xmlns:w15="http://schemas.microsoft.com/office/word/2012/wordml" xmlns:w16cex="http://schemas.microsoft.com/office/word/2018/wordml/cex" xmlns:w16cid="http://schemas.microsoft.com/office/word/2016/wordml/cid" xmlns:w16="http://schemas.microsoft.com/office/word/2018/wordml" xmlns:w16du="http://schemas.microsoft.com/office/word/2023/wordml/word16du" xmlns:w16sdtdh="http://schemas.microsoft.com/office/word/2020/wordml/sdtdatahash" xmlns:w16se="http://schemas.microsoft.com/office/word/2015/wordml/symex" xmlns:wpg="http://schemas.microsoft.com/office/word/2010/wordprocessingGroup" xmlns:wpi="http://schemas.microsoft.com/office/word/2010/wordprocessingInk" xmlns:wne="http://schemas.microsoft.com/office/word/2006/wordml" xmlns:wps="http://schemas.microsoft.com/office/word/2010/wordprocessingShape" mc:Ignorable="w14 w15 w16se w16cid w16 w16cex w16sdtdh w16du wp14">
   <w:abstractNum w:abstractNumId="0" w15:restartNumberingAfterBreak="0">
     <w:nsid w:val="0C5845CB"/>
     <w:multiLevelType w:val="hybridMultilevel"/>
@@ -2173,6 +3273,95 @@
     </w:lvl>
   </w:abstractNum>
   <w:abstractNum w:abstractNumId="1" w15:restartNumberingAfterBreak="0">
+    <w:nsid w:val="21B01B10"/>
+    <w:multiLevelType w:val="hybridMultilevel"/>
+    <w:tmpl w:val="D34EF302"/>
+    <w:lvl w:ilvl="0" w:tplc="23526396">
+      <w:start w:val="1"/>
+      <w:numFmt w:val="decimal"/>
+      <w:lvlText w:val="%1."/>
+      <w:lvlJc w:val="left"/>
+      <w:pPr>
+        <w:ind w:left="2870" w:hanging="360"/>
+      </w:pPr>
+      <w:rPr>
+        <w:rFonts w:hint="default"/>
+      </w:rPr>
+    </w:lvl>
+    <w:lvl w:ilvl="1" w:tplc="04090019" w:tentative="1">
+      <w:start w:val="1"/>
+      <w:numFmt w:val="lowerLetter"/>
+      <w:lvlText w:val="%2."/>
+      <w:lvlJc w:val="left"/>
+      <w:pPr>
+        <w:ind w:left="3590" w:hanging="360"/>
+      </w:pPr>
+    </w:lvl>
+    <w:lvl w:ilvl="2" w:tplc="0409001B" w:tentative="1">
+      <w:start w:val="1"/>
+      <w:numFmt w:val="lowerRoman"/>
+      <w:lvlText w:val="%3."/>
+      <w:lvlJc w:val="right"/>
+      <w:pPr>
+        <w:ind w:left="4310" w:hanging="180"/>
+      </w:pPr>
+    </w:lvl>
+    <w:lvl w:ilvl="3" w:tplc="0409000F" w:tentative="1">
+      <w:start w:val="1"/>
+      <w:numFmt w:val="decimal"/>
+      <w:lvlText w:val="%4."/>
+      <w:lvlJc w:val="left"/>
+      <w:pPr>
+        <w:ind w:left="5030" w:hanging="360"/>
+      </w:pPr>
+    </w:lvl>
+    <w:lvl w:ilvl="4" w:tplc="04090019" w:tentative="1">
+      <w:start w:val="1"/>
+      <w:numFmt w:val="lowerLetter"/>
+      <w:lvlText w:val="%5."/>
+      <w:lvlJc w:val="left"/>
+      <w:pPr>
+        <w:ind w:left="5750" w:hanging="360"/>
+      </w:pPr>
+    </w:lvl>
+    <w:lvl w:ilvl="5" w:tplc="0409001B" w:tentative="1">
+      <w:start w:val="1"/>
+      <w:numFmt w:val="lowerRoman"/>
+      <w:lvlText w:val="%6."/>
+      <w:lvlJc w:val="right"/>
+      <w:pPr>
+        <w:ind w:left="6470" w:hanging="180"/>
+      </w:pPr>
+    </w:lvl>
+    <w:lvl w:ilvl="6" w:tplc="0409000F" w:tentative="1">
+      <w:start w:val="1"/>
+      <w:numFmt w:val="decimal"/>
+      <w:lvlText w:val="%7."/>
+      <w:lvlJc w:val="left"/>
+      <w:pPr>
+        <w:ind w:left="7190" w:hanging="360"/>
+      </w:pPr>
+    </w:lvl>
+    <w:lvl w:ilvl="7" w:tplc="04090019" w:tentative="1">
+      <w:start w:val="1"/>
+      <w:numFmt w:val="lowerLetter"/>
+      <w:lvlText w:val="%8."/>
+      <w:lvlJc w:val="left"/>
+      <w:pPr>
+        <w:ind w:left="7910" w:hanging="360"/>
+      </w:pPr>
+    </w:lvl>
+    <w:lvl w:ilvl="8" w:tplc="0409001B" w:tentative="1">
+      <w:start w:val="1"/>
+      <w:numFmt w:val="lowerRoman"/>
+      <w:lvlText w:val="%9."/>
+      <w:lvlJc w:val="right"/>
+      <w:pPr>
+        <w:ind w:left="8630" w:hanging="180"/>
+      </w:pPr>
+    </w:lvl>
+  </w:abstractNum>
+  <w:abstractNum w:abstractNumId="2" w15:restartNumberingAfterBreak="0">
     <w:nsid w:val="25432AAA"/>
     <w:multiLevelType w:val="hybridMultilevel"/>
     <w:tmpl w:val="5D947264"/>
@@ -2261,7 +3450,7 @@
       </w:pPr>
     </w:lvl>
   </w:abstractNum>
-  <w:abstractNum w:abstractNumId="2" w15:restartNumberingAfterBreak="0">
+  <w:abstractNum w:abstractNumId="3" w15:restartNumberingAfterBreak="0">
     <w:nsid w:val="29A72D05"/>
     <w:multiLevelType w:val="hybridMultilevel"/>
     <w:tmpl w:val="BA140AC0"/>
@@ -2350,7 +3539,7 @@
       </w:pPr>
     </w:lvl>
   </w:abstractNum>
-  <w:abstractNum w:abstractNumId="3" w15:restartNumberingAfterBreak="0">
+  <w:abstractNum w:abstractNumId="4" w15:restartNumberingAfterBreak="0">
     <w:nsid w:val="31814F24"/>
     <w:multiLevelType w:val="hybridMultilevel"/>
     <w:tmpl w:val="4F1C5F34"/>
@@ -2439,23 +3628,26 @@
       </w:pPr>
     </w:lvl>
   </w:abstractNum>
-  <w:num w:numId="1">
+  <w:num w:numId="1" w16cid:durableId="354428698">
+    <w:abstractNumId w:val="4"/>
+  </w:num>
+  <w:num w:numId="2" w16cid:durableId="214972332">
+    <w:abstractNumId w:val="2"/>
+  </w:num>
+  <w:num w:numId="3" w16cid:durableId="181747459">
     <w:abstractNumId w:val="3"/>
   </w:num>
-  <w:num w:numId="2">
+  <w:num w:numId="4" w16cid:durableId="1311978566">
+    <w:abstractNumId w:val="0"/>
+  </w:num>
+  <w:num w:numId="5" w16cid:durableId="1452363988">
     <w:abstractNumId w:val="1"/>
-  </w:num>
-  <w:num w:numId="3">
-    <w:abstractNumId w:val="2"/>
-  </w:num>
-  <w:num w:numId="4">
-    <w:abstractNumId w:val="0"/>
   </w:num>
 </w:numbering>
 </file>
 
 <file path=word/styles.xml><?xml version="1.0" encoding="utf-8"?>
-<w:styles xmlns:mc="http://schemas.openxmlformats.org/markup-compatibility/2006" xmlns:r="http://schemas.openxmlformats.org/officeDocument/2006/relationships" xmlns:w="http://schemas.openxmlformats.org/wordprocessingml/2006/main" xmlns:w14="http://schemas.microsoft.com/office/word/2010/wordml" xmlns:w15="http://schemas.microsoft.com/office/word/2012/wordml" xmlns:w16cid="http://schemas.microsoft.com/office/word/2016/wordml/cid" xmlns:w16se="http://schemas.microsoft.com/office/word/2015/wordml/symex" mc:Ignorable="w14 w15 w16se w16cid">
+<w:styles xmlns:mc="http://schemas.openxmlformats.org/markup-compatibility/2006" xmlns:r="http://schemas.openxmlformats.org/officeDocument/2006/relationships" xmlns:w="http://schemas.openxmlformats.org/wordprocessingml/2006/main" xmlns:w14="http://schemas.microsoft.com/office/word/2010/wordml" xmlns:w15="http://schemas.microsoft.com/office/word/2012/wordml" xmlns:w16cex="http://schemas.microsoft.com/office/word/2018/wordml/cex" xmlns:w16cid="http://schemas.microsoft.com/office/word/2016/wordml/cid" xmlns:w16="http://schemas.microsoft.com/office/word/2018/wordml" xmlns:w16du="http://schemas.microsoft.com/office/word/2023/wordml/word16du" xmlns:w16sdtdh="http://schemas.microsoft.com/office/word/2020/wordml/sdtdatahash" xmlns:w16se="http://schemas.microsoft.com/office/word/2015/wordml/symex" mc:Ignorable="w14 w15 w16se w16cid w16 w16cex w16sdtdh w16du">
   <w:docDefaults>
     <w:rPrDefault>
       <w:rPr>
@@ -2471,7 +3663,7 @@
       </w:pPr>
     </w:pPrDefault>
   </w:docDefaults>
-  <w:latentStyles w:defLockedState="0" w:defUIPriority="99" w:defSemiHidden="0" w:defUnhideWhenUsed="0" w:defQFormat="0" w:count="375">
+  <w:latentStyles w:defLockedState="0" w:defUIPriority="99" w:defSemiHidden="0" w:defUnhideWhenUsed="0" w:defQFormat="0" w:count="376">
     <w:lsdException w:name="Normal" w:uiPriority="0" w:qFormat="1"/>
     <w:lsdException w:name="heading 1" w:uiPriority="9" w:qFormat="1"/>
     <w:lsdException w:name="heading 2" w:semiHidden="1" w:uiPriority="9" w:unhideWhenUsed="1" w:qFormat="1"/>
@@ -2847,11 +4039,12 @@
     <w:lsdException w:name="Smart Hyperlink" w:semiHidden="1" w:unhideWhenUsed="1"/>
     <w:lsdException w:name="Hashtag" w:semiHidden="1" w:unhideWhenUsed="1"/>
     <w:lsdException w:name="Unresolved Mention" w:semiHidden="1" w:unhideWhenUsed="1"/>
+    <w:lsdException w:name="Smart Link" w:semiHidden="1" w:unhideWhenUsed="1"/>
   </w:latentStyles>
   <w:style w:type="paragraph" w:default="1" w:styleId="a">
     <w:name w:val="Normal"/>
     <w:qFormat/>
-    <w:rsid w:val="00D1514D"/>
+    <w:rsid w:val="001050AE"/>
     <w:pPr>
       <w:bidi/>
     </w:pPr>

</xml_diff>

<commit_message>
Fix protocol  file again
</commit_message>
<xml_diff>
--- a/TriviaProtocol.docx
+++ b/TriviaProtocol.docx
@@ -329,7 +329,15 @@
           <w:sz w:val="24"/>
           <w:szCs w:val="24"/>
         </w:rPr>
-        <w:t xml:space="preserve"> already logge</w:t>
+        <w:t xml:space="preserve"> already </w:t>
+      </w:r>
+      <w:proofErr w:type="gramStart"/>
+      <w:r>
+        <w:rPr>
+          <w:sz w:val="24"/>
+          <w:szCs w:val="24"/>
+        </w:rPr>
+        <w:t>logge</w:t>
       </w:r>
       <w:r>
         <w:rPr>
@@ -338,6 +346,7 @@
         </w:rPr>
         <w:t>d</w:t>
       </w:r>
+      <w:proofErr w:type="gramEnd"/>
     </w:p>
     <w:p>
       <w:pPr>
@@ -654,7 +663,23 @@
           <w:sz w:val="24"/>
           <w:szCs w:val="24"/>
         </w:rPr>
-        <w:t>username is already exist in the system</w:t>
+        <w:t xml:space="preserve">username is already </w:t>
+      </w:r>
+      <w:proofErr w:type="gramStart"/>
+      <w:r>
+        <w:rPr>
+          <w:sz w:val="24"/>
+          <w:szCs w:val="24"/>
+        </w:rPr>
+        <w:t>exist</w:t>
+      </w:r>
+      <w:proofErr w:type="gramEnd"/>
+      <w:r>
+        <w:rPr>
+          <w:sz w:val="24"/>
+          <w:szCs w:val="24"/>
+        </w:rPr>
+        <w:t xml:space="preserve"> in the system</w:t>
       </w:r>
       <w:r>
         <w:rPr>
@@ -704,8 +729,17 @@
           <w:sz w:val="24"/>
           <w:szCs w:val="24"/>
         </w:rPr>
-        <w:t>Password is not strong enough</w:t>
-      </w:r>
+        <w:t xml:space="preserve">Password is not strong </w:t>
+      </w:r>
+      <w:proofErr w:type="gramStart"/>
+      <w:r>
+        <w:rPr>
+          <w:sz w:val="24"/>
+          <w:szCs w:val="24"/>
+        </w:rPr>
+        <w:t>enough</w:t>
+      </w:r>
+      <w:proofErr w:type="gramEnd"/>
     </w:p>
     <w:p>
       <w:pPr>
@@ -1123,169 +1157,10 @@
           <w:szCs w:val="28"/>
           <w:u w:val="single"/>
         </w:rPr>
-        <w:t>Get Player In Room</w:t>
-      </w:r>
-    </w:p>
-    <w:p>
-      <w:pPr>
-        <w:bidi w:val="0"/>
-        <w:rPr>
-          <w:sz w:val="24"/>
-          <w:szCs w:val="24"/>
-          <w:u w:val="single"/>
-        </w:rPr>
-      </w:pPr>
-      <w:r>
-        <w:rPr>
-          <w:sz w:val="24"/>
-          <w:szCs w:val="24"/>
-          <w:u w:val="single"/>
-        </w:rPr>
-        <w:t>Code range 50 – 59</w:t>
-      </w:r>
-    </w:p>
-    <w:p>
-      <w:pPr>
-        <w:bidi w:val="0"/>
-        <w:rPr>
-          <w:sz w:val="24"/>
-          <w:szCs w:val="24"/>
-        </w:rPr>
-      </w:pPr>
-      <w:r>
-        <w:rPr>
-          <w:b/>
-          <w:bCs/>
-          <w:sz w:val="24"/>
-          <w:szCs w:val="24"/>
-        </w:rPr>
-        <w:t>5</w:t>
-      </w:r>
-      <w:r>
-        <w:rPr>
-          <w:b/>
-          <w:bCs/>
-          <w:sz w:val="24"/>
-          <w:szCs w:val="24"/>
-        </w:rPr>
-        <w:t>0</w:t>
-      </w:r>
-      <w:r>
-        <w:rPr>
-          <w:sz w:val="24"/>
-          <w:szCs w:val="24"/>
-        </w:rPr>
-        <w:t xml:space="preserve"> </w:t>
-      </w:r>
-      <w:r>
-        <w:rPr>
-          <w:sz w:val="24"/>
-          <w:szCs w:val="24"/>
-        </w:rPr>
-        <w:t>-</w:t>
-      </w:r>
-      <w:r>
-        <w:rPr>
-          <w:sz w:val="24"/>
-          <w:szCs w:val="24"/>
-        </w:rPr>
-        <w:t xml:space="preserve"> get player in room request from client</w:t>
-      </w:r>
-    </w:p>
-    <w:p>
-      <w:pPr>
-        <w:bidi w:val="0"/>
-        <w:rPr>
-          <w:sz w:val="24"/>
-          <w:szCs w:val="24"/>
-        </w:rPr>
-      </w:pPr>
-      <w:r>
-        <w:rPr>
-          <w:b/>
-          <w:bCs/>
-          <w:sz w:val="24"/>
-          <w:szCs w:val="24"/>
-        </w:rPr>
-        <w:t xml:space="preserve">51 </w:t>
-      </w:r>
-      <w:r>
-        <w:rPr>
-          <w:b/>
-          <w:bCs/>
-          <w:sz w:val="24"/>
-          <w:szCs w:val="24"/>
-        </w:rPr>
-        <w:t>-</w:t>
-      </w:r>
-      <w:r>
-        <w:rPr>
-          <w:b/>
-          <w:bCs/>
-          <w:sz w:val="24"/>
-          <w:szCs w:val="24"/>
-        </w:rPr>
-        <w:t xml:space="preserve"> </w:t>
-      </w:r>
-      <w:r>
-        <w:rPr>
-          <w:sz w:val="24"/>
-          <w:szCs w:val="24"/>
-        </w:rPr>
-        <w:t xml:space="preserve">get player in room </w:t>
-      </w:r>
-      <w:r>
-        <w:rPr>
-          <w:sz w:val="24"/>
-          <w:szCs w:val="24"/>
-        </w:rPr>
-        <w:t xml:space="preserve">response </w:t>
-      </w:r>
-      <w:r>
-        <w:rPr>
-          <w:sz w:val="24"/>
-          <w:szCs w:val="24"/>
-        </w:rPr>
-        <w:t>from server</w:t>
-      </w:r>
-    </w:p>
-    <w:p>
-      <w:pPr>
-        <w:bidi w:val="0"/>
-        <w:rPr>
-          <w:sz w:val="24"/>
-          <w:szCs w:val="24"/>
-        </w:rPr>
-      </w:pPr>
-      <w:r>
-        <w:rPr>
-          <w:b/>
-          <w:bCs/>
-          <w:sz w:val="24"/>
-          <w:szCs w:val="24"/>
-        </w:rPr>
-        <w:t>55</w:t>
-      </w:r>
-      <w:r>
-        <w:rPr>
-          <w:sz w:val="24"/>
-          <w:szCs w:val="24"/>
-        </w:rPr>
-        <w:t xml:space="preserve"> - get player in room error from server</w:t>
-      </w:r>
-    </w:p>
-    <w:p>
-      <w:pPr>
-        <w:bidi w:val="0"/>
-        <w:rPr>
-          <w:sz w:val="24"/>
-          <w:szCs w:val="24"/>
-        </w:rPr>
-      </w:pPr>
-    </w:p>
-    <w:p>
-      <w:pPr>
-        <w:bidi w:val="0"/>
+        <w:t xml:space="preserve">Get Player </w:t>
+      </w:r>
+      <w:proofErr w:type="gramStart"/>
+      <w:r>
         <w:rPr>
           <w:b/>
           <w:bCs/>
@@ -1293,7 +1168,9 @@
           <w:szCs w:val="28"/>
           <w:u w:val="single"/>
         </w:rPr>
-      </w:pPr>
+        <w:t>In</w:t>
+      </w:r>
+      <w:proofErr w:type="gramEnd"/>
       <w:r>
         <w:rPr>
           <w:b/>
@@ -1302,43 +1179,43 @@
           <w:szCs w:val="28"/>
           <w:u w:val="single"/>
         </w:rPr>
-        <w:t>Join Room</w:t>
-      </w:r>
-    </w:p>
-    <w:p>
-      <w:pPr>
-        <w:bidi w:val="0"/>
-        <w:rPr>
-          <w:sz w:val="24"/>
-          <w:szCs w:val="24"/>
-          <w:u w:val="single"/>
-        </w:rPr>
-      </w:pPr>
-      <w:r>
-        <w:rPr>
-          <w:sz w:val="24"/>
-          <w:szCs w:val="24"/>
-          <w:u w:val="single"/>
-        </w:rPr>
-        <w:t>Code range 60 – 69</w:t>
-      </w:r>
-    </w:p>
-    <w:p>
-      <w:pPr>
-        <w:bidi w:val="0"/>
-        <w:rPr>
-          <w:sz w:val="24"/>
-          <w:szCs w:val="24"/>
-        </w:rPr>
-      </w:pPr>
-      <w:r>
-        <w:rPr>
-          <w:b/>
-          <w:bCs/>
-          <w:sz w:val="24"/>
-          <w:szCs w:val="24"/>
-        </w:rPr>
-        <w:t>6</w:t>
+        <w:t xml:space="preserve"> Room</w:t>
+      </w:r>
+    </w:p>
+    <w:p>
+      <w:pPr>
+        <w:bidi w:val="0"/>
+        <w:rPr>
+          <w:sz w:val="24"/>
+          <w:szCs w:val="24"/>
+          <w:u w:val="single"/>
+        </w:rPr>
+      </w:pPr>
+      <w:r>
+        <w:rPr>
+          <w:sz w:val="24"/>
+          <w:szCs w:val="24"/>
+          <w:u w:val="single"/>
+        </w:rPr>
+        <w:t>Code range 50 – 59</w:t>
+      </w:r>
+    </w:p>
+    <w:p>
+      <w:pPr>
+        <w:bidi w:val="0"/>
+        <w:rPr>
+          <w:sz w:val="24"/>
+          <w:szCs w:val="24"/>
+        </w:rPr>
+      </w:pPr>
+      <w:r>
+        <w:rPr>
+          <w:b/>
+          <w:bCs/>
+          <w:sz w:val="24"/>
+          <w:szCs w:val="24"/>
+        </w:rPr>
+        <w:t>5</w:t>
       </w:r>
       <w:r>
         <w:rPr>
@@ -1354,25 +1231,57 @@
           <w:sz w:val="24"/>
           <w:szCs w:val="24"/>
         </w:rPr>
-        <w:t xml:space="preserve"> - get player in room request from client</w:t>
-      </w:r>
-    </w:p>
-    <w:p>
-      <w:pPr>
-        <w:bidi w:val="0"/>
-        <w:rPr>
-          <w:sz w:val="24"/>
-          <w:szCs w:val="24"/>
-        </w:rPr>
-      </w:pPr>
-      <w:r>
-        <w:rPr>
-          <w:b/>
-          <w:bCs/>
-          <w:sz w:val="24"/>
-          <w:szCs w:val="24"/>
-        </w:rPr>
-        <w:t xml:space="preserve">61 - </w:t>
+        <w:t xml:space="preserve"> </w:t>
+      </w:r>
+      <w:r>
+        <w:rPr>
+          <w:sz w:val="24"/>
+          <w:szCs w:val="24"/>
+        </w:rPr>
+        <w:t>-</w:t>
+      </w:r>
+      <w:r>
+        <w:rPr>
+          <w:sz w:val="24"/>
+          <w:szCs w:val="24"/>
+        </w:rPr>
+        <w:t xml:space="preserve"> get player in room request from client</w:t>
+      </w:r>
+    </w:p>
+    <w:p>
+      <w:pPr>
+        <w:bidi w:val="0"/>
+        <w:rPr>
+          <w:sz w:val="24"/>
+          <w:szCs w:val="24"/>
+        </w:rPr>
+      </w:pPr>
+      <w:r>
+        <w:rPr>
+          <w:b/>
+          <w:bCs/>
+          <w:sz w:val="24"/>
+          <w:szCs w:val="24"/>
+        </w:rPr>
+        <w:t xml:space="preserve">51 </w:t>
+      </w:r>
+      <w:r>
+        <w:rPr>
+          <w:b/>
+          <w:bCs/>
+          <w:sz w:val="24"/>
+          <w:szCs w:val="24"/>
+        </w:rPr>
+        <w:t>-</w:t>
+      </w:r>
+      <w:r>
+        <w:rPr>
+          <w:b/>
+          <w:bCs/>
+          <w:sz w:val="24"/>
+          <w:szCs w:val="24"/>
+        </w:rPr>
+        <w:t xml:space="preserve"> </w:t>
       </w:r>
       <w:r>
         <w:rPr>
@@ -1411,7 +1320,7 @@
           <w:sz w:val="24"/>
           <w:szCs w:val="24"/>
         </w:rPr>
-        <w:t>65</w:t>
+        <w:t>55</w:t>
       </w:r>
       <w:r>
         <w:rPr>
@@ -1449,9 +1358,137 @@
           <w:szCs w:val="28"/>
           <w:u w:val="single"/>
         </w:rPr>
-        <w:t>Create</w:t>
-      </w:r>
-      <w:r>
+        <w:t>Join Room</w:t>
+      </w:r>
+    </w:p>
+    <w:p>
+      <w:pPr>
+        <w:bidi w:val="0"/>
+        <w:rPr>
+          <w:sz w:val="24"/>
+          <w:szCs w:val="24"/>
+          <w:u w:val="single"/>
+        </w:rPr>
+      </w:pPr>
+      <w:r>
+        <w:rPr>
+          <w:sz w:val="24"/>
+          <w:szCs w:val="24"/>
+          <w:u w:val="single"/>
+        </w:rPr>
+        <w:t>Code range 60 – 69</w:t>
+      </w:r>
+    </w:p>
+    <w:p>
+      <w:pPr>
+        <w:bidi w:val="0"/>
+        <w:rPr>
+          <w:sz w:val="24"/>
+          <w:szCs w:val="24"/>
+        </w:rPr>
+      </w:pPr>
+      <w:r>
+        <w:rPr>
+          <w:b/>
+          <w:bCs/>
+          <w:sz w:val="24"/>
+          <w:szCs w:val="24"/>
+        </w:rPr>
+        <w:t>6</w:t>
+      </w:r>
+      <w:r>
+        <w:rPr>
+          <w:b/>
+          <w:bCs/>
+          <w:sz w:val="24"/>
+          <w:szCs w:val="24"/>
+        </w:rPr>
+        <w:t>0</w:t>
+      </w:r>
+      <w:r>
+        <w:rPr>
+          <w:sz w:val="24"/>
+          <w:szCs w:val="24"/>
+        </w:rPr>
+        <w:t xml:space="preserve"> - get player in room request from client</w:t>
+      </w:r>
+    </w:p>
+    <w:p>
+      <w:pPr>
+        <w:bidi w:val="0"/>
+        <w:rPr>
+          <w:sz w:val="24"/>
+          <w:szCs w:val="24"/>
+        </w:rPr>
+      </w:pPr>
+      <w:r>
+        <w:rPr>
+          <w:b/>
+          <w:bCs/>
+          <w:sz w:val="24"/>
+          <w:szCs w:val="24"/>
+        </w:rPr>
+        <w:t xml:space="preserve">61 - </w:t>
+      </w:r>
+      <w:r>
+        <w:rPr>
+          <w:sz w:val="24"/>
+          <w:szCs w:val="24"/>
+        </w:rPr>
+        <w:t xml:space="preserve">get player in room </w:t>
+      </w:r>
+      <w:r>
+        <w:rPr>
+          <w:sz w:val="24"/>
+          <w:szCs w:val="24"/>
+        </w:rPr>
+        <w:t xml:space="preserve">response </w:t>
+      </w:r>
+      <w:r>
+        <w:rPr>
+          <w:sz w:val="24"/>
+          <w:szCs w:val="24"/>
+        </w:rPr>
+        <w:t>from server</w:t>
+      </w:r>
+    </w:p>
+    <w:p>
+      <w:pPr>
+        <w:bidi w:val="0"/>
+        <w:rPr>
+          <w:sz w:val="24"/>
+          <w:szCs w:val="24"/>
+        </w:rPr>
+      </w:pPr>
+      <w:r>
+        <w:rPr>
+          <w:b/>
+          <w:bCs/>
+          <w:sz w:val="24"/>
+          <w:szCs w:val="24"/>
+        </w:rPr>
+        <w:t>65</w:t>
+      </w:r>
+      <w:r>
+        <w:rPr>
+          <w:sz w:val="24"/>
+          <w:szCs w:val="24"/>
+        </w:rPr>
+        <w:t xml:space="preserve"> - get player in room error from server</w:t>
+      </w:r>
+    </w:p>
+    <w:p>
+      <w:pPr>
+        <w:bidi w:val="0"/>
+        <w:rPr>
+          <w:sz w:val="24"/>
+          <w:szCs w:val="24"/>
+        </w:rPr>
+      </w:pPr>
+    </w:p>
+    <w:p>
+      <w:pPr>
+        <w:bidi w:val="0"/>
         <w:rPr>
           <w:b/>
           <w:bCs/>
@@ -1459,229 +1496,8 @@
           <w:szCs w:val="28"/>
           <w:u w:val="single"/>
         </w:rPr>
-        <w:t xml:space="preserve"> Room</w:t>
-      </w:r>
-    </w:p>
-    <w:p>
-      <w:pPr>
-        <w:bidi w:val="0"/>
-        <w:rPr>
-          <w:sz w:val="24"/>
-          <w:szCs w:val="24"/>
-          <w:u w:val="single"/>
-        </w:rPr>
-      </w:pPr>
-      <w:r>
-        <w:rPr>
-          <w:sz w:val="24"/>
-          <w:szCs w:val="24"/>
-          <w:u w:val="single"/>
-        </w:rPr>
-        <w:t xml:space="preserve">Code range </w:t>
-      </w:r>
-      <w:r>
-        <w:rPr>
-          <w:sz w:val="24"/>
-          <w:szCs w:val="24"/>
-          <w:u w:val="single"/>
-        </w:rPr>
-        <w:t>7</w:t>
-      </w:r>
-      <w:r>
-        <w:rPr>
-          <w:sz w:val="24"/>
-          <w:szCs w:val="24"/>
-          <w:u w:val="single"/>
-        </w:rPr>
-        <w:t xml:space="preserve">00 – </w:t>
-      </w:r>
-      <w:r>
-        <w:rPr>
-          <w:sz w:val="24"/>
-          <w:szCs w:val="24"/>
-          <w:u w:val="single"/>
-        </w:rPr>
-        <w:t>7</w:t>
-      </w:r>
-      <w:r>
-        <w:rPr>
-          <w:sz w:val="24"/>
-          <w:szCs w:val="24"/>
-          <w:u w:val="single"/>
-        </w:rPr>
-        <w:t>99</w:t>
-      </w:r>
-    </w:p>
-    <w:p>
-      <w:pPr>
-        <w:bidi w:val="0"/>
-        <w:rPr>
-          <w:sz w:val="24"/>
-          <w:szCs w:val="24"/>
-        </w:rPr>
-      </w:pPr>
-      <w:r>
-        <w:rPr>
-          <w:b/>
-          <w:bCs/>
-          <w:sz w:val="24"/>
-          <w:szCs w:val="24"/>
-        </w:rPr>
-        <w:t>7</w:t>
-      </w:r>
-      <w:r>
-        <w:rPr>
-          <w:b/>
-          <w:bCs/>
-          <w:sz w:val="24"/>
-          <w:szCs w:val="24"/>
-        </w:rPr>
-        <w:t>0</w:t>
-      </w:r>
-      <w:r>
-        <w:rPr>
-          <w:sz w:val="24"/>
-          <w:szCs w:val="24"/>
-        </w:rPr>
-        <w:t xml:space="preserve"> </w:t>
-      </w:r>
-      <w:r>
-        <w:rPr>
-          <w:sz w:val="24"/>
-          <w:szCs w:val="24"/>
-        </w:rPr>
-        <w:t>–</w:t>
-      </w:r>
-      <w:r>
-        <w:rPr>
-          <w:sz w:val="24"/>
-          <w:szCs w:val="24"/>
-        </w:rPr>
-        <w:t xml:space="preserve"> </w:t>
-      </w:r>
-      <w:r>
-        <w:rPr>
-          <w:sz w:val="24"/>
-          <w:szCs w:val="24"/>
-        </w:rPr>
-        <w:t>create room</w:t>
-      </w:r>
-      <w:r>
-        <w:rPr>
-          <w:sz w:val="24"/>
-          <w:szCs w:val="24"/>
-        </w:rPr>
-        <w:t xml:space="preserve"> request from client</w:t>
-      </w:r>
-    </w:p>
-    <w:p>
-      <w:pPr>
-        <w:bidi w:val="0"/>
-        <w:rPr>
-          <w:sz w:val="24"/>
-          <w:szCs w:val="24"/>
-        </w:rPr>
-      </w:pPr>
-      <w:r>
-        <w:rPr>
-          <w:b/>
-          <w:bCs/>
-          <w:sz w:val="24"/>
-          <w:szCs w:val="24"/>
-        </w:rPr>
-        <w:t>7</w:t>
-      </w:r>
-      <w:r>
-        <w:rPr>
-          <w:b/>
-          <w:bCs/>
-          <w:sz w:val="24"/>
-          <w:szCs w:val="24"/>
-        </w:rPr>
-        <w:t xml:space="preserve">1 - </w:t>
-      </w:r>
-      <w:r>
-        <w:rPr>
-          <w:sz w:val="24"/>
-          <w:szCs w:val="24"/>
-        </w:rPr>
-        <w:t xml:space="preserve">create room </w:t>
-      </w:r>
-      <w:r>
-        <w:rPr>
-          <w:sz w:val="24"/>
-          <w:szCs w:val="24"/>
-        </w:rPr>
-        <w:t xml:space="preserve">response </w:t>
-      </w:r>
-      <w:r>
-        <w:rPr>
-          <w:sz w:val="24"/>
-          <w:szCs w:val="24"/>
-        </w:rPr>
-        <w:t>from server</w:t>
-      </w:r>
-    </w:p>
-    <w:p>
-      <w:pPr>
-        <w:bidi w:val="0"/>
-        <w:rPr>
-          <w:sz w:val="24"/>
-          <w:szCs w:val="24"/>
-        </w:rPr>
-      </w:pPr>
-      <w:r>
-        <w:rPr>
-          <w:b/>
-          <w:bCs/>
-          <w:sz w:val="24"/>
-          <w:szCs w:val="24"/>
-        </w:rPr>
-        <w:t>7</w:t>
-      </w:r>
-      <w:r>
-        <w:rPr>
-          <w:b/>
-          <w:bCs/>
-          <w:sz w:val="24"/>
-          <w:szCs w:val="24"/>
-        </w:rPr>
-        <w:t>5</w:t>
-      </w:r>
-      <w:r>
-        <w:rPr>
-          <w:sz w:val="24"/>
-          <w:szCs w:val="24"/>
-        </w:rPr>
-        <w:t xml:space="preserve"> - </w:t>
-      </w:r>
-      <w:r>
-        <w:rPr>
-          <w:sz w:val="24"/>
-          <w:szCs w:val="24"/>
-        </w:rPr>
-        <w:t xml:space="preserve">create room </w:t>
-      </w:r>
-      <w:r>
-        <w:rPr>
-          <w:sz w:val="24"/>
-          <w:szCs w:val="24"/>
-        </w:rPr>
-        <w:t>error from server</w:t>
-      </w:r>
-    </w:p>
-    <w:p>
-      <w:pPr>
-        <w:bidi w:val="0"/>
-        <w:rPr>
-          <w:sz w:val="24"/>
-          <w:szCs w:val="24"/>
-        </w:rPr>
-      </w:pPr>
-    </w:p>
-    <w:p>
-      <w:pPr>
-        <w:bidi w:val="0"/>
+      </w:pPr>
+      <w:r>
         <w:rPr>
           <w:b/>
           <w:bCs/>
@@ -1689,7 +1505,8 @@
           <w:szCs w:val="28"/>
           <w:u w:val="single"/>
         </w:rPr>
-      </w:pPr>
+        <w:t>Create</w:t>
+      </w:r>
       <w:r>
         <w:rPr>
           <w:b/>
@@ -1698,6 +1515,245 @@
           <w:szCs w:val="28"/>
           <w:u w:val="single"/>
         </w:rPr>
+        <w:t xml:space="preserve"> Room</w:t>
+      </w:r>
+    </w:p>
+    <w:p>
+      <w:pPr>
+        <w:bidi w:val="0"/>
+        <w:rPr>
+          <w:sz w:val="24"/>
+          <w:szCs w:val="24"/>
+          <w:u w:val="single"/>
+        </w:rPr>
+      </w:pPr>
+      <w:r>
+        <w:rPr>
+          <w:sz w:val="24"/>
+          <w:szCs w:val="24"/>
+          <w:u w:val="single"/>
+        </w:rPr>
+        <w:t xml:space="preserve">Code range </w:t>
+      </w:r>
+      <w:r>
+        <w:rPr>
+          <w:sz w:val="24"/>
+          <w:szCs w:val="24"/>
+          <w:u w:val="single"/>
+        </w:rPr>
+        <w:t>7</w:t>
+      </w:r>
+      <w:r>
+        <w:rPr>
+          <w:sz w:val="24"/>
+          <w:szCs w:val="24"/>
+          <w:u w:val="single"/>
+        </w:rPr>
+        <w:t xml:space="preserve">00 – </w:t>
+      </w:r>
+      <w:r>
+        <w:rPr>
+          <w:sz w:val="24"/>
+          <w:szCs w:val="24"/>
+          <w:u w:val="single"/>
+        </w:rPr>
+        <w:t>7</w:t>
+      </w:r>
+      <w:r>
+        <w:rPr>
+          <w:sz w:val="24"/>
+          <w:szCs w:val="24"/>
+          <w:u w:val="single"/>
+        </w:rPr>
+        <w:t>99</w:t>
+      </w:r>
+    </w:p>
+    <w:p>
+      <w:pPr>
+        <w:bidi w:val="0"/>
+        <w:rPr>
+          <w:sz w:val="24"/>
+          <w:szCs w:val="24"/>
+        </w:rPr>
+      </w:pPr>
+      <w:r>
+        <w:rPr>
+          <w:b/>
+          <w:bCs/>
+          <w:sz w:val="24"/>
+          <w:szCs w:val="24"/>
+        </w:rPr>
+        <w:t>7</w:t>
+      </w:r>
+      <w:r>
+        <w:rPr>
+          <w:b/>
+          <w:bCs/>
+          <w:sz w:val="24"/>
+          <w:szCs w:val="24"/>
+        </w:rPr>
+        <w:t>0</w:t>
+      </w:r>
+      <w:r>
+        <w:rPr>
+          <w:sz w:val="24"/>
+          <w:szCs w:val="24"/>
+        </w:rPr>
+        <w:t xml:space="preserve"> </w:t>
+      </w:r>
+      <w:r>
+        <w:rPr>
+          <w:sz w:val="24"/>
+          <w:szCs w:val="24"/>
+        </w:rPr>
+        <w:t>–</w:t>
+      </w:r>
+      <w:r>
+        <w:rPr>
+          <w:sz w:val="24"/>
+          <w:szCs w:val="24"/>
+        </w:rPr>
+        <w:t xml:space="preserve"> </w:t>
+      </w:r>
+      <w:r>
+        <w:rPr>
+          <w:sz w:val="24"/>
+          <w:szCs w:val="24"/>
+        </w:rPr>
+        <w:t>create room</w:t>
+      </w:r>
+      <w:r>
+        <w:rPr>
+          <w:sz w:val="24"/>
+          <w:szCs w:val="24"/>
+        </w:rPr>
+        <w:t xml:space="preserve"> request from client</w:t>
+      </w:r>
+    </w:p>
+    <w:p>
+      <w:pPr>
+        <w:bidi w:val="0"/>
+        <w:rPr>
+          <w:sz w:val="24"/>
+          <w:szCs w:val="24"/>
+        </w:rPr>
+      </w:pPr>
+      <w:r>
+        <w:rPr>
+          <w:b/>
+          <w:bCs/>
+          <w:sz w:val="24"/>
+          <w:szCs w:val="24"/>
+        </w:rPr>
+        <w:t>7</w:t>
+      </w:r>
+      <w:r>
+        <w:rPr>
+          <w:b/>
+          <w:bCs/>
+          <w:sz w:val="24"/>
+          <w:szCs w:val="24"/>
+        </w:rPr>
+        <w:t xml:space="preserve">1 - </w:t>
+      </w:r>
+      <w:r>
+        <w:rPr>
+          <w:sz w:val="24"/>
+          <w:szCs w:val="24"/>
+        </w:rPr>
+        <w:t xml:space="preserve">create room </w:t>
+      </w:r>
+      <w:r>
+        <w:rPr>
+          <w:sz w:val="24"/>
+          <w:szCs w:val="24"/>
+        </w:rPr>
+        <w:t xml:space="preserve">response </w:t>
+      </w:r>
+      <w:r>
+        <w:rPr>
+          <w:sz w:val="24"/>
+          <w:szCs w:val="24"/>
+        </w:rPr>
+        <w:t>from server</w:t>
+      </w:r>
+    </w:p>
+    <w:p>
+      <w:pPr>
+        <w:bidi w:val="0"/>
+        <w:rPr>
+          <w:sz w:val="24"/>
+          <w:szCs w:val="24"/>
+        </w:rPr>
+      </w:pPr>
+      <w:r>
+        <w:rPr>
+          <w:b/>
+          <w:bCs/>
+          <w:sz w:val="24"/>
+          <w:szCs w:val="24"/>
+        </w:rPr>
+        <w:t>7</w:t>
+      </w:r>
+      <w:r>
+        <w:rPr>
+          <w:b/>
+          <w:bCs/>
+          <w:sz w:val="24"/>
+          <w:szCs w:val="24"/>
+        </w:rPr>
+        <w:t>5</w:t>
+      </w:r>
+      <w:r>
+        <w:rPr>
+          <w:sz w:val="24"/>
+          <w:szCs w:val="24"/>
+        </w:rPr>
+        <w:t xml:space="preserve"> - </w:t>
+      </w:r>
+      <w:r>
+        <w:rPr>
+          <w:sz w:val="24"/>
+          <w:szCs w:val="24"/>
+        </w:rPr>
+        <w:t xml:space="preserve">create room </w:t>
+      </w:r>
+      <w:r>
+        <w:rPr>
+          <w:sz w:val="24"/>
+          <w:szCs w:val="24"/>
+        </w:rPr>
+        <w:t>error from server</w:t>
+      </w:r>
+    </w:p>
+    <w:p>
+      <w:pPr>
+        <w:bidi w:val="0"/>
+        <w:rPr>
+          <w:sz w:val="24"/>
+          <w:szCs w:val="24"/>
+        </w:rPr>
+      </w:pPr>
+    </w:p>
+    <w:p>
+      <w:pPr>
+        <w:bidi w:val="0"/>
+        <w:rPr>
+          <w:b/>
+          <w:bCs/>
+          <w:sz w:val="28"/>
+          <w:szCs w:val="28"/>
+          <w:u w:val="single"/>
+        </w:rPr>
+      </w:pPr>
+      <w:r>
+        <w:rPr>
+          <w:b/>
+          <w:bCs/>
+          <w:sz w:val="28"/>
+          <w:szCs w:val="28"/>
+          <w:u w:val="single"/>
+        </w:rPr>
         <w:t>Get High Score</w:t>
       </w:r>
     </w:p>
@@ -1837,261 +1893,10 @@
           <w:szCs w:val="28"/>
           <w:u w:val="single"/>
         </w:rPr>
-        <w:t>Get Personal  Stats</w:t>
-      </w:r>
-    </w:p>
-    <w:p>
-      <w:pPr>
-        <w:bidi w:val="0"/>
-        <w:rPr>
-          <w:sz w:val="24"/>
-          <w:szCs w:val="24"/>
-          <w:u w:val="single"/>
-        </w:rPr>
-      </w:pPr>
-      <w:r>
-        <w:rPr>
-          <w:sz w:val="24"/>
-          <w:szCs w:val="24"/>
-          <w:u w:val="single"/>
-        </w:rPr>
-        <w:t xml:space="preserve">Code range </w:t>
-      </w:r>
-      <w:r>
-        <w:rPr>
-          <w:sz w:val="24"/>
-          <w:szCs w:val="24"/>
-          <w:u w:val="single"/>
-        </w:rPr>
-        <w:t>90</w:t>
-      </w:r>
-      <w:r>
-        <w:rPr>
-          <w:sz w:val="24"/>
-          <w:szCs w:val="24"/>
-          <w:u w:val="single"/>
-        </w:rPr>
-        <w:t xml:space="preserve"> – </w:t>
-      </w:r>
-      <w:r>
-        <w:rPr>
-          <w:sz w:val="24"/>
-          <w:szCs w:val="24"/>
-          <w:u w:val="single"/>
-        </w:rPr>
-        <w:t>9</w:t>
-      </w:r>
-      <w:r>
-        <w:rPr>
-          <w:sz w:val="24"/>
-          <w:szCs w:val="24"/>
-          <w:u w:val="single"/>
-        </w:rPr>
-        <w:t>9</w:t>
-      </w:r>
-    </w:p>
-    <w:p>
-      <w:pPr>
-        <w:bidi w:val="0"/>
-        <w:rPr>
-          <w:sz w:val="24"/>
-          <w:szCs w:val="24"/>
-        </w:rPr>
-      </w:pPr>
-      <w:r>
-        <w:rPr>
-          <w:b/>
-          <w:bCs/>
-          <w:sz w:val="24"/>
-          <w:szCs w:val="24"/>
-        </w:rPr>
-        <w:t>9</w:t>
-      </w:r>
-      <w:r>
-        <w:rPr>
-          <w:b/>
-          <w:bCs/>
-          <w:sz w:val="24"/>
-          <w:szCs w:val="24"/>
-        </w:rPr>
-        <w:t>0</w:t>
-      </w:r>
-      <w:r>
-        <w:rPr>
-          <w:sz w:val="24"/>
-          <w:szCs w:val="24"/>
-        </w:rPr>
-        <w:t xml:space="preserve"> – get </w:t>
-      </w:r>
-      <w:r>
-        <w:rPr>
-          <w:sz w:val="24"/>
-          <w:szCs w:val="24"/>
-        </w:rPr>
-        <w:t>personal</w:t>
-      </w:r>
-      <w:r>
-        <w:rPr>
-          <w:sz w:val="24"/>
-          <w:szCs w:val="24"/>
-        </w:rPr>
-        <w:t xml:space="preserve"> </w:t>
-      </w:r>
-      <w:r>
-        <w:rPr>
-          <w:sz w:val="24"/>
-          <w:szCs w:val="24"/>
-        </w:rPr>
-        <w:t>statistics</w:t>
-      </w:r>
-      <w:r>
-        <w:rPr>
-          <w:sz w:val="24"/>
-          <w:szCs w:val="24"/>
-        </w:rPr>
-        <w:t xml:space="preserve"> request from client</w:t>
-      </w:r>
-    </w:p>
-    <w:p>
-      <w:pPr>
-        <w:bidi w:val="0"/>
-        <w:rPr>
-          <w:b/>
-          <w:bCs/>
-          <w:sz w:val="24"/>
-          <w:szCs w:val="24"/>
-        </w:rPr>
-      </w:pPr>
-      <w:r>
-        <w:rPr>
-          <w:b/>
-          <w:bCs/>
-          <w:sz w:val="24"/>
-          <w:szCs w:val="24"/>
-        </w:rPr>
-        <w:t>9</w:t>
-      </w:r>
-      <w:r>
-        <w:rPr>
-          <w:b/>
-          <w:bCs/>
-          <w:sz w:val="24"/>
-          <w:szCs w:val="24"/>
-        </w:rPr>
-        <w:t xml:space="preserve">1 </w:t>
-      </w:r>
-      <w:r>
-        <w:rPr>
-          <w:b/>
-          <w:bCs/>
-          <w:sz w:val="24"/>
-          <w:szCs w:val="24"/>
-        </w:rPr>
-        <w:t xml:space="preserve">– </w:t>
-      </w:r>
-      <w:r>
-        <w:rPr>
-          <w:sz w:val="24"/>
-          <w:szCs w:val="24"/>
-        </w:rPr>
-        <w:t xml:space="preserve">get </w:t>
-      </w:r>
-      <w:r>
-        <w:rPr>
-          <w:sz w:val="24"/>
-          <w:szCs w:val="24"/>
-        </w:rPr>
-        <w:t xml:space="preserve">personal statistics </w:t>
-      </w:r>
-      <w:r>
-        <w:rPr>
-          <w:sz w:val="24"/>
-          <w:szCs w:val="24"/>
-        </w:rPr>
-        <w:t>response</w:t>
-      </w:r>
-      <w:r>
-        <w:rPr>
-          <w:sz w:val="24"/>
-          <w:szCs w:val="24"/>
-        </w:rPr>
-        <w:t xml:space="preserve"> from server</w:t>
-      </w:r>
-    </w:p>
-    <w:p>
-      <w:pPr>
-        <w:bidi w:val="0"/>
-        <w:rPr>
-          <w:sz w:val="24"/>
-          <w:szCs w:val="24"/>
-        </w:rPr>
-      </w:pPr>
-      <w:r>
-        <w:rPr>
-          <w:b/>
-          <w:bCs/>
-          <w:sz w:val="24"/>
-          <w:szCs w:val="24"/>
-        </w:rPr>
-        <w:t>9</w:t>
-      </w:r>
-      <w:r>
-        <w:rPr>
-          <w:b/>
-          <w:bCs/>
-          <w:sz w:val="24"/>
-          <w:szCs w:val="24"/>
-        </w:rPr>
-        <w:t>5</w:t>
-      </w:r>
-      <w:r>
-        <w:rPr>
-          <w:sz w:val="24"/>
-          <w:szCs w:val="24"/>
-        </w:rPr>
-        <w:t xml:space="preserve"> </w:t>
-      </w:r>
-      <w:r>
-        <w:rPr>
-          <w:sz w:val="24"/>
-          <w:szCs w:val="24"/>
-        </w:rPr>
-        <w:t>–</w:t>
-      </w:r>
-      <w:r>
-        <w:rPr>
-          <w:sz w:val="24"/>
-          <w:szCs w:val="24"/>
-        </w:rPr>
-        <w:t xml:space="preserve"> get</w:t>
-      </w:r>
-      <w:r>
-        <w:rPr>
-          <w:sz w:val="24"/>
-          <w:szCs w:val="24"/>
-        </w:rPr>
-        <w:t xml:space="preserve"> personal statistics</w:t>
-      </w:r>
-      <w:r>
-        <w:rPr>
-          <w:sz w:val="24"/>
-          <w:szCs w:val="24"/>
-        </w:rPr>
-        <w:t xml:space="preserve"> error from server</w:t>
-      </w:r>
-    </w:p>
-    <w:p>
-      <w:pPr>
-        <w:bidi w:val="0"/>
-        <w:rPr>
-          <w:sz w:val="24"/>
-          <w:szCs w:val="24"/>
-        </w:rPr>
-      </w:pPr>
-    </w:p>
-    <w:p>
-      <w:pPr>
-        <w:bidi w:val="0"/>
+        <w:t xml:space="preserve">Get </w:t>
+      </w:r>
+      <w:proofErr w:type="gramStart"/>
+      <w:r>
         <w:rPr>
           <w:b/>
           <w:bCs/>
@@ -2099,8 +1904,262 @@
           <w:szCs w:val="28"/>
           <w:u w:val="single"/>
         </w:rPr>
-      </w:pPr>
-      <w:r>
+        <w:t>Personal  Stats</w:t>
+      </w:r>
+      <w:proofErr w:type="gramEnd"/>
+    </w:p>
+    <w:p>
+      <w:pPr>
+        <w:bidi w:val="0"/>
+        <w:rPr>
+          <w:sz w:val="24"/>
+          <w:szCs w:val="24"/>
+          <w:u w:val="single"/>
+        </w:rPr>
+      </w:pPr>
+      <w:r>
+        <w:rPr>
+          <w:sz w:val="24"/>
+          <w:szCs w:val="24"/>
+          <w:u w:val="single"/>
+        </w:rPr>
+        <w:t xml:space="preserve">Code range </w:t>
+      </w:r>
+      <w:r>
+        <w:rPr>
+          <w:sz w:val="24"/>
+          <w:szCs w:val="24"/>
+          <w:u w:val="single"/>
+        </w:rPr>
+        <w:t>90</w:t>
+      </w:r>
+      <w:r>
+        <w:rPr>
+          <w:sz w:val="24"/>
+          <w:szCs w:val="24"/>
+          <w:u w:val="single"/>
+        </w:rPr>
+        <w:t xml:space="preserve"> – </w:t>
+      </w:r>
+      <w:r>
+        <w:rPr>
+          <w:sz w:val="24"/>
+          <w:szCs w:val="24"/>
+          <w:u w:val="single"/>
+        </w:rPr>
+        <w:t>9</w:t>
+      </w:r>
+      <w:r>
+        <w:rPr>
+          <w:sz w:val="24"/>
+          <w:szCs w:val="24"/>
+          <w:u w:val="single"/>
+        </w:rPr>
+        <w:t>9</w:t>
+      </w:r>
+    </w:p>
+    <w:p>
+      <w:pPr>
+        <w:bidi w:val="0"/>
+        <w:rPr>
+          <w:sz w:val="24"/>
+          <w:szCs w:val="24"/>
+        </w:rPr>
+      </w:pPr>
+      <w:r>
+        <w:rPr>
+          <w:b/>
+          <w:bCs/>
+          <w:sz w:val="24"/>
+          <w:szCs w:val="24"/>
+        </w:rPr>
+        <w:t>9</w:t>
+      </w:r>
+      <w:r>
+        <w:rPr>
+          <w:b/>
+          <w:bCs/>
+          <w:sz w:val="24"/>
+          <w:szCs w:val="24"/>
+        </w:rPr>
+        <w:t>0</w:t>
+      </w:r>
+      <w:r>
+        <w:rPr>
+          <w:sz w:val="24"/>
+          <w:szCs w:val="24"/>
+        </w:rPr>
+        <w:t xml:space="preserve"> – get </w:t>
+      </w:r>
+      <w:r>
+        <w:rPr>
+          <w:sz w:val="24"/>
+          <w:szCs w:val="24"/>
+        </w:rPr>
+        <w:t>personal</w:t>
+      </w:r>
+      <w:r>
+        <w:rPr>
+          <w:sz w:val="24"/>
+          <w:szCs w:val="24"/>
+        </w:rPr>
+        <w:t xml:space="preserve"> </w:t>
+      </w:r>
+      <w:r>
+        <w:rPr>
+          <w:sz w:val="24"/>
+          <w:szCs w:val="24"/>
+        </w:rPr>
+        <w:t>statistics</w:t>
+      </w:r>
+      <w:r>
+        <w:rPr>
+          <w:sz w:val="24"/>
+          <w:szCs w:val="24"/>
+        </w:rPr>
+        <w:t xml:space="preserve"> request from client</w:t>
+      </w:r>
+    </w:p>
+    <w:p>
+      <w:pPr>
+        <w:bidi w:val="0"/>
+        <w:rPr>
+          <w:b/>
+          <w:bCs/>
+          <w:sz w:val="24"/>
+          <w:szCs w:val="24"/>
+        </w:rPr>
+      </w:pPr>
+      <w:r>
+        <w:rPr>
+          <w:b/>
+          <w:bCs/>
+          <w:sz w:val="24"/>
+          <w:szCs w:val="24"/>
+        </w:rPr>
+        <w:t>9</w:t>
+      </w:r>
+      <w:r>
+        <w:rPr>
+          <w:b/>
+          <w:bCs/>
+          <w:sz w:val="24"/>
+          <w:szCs w:val="24"/>
+        </w:rPr>
+        <w:t xml:space="preserve">1 </w:t>
+      </w:r>
+      <w:r>
+        <w:rPr>
+          <w:b/>
+          <w:bCs/>
+          <w:sz w:val="24"/>
+          <w:szCs w:val="24"/>
+        </w:rPr>
+        <w:t xml:space="preserve">– </w:t>
+      </w:r>
+      <w:r>
+        <w:rPr>
+          <w:sz w:val="24"/>
+          <w:szCs w:val="24"/>
+        </w:rPr>
+        <w:t xml:space="preserve">get </w:t>
+      </w:r>
+      <w:r>
+        <w:rPr>
+          <w:sz w:val="24"/>
+          <w:szCs w:val="24"/>
+        </w:rPr>
+        <w:t xml:space="preserve">personal statistics </w:t>
+      </w:r>
+      <w:r>
+        <w:rPr>
+          <w:sz w:val="24"/>
+          <w:szCs w:val="24"/>
+        </w:rPr>
+        <w:t>response</w:t>
+      </w:r>
+      <w:r>
+        <w:rPr>
+          <w:sz w:val="24"/>
+          <w:szCs w:val="24"/>
+        </w:rPr>
+        <w:t xml:space="preserve"> from server</w:t>
+      </w:r>
+    </w:p>
+    <w:p>
+      <w:pPr>
+        <w:bidi w:val="0"/>
+        <w:rPr>
+          <w:sz w:val="24"/>
+          <w:szCs w:val="24"/>
+        </w:rPr>
+      </w:pPr>
+      <w:r>
+        <w:rPr>
+          <w:b/>
+          <w:bCs/>
+          <w:sz w:val="24"/>
+          <w:szCs w:val="24"/>
+        </w:rPr>
+        <w:t>9</w:t>
+      </w:r>
+      <w:r>
+        <w:rPr>
+          <w:b/>
+          <w:bCs/>
+          <w:sz w:val="24"/>
+          <w:szCs w:val="24"/>
+        </w:rPr>
+        <w:t>5</w:t>
+      </w:r>
+      <w:r>
+        <w:rPr>
+          <w:sz w:val="24"/>
+          <w:szCs w:val="24"/>
+        </w:rPr>
+        <w:t xml:space="preserve"> </w:t>
+      </w:r>
+      <w:r>
+        <w:rPr>
+          <w:sz w:val="24"/>
+          <w:szCs w:val="24"/>
+        </w:rPr>
+        <w:t>–</w:t>
+      </w:r>
+      <w:r>
+        <w:rPr>
+          <w:sz w:val="24"/>
+          <w:szCs w:val="24"/>
+        </w:rPr>
+        <w:t xml:space="preserve"> get</w:t>
+      </w:r>
+      <w:r>
+        <w:rPr>
+          <w:sz w:val="24"/>
+          <w:szCs w:val="24"/>
+        </w:rPr>
+        <w:t xml:space="preserve"> personal statistics</w:t>
+      </w:r>
+      <w:r>
+        <w:rPr>
+          <w:sz w:val="24"/>
+          <w:szCs w:val="24"/>
+        </w:rPr>
+        <w:t xml:space="preserve"> error from server</w:t>
+      </w:r>
+    </w:p>
+    <w:p>
+      <w:pPr>
+        <w:bidi w:val="0"/>
+        <w:rPr>
+          <w:sz w:val="24"/>
+          <w:szCs w:val="24"/>
+        </w:rPr>
+      </w:pPr>
+    </w:p>
+    <w:p>
+      <w:pPr>
+        <w:bidi w:val="0"/>
         <w:rPr>
           <w:b/>
           <w:bCs/>
@@ -2108,233 +2167,8 @@
           <w:szCs w:val="28"/>
           <w:u w:val="single"/>
         </w:rPr>
-        <w:t>Close Room</w:t>
-      </w:r>
-    </w:p>
-    <w:p>
-      <w:pPr>
-        <w:bidi w:val="0"/>
-        <w:rPr>
-          <w:sz w:val="24"/>
-          <w:szCs w:val="24"/>
-          <w:u w:val="single"/>
-        </w:rPr>
-      </w:pPr>
-      <w:r>
-        <w:rPr>
-          <w:sz w:val="24"/>
-          <w:szCs w:val="24"/>
-          <w:u w:val="single"/>
-        </w:rPr>
-        <w:t xml:space="preserve">Code range </w:t>
-      </w:r>
-      <w:r>
-        <w:rPr>
-          <w:sz w:val="24"/>
-          <w:szCs w:val="24"/>
-          <w:u w:val="single"/>
-        </w:rPr>
-        <w:t>100</w:t>
-      </w:r>
-      <w:r>
-        <w:rPr>
-          <w:sz w:val="24"/>
-          <w:szCs w:val="24"/>
-          <w:u w:val="single"/>
-        </w:rPr>
-        <w:t xml:space="preserve"> – </w:t>
-      </w:r>
-      <w:r>
-        <w:rPr>
-          <w:sz w:val="24"/>
-          <w:szCs w:val="24"/>
-          <w:u w:val="single"/>
-        </w:rPr>
-        <w:t>10</w:t>
-      </w:r>
-      <w:r>
-        <w:rPr>
-          <w:sz w:val="24"/>
-          <w:szCs w:val="24"/>
-          <w:u w:val="single"/>
-        </w:rPr>
-        <w:t>9</w:t>
-      </w:r>
-    </w:p>
-    <w:p>
-      <w:pPr>
-        <w:bidi w:val="0"/>
-        <w:rPr>
-          <w:sz w:val="24"/>
-          <w:szCs w:val="24"/>
-        </w:rPr>
-      </w:pPr>
-      <w:r>
-        <w:rPr>
-          <w:b/>
-          <w:bCs/>
-          <w:sz w:val="24"/>
-          <w:szCs w:val="24"/>
-        </w:rPr>
-        <w:t>10</w:t>
-      </w:r>
-      <w:r>
-        <w:rPr>
-          <w:b/>
-          <w:bCs/>
-          <w:sz w:val="24"/>
-          <w:szCs w:val="24"/>
-        </w:rPr>
-        <w:t>0</w:t>
-      </w:r>
-      <w:r>
-        <w:rPr>
-          <w:sz w:val="24"/>
-          <w:szCs w:val="24"/>
-        </w:rPr>
-        <w:t xml:space="preserve"> – </w:t>
-      </w:r>
-      <w:r>
-        <w:rPr>
-          <w:sz w:val="24"/>
-          <w:szCs w:val="24"/>
-        </w:rPr>
-        <w:t>close room</w:t>
-      </w:r>
-      <w:r>
-        <w:rPr>
-          <w:sz w:val="24"/>
-          <w:szCs w:val="24"/>
-        </w:rPr>
-        <w:t xml:space="preserve"> request from client</w:t>
-      </w:r>
-    </w:p>
-    <w:p>
-      <w:pPr>
-        <w:bidi w:val="0"/>
-        <w:rPr>
-          <w:sz w:val="24"/>
-          <w:szCs w:val="24"/>
-        </w:rPr>
-      </w:pPr>
-      <w:r>
-        <w:rPr>
-          <w:b/>
-          <w:bCs/>
-          <w:sz w:val="24"/>
-          <w:szCs w:val="24"/>
-        </w:rPr>
-        <w:t>10</w:t>
-      </w:r>
-      <w:r>
-        <w:rPr>
-          <w:b/>
-          <w:bCs/>
-          <w:sz w:val="24"/>
-          <w:szCs w:val="24"/>
-        </w:rPr>
-        <w:t xml:space="preserve">1 </w:t>
-      </w:r>
-      <w:r>
-        <w:rPr>
-          <w:b/>
-          <w:bCs/>
-          <w:sz w:val="24"/>
-          <w:szCs w:val="24"/>
-        </w:rPr>
-        <w:t>–</w:t>
-      </w:r>
-      <w:r>
-        <w:rPr>
-          <w:b/>
-          <w:bCs/>
-          <w:sz w:val="24"/>
-          <w:szCs w:val="24"/>
-        </w:rPr>
-        <w:t xml:space="preserve"> </w:t>
-      </w:r>
-      <w:r>
-        <w:rPr>
-          <w:sz w:val="24"/>
-          <w:szCs w:val="24"/>
-        </w:rPr>
-        <w:t>close room</w:t>
-      </w:r>
-      <w:r>
-        <w:rPr>
-          <w:sz w:val="24"/>
-          <w:szCs w:val="24"/>
-        </w:rPr>
-        <w:t xml:space="preserve"> response from server</w:t>
-      </w:r>
-    </w:p>
-    <w:p>
-      <w:pPr>
-        <w:bidi w:val="0"/>
-        <w:rPr>
-          <w:sz w:val="24"/>
-          <w:szCs w:val="24"/>
-        </w:rPr>
-      </w:pPr>
-      <w:r>
-        <w:rPr>
-          <w:b/>
-          <w:bCs/>
-          <w:sz w:val="24"/>
-          <w:szCs w:val="24"/>
-        </w:rPr>
-        <w:t>10</w:t>
-      </w:r>
-      <w:r>
-        <w:rPr>
-          <w:b/>
-          <w:bCs/>
-          <w:sz w:val="24"/>
-          <w:szCs w:val="24"/>
-        </w:rPr>
-        <w:t>5</w:t>
-      </w:r>
-      <w:r>
-        <w:rPr>
-          <w:sz w:val="24"/>
-          <w:szCs w:val="24"/>
-        </w:rPr>
-        <w:t xml:space="preserve"> </w:t>
-      </w:r>
-      <w:r>
-        <w:rPr>
-          <w:sz w:val="24"/>
-          <w:szCs w:val="24"/>
-        </w:rPr>
-        <w:t>- close room</w:t>
-      </w:r>
-      <w:r>
-        <w:rPr>
-          <w:sz w:val="24"/>
-          <w:szCs w:val="24"/>
-        </w:rPr>
-        <w:t xml:space="preserve"> error from serve</w:t>
-      </w:r>
-      <w:r>
-        <w:rPr>
-          <w:sz w:val="24"/>
-          <w:szCs w:val="24"/>
-        </w:rPr>
-        <w:t>r</w:t>
-      </w:r>
-    </w:p>
-    <w:p>
-      <w:pPr>
-        <w:bidi w:val="0"/>
-        <w:rPr>
-          <w:sz w:val="24"/>
-          <w:szCs w:val="24"/>
-        </w:rPr>
-      </w:pPr>
-    </w:p>
-    <w:p>
-      <w:pPr>
-        <w:bidi w:val="0"/>
+      </w:pPr>
+      <w:r>
         <w:rPr>
           <w:b/>
           <w:bCs/>
@@ -2342,8 +2176,233 @@
           <w:szCs w:val="28"/>
           <w:u w:val="single"/>
         </w:rPr>
-      </w:pPr>
-      <w:r>
+        <w:t>Close Room</w:t>
+      </w:r>
+    </w:p>
+    <w:p>
+      <w:pPr>
+        <w:bidi w:val="0"/>
+        <w:rPr>
+          <w:sz w:val="24"/>
+          <w:szCs w:val="24"/>
+          <w:u w:val="single"/>
+        </w:rPr>
+      </w:pPr>
+      <w:r>
+        <w:rPr>
+          <w:sz w:val="24"/>
+          <w:szCs w:val="24"/>
+          <w:u w:val="single"/>
+        </w:rPr>
+        <w:t xml:space="preserve">Code range </w:t>
+      </w:r>
+      <w:r>
+        <w:rPr>
+          <w:sz w:val="24"/>
+          <w:szCs w:val="24"/>
+          <w:u w:val="single"/>
+        </w:rPr>
+        <w:t>100</w:t>
+      </w:r>
+      <w:r>
+        <w:rPr>
+          <w:sz w:val="24"/>
+          <w:szCs w:val="24"/>
+          <w:u w:val="single"/>
+        </w:rPr>
+        <w:t xml:space="preserve"> – </w:t>
+      </w:r>
+      <w:r>
+        <w:rPr>
+          <w:sz w:val="24"/>
+          <w:szCs w:val="24"/>
+          <w:u w:val="single"/>
+        </w:rPr>
+        <w:t>10</w:t>
+      </w:r>
+      <w:r>
+        <w:rPr>
+          <w:sz w:val="24"/>
+          <w:szCs w:val="24"/>
+          <w:u w:val="single"/>
+        </w:rPr>
+        <w:t>9</w:t>
+      </w:r>
+    </w:p>
+    <w:p>
+      <w:pPr>
+        <w:bidi w:val="0"/>
+        <w:rPr>
+          <w:sz w:val="24"/>
+          <w:szCs w:val="24"/>
+        </w:rPr>
+      </w:pPr>
+      <w:r>
+        <w:rPr>
+          <w:b/>
+          <w:bCs/>
+          <w:sz w:val="24"/>
+          <w:szCs w:val="24"/>
+        </w:rPr>
+        <w:t>10</w:t>
+      </w:r>
+      <w:r>
+        <w:rPr>
+          <w:b/>
+          <w:bCs/>
+          <w:sz w:val="24"/>
+          <w:szCs w:val="24"/>
+        </w:rPr>
+        <w:t>0</w:t>
+      </w:r>
+      <w:r>
+        <w:rPr>
+          <w:sz w:val="24"/>
+          <w:szCs w:val="24"/>
+        </w:rPr>
+        <w:t xml:space="preserve"> – </w:t>
+      </w:r>
+      <w:r>
+        <w:rPr>
+          <w:sz w:val="24"/>
+          <w:szCs w:val="24"/>
+        </w:rPr>
+        <w:t>close room</w:t>
+      </w:r>
+      <w:r>
+        <w:rPr>
+          <w:sz w:val="24"/>
+          <w:szCs w:val="24"/>
+        </w:rPr>
+        <w:t xml:space="preserve"> request from client</w:t>
+      </w:r>
+    </w:p>
+    <w:p>
+      <w:pPr>
+        <w:bidi w:val="0"/>
+        <w:rPr>
+          <w:sz w:val="24"/>
+          <w:szCs w:val="24"/>
+        </w:rPr>
+      </w:pPr>
+      <w:r>
+        <w:rPr>
+          <w:b/>
+          <w:bCs/>
+          <w:sz w:val="24"/>
+          <w:szCs w:val="24"/>
+        </w:rPr>
+        <w:t>10</w:t>
+      </w:r>
+      <w:r>
+        <w:rPr>
+          <w:b/>
+          <w:bCs/>
+          <w:sz w:val="24"/>
+          <w:szCs w:val="24"/>
+        </w:rPr>
+        <w:t xml:space="preserve">1 </w:t>
+      </w:r>
+      <w:r>
+        <w:rPr>
+          <w:b/>
+          <w:bCs/>
+          <w:sz w:val="24"/>
+          <w:szCs w:val="24"/>
+        </w:rPr>
+        <w:t>–</w:t>
+      </w:r>
+      <w:r>
+        <w:rPr>
+          <w:b/>
+          <w:bCs/>
+          <w:sz w:val="24"/>
+          <w:szCs w:val="24"/>
+        </w:rPr>
+        <w:t xml:space="preserve"> </w:t>
+      </w:r>
+      <w:r>
+        <w:rPr>
+          <w:sz w:val="24"/>
+          <w:szCs w:val="24"/>
+        </w:rPr>
+        <w:t>close room</w:t>
+      </w:r>
+      <w:r>
+        <w:rPr>
+          <w:sz w:val="24"/>
+          <w:szCs w:val="24"/>
+        </w:rPr>
+        <w:t xml:space="preserve"> response from server</w:t>
+      </w:r>
+    </w:p>
+    <w:p>
+      <w:pPr>
+        <w:bidi w:val="0"/>
+        <w:rPr>
+          <w:sz w:val="24"/>
+          <w:szCs w:val="24"/>
+        </w:rPr>
+      </w:pPr>
+      <w:r>
+        <w:rPr>
+          <w:b/>
+          <w:bCs/>
+          <w:sz w:val="24"/>
+          <w:szCs w:val="24"/>
+        </w:rPr>
+        <w:t>10</w:t>
+      </w:r>
+      <w:r>
+        <w:rPr>
+          <w:b/>
+          <w:bCs/>
+          <w:sz w:val="24"/>
+          <w:szCs w:val="24"/>
+        </w:rPr>
+        <w:t>5</w:t>
+      </w:r>
+      <w:r>
+        <w:rPr>
+          <w:sz w:val="24"/>
+          <w:szCs w:val="24"/>
+        </w:rPr>
+        <w:t xml:space="preserve"> </w:t>
+      </w:r>
+      <w:r>
+        <w:rPr>
+          <w:sz w:val="24"/>
+          <w:szCs w:val="24"/>
+        </w:rPr>
+        <w:t>- close room</w:t>
+      </w:r>
+      <w:r>
+        <w:rPr>
+          <w:sz w:val="24"/>
+          <w:szCs w:val="24"/>
+        </w:rPr>
+        <w:t xml:space="preserve"> error from serve</w:t>
+      </w:r>
+      <w:r>
+        <w:rPr>
+          <w:sz w:val="24"/>
+          <w:szCs w:val="24"/>
+        </w:rPr>
+        <w:t>r</w:t>
+      </w:r>
+    </w:p>
+    <w:p>
+      <w:pPr>
+        <w:bidi w:val="0"/>
+        <w:rPr>
+          <w:sz w:val="24"/>
+          <w:szCs w:val="24"/>
+        </w:rPr>
+      </w:pPr>
+    </w:p>
+    <w:p>
+      <w:pPr>
+        <w:bidi w:val="0"/>
         <w:rPr>
           <w:b/>
           <w:bCs/>
@@ -2351,233 +2410,8 @@
           <w:szCs w:val="28"/>
           <w:u w:val="single"/>
         </w:rPr>
-        <w:t>Start game</w:t>
-      </w:r>
-    </w:p>
-    <w:p>
-      <w:pPr>
-        <w:bidi w:val="0"/>
-        <w:rPr>
-          <w:sz w:val="24"/>
-          <w:szCs w:val="24"/>
-          <w:u w:val="single"/>
-        </w:rPr>
-      </w:pPr>
-      <w:r>
-        <w:rPr>
-          <w:sz w:val="24"/>
-          <w:szCs w:val="24"/>
-          <w:u w:val="single"/>
-        </w:rPr>
-        <w:t xml:space="preserve">Code range </w:t>
-      </w:r>
-      <w:r>
-        <w:rPr>
-          <w:sz w:val="24"/>
-          <w:szCs w:val="24"/>
-          <w:u w:val="single"/>
-        </w:rPr>
-        <w:t>110</w:t>
-      </w:r>
-      <w:r>
-        <w:rPr>
-          <w:sz w:val="24"/>
-          <w:szCs w:val="24"/>
-          <w:u w:val="single"/>
-        </w:rPr>
-        <w:t xml:space="preserve"> –</w:t>
-      </w:r>
-      <w:r>
-        <w:rPr>
-          <w:sz w:val="24"/>
-          <w:szCs w:val="24"/>
-          <w:u w:val="single"/>
-        </w:rPr>
-        <w:t xml:space="preserve"> 11</w:t>
-      </w:r>
-      <w:r>
-        <w:rPr>
-          <w:sz w:val="24"/>
-          <w:szCs w:val="24"/>
-          <w:u w:val="single"/>
-        </w:rPr>
-        <w:t>9</w:t>
-      </w:r>
-    </w:p>
-    <w:p>
-      <w:pPr>
-        <w:bidi w:val="0"/>
-        <w:rPr>
-          <w:sz w:val="24"/>
-          <w:szCs w:val="24"/>
-        </w:rPr>
-      </w:pPr>
-      <w:r>
-        <w:rPr>
-          <w:b/>
-          <w:bCs/>
-          <w:sz w:val="24"/>
-          <w:szCs w:val="24"/>
-        </w:rPr>
-        <w:t>11</w:t>
-      </w:r>
-      <w:r>
-        <w:rPr>
-          <w:b/>
-          <w:bCs/>
-          <w:sz w:val="24"/>
-          <w:szCs w:val="24"/>
-        </w:rPr>
-        <w:t>0</w:t>
-      </w:r>
-      <w:r>
-        <w:rPr>
-          <w:sz w:val="24"/>
-          <w:szCs w:val="24"/>
-        </w:rPr>
-        <w:t xml:space="preserve"> – </w:t>
-      </w:r>
-      <w:r>
-        <w:rPr>
-          <w:sz w:val="24"/>
-          <w:szCs w:val="24"/>
-        </w:rPr>
-        <w:t>start game</w:t>
-      </w:r>
-      <w:r>
-        <w:rPr>
-          <w:sz w:val="24"/>
-          <w:szCs w:val="24"/>
-        </w:rPr>
-        <w:t xml:space="preserve"> request from client</w:t>
-      </w:r>
-    </w:p>
-    <w:p>
-      <w:pPr>
-        <w:bidi w:val="0"/>
-        <w:rPr>
-          <w:sz w:val="24"/>
-          <w:szCs w:val="24"/>
-        </w:rPr>
-      </w:pPr>
-      <w:r>
-        <w:rPr>
-          <w:b/>
-          <w:bCs/>
-          <w:sz w:val="24"/>
-          <w:szCs w:val="24"/>
-        </w:rPr>
-        <w:t>1</w:t>
-      </w:r>
-      <w:r>
-        <w:rPr>
-          <w:b/>
-          <w:bCs/>
-          <w:sz w:val="24"/>
-          <w:szCs w:val="24"/>
-        </w:rPr>
-        <w:t>11</w:t>
-      </w:r>
-      <w:r>
-        <w:rPr>
-          <w:b/>
-          <w:bCs/>
-          <w:sz w:val="24"/>
-          <w:szCs w:val="24"/>
-        </w:rPr>
-        <w:t xml:space="preserve"> </w:t>
-      </w:r>
-      <w:r>
-        <w:rPr>
-          <w:b/>
-          <w:bCs/>
-          <w:sz w:val="24"/>
-          <w:szCs w:val="24"/>
-        </w:rPr>
-        <w:t>–</w:t>
-      </w:r>
-      <w:r>
-        <w:rPr>
-          <w:b/>
-          <w:bCs/>
-          <w:sz w:val="24"/>
-          <w:szCs w:val="24"/>
-        </w:rPr>
-        <w:t xml:space="preserve"> </w:t>
-      </w:r>
-      <w:r>
-        <w:rPr>
-          <w:sz w:val="24"/>
-          <w:szCs w:val="24"/>
-        </w:rPr>
-        <w:t>start game</w:t>
-      </w:r>
-      <w:r>
-        <w:rPr>
-          <w:sz w:val="24"/>
-          <w:szCs w:val="24"/>
-        </w:rPr>
-        <w:t xml:space="preserve"> response from server</w:t>
-      </w:r>
-    </w:p>
-    <w:p>
-      <w:pPr>
-        <w:bidi w:val="0"/>
-        <w:rPr>
-          <w:sz w:val="24"/>
-          <w:szCs w:val="24"/>
-        </w:rPr>
-      </w:pPr>
-      <w:r>
-        <w:rPr>
-          <w:b/>
-          <w:bCs/>
-          <w:sz w:val="24"/>
-          <w:szCs w:val="24"/>
-        </w:rPr>
-        <w:t>115</w:t>
-      </w:r>
-      <w:r>
-        <w:rPr>
-          <w:sz w:val="24"/>
-          <w:szCs w:val="24"/>
-        </w:rPr>
-        <w:t xml:space="preserve"> </w:t>
-      </w:r>
-      <w:r>
-        <w:rPr>
-          <w:sz w:val="24"/>
-          <w:szCs w:val="24"/>
-        </w:rPr>
-        <w:t>–</w:t>
-      </w:r>
-      <w:r>
-        <w:rPr>
-          <w:sz w:val="24"/>
-          <w:szCs w:val="24"/>
-        </w:rPr>
-        <w:t xml:space="preserve"> </w:t>
-      </w:r>
-      <w:r>
-        <w:rPr>
-          <w:sz w:val="24"/>
-          <w:szCs w:val="24"/>
-        </w:rPr>
-        <w:t>start game error from server</w:t>
-      </w:r>
-    </w:p>
-    <w:p>
-      <w:pPr>
-        <w:bidi w:val="0"/>
-        <w:rPr>
-          <w:sz w:val="24"/>
-          <w:szCs w:val="24"/>
-        </w:rPr>
-      </w:pPr>
-    </w:p>
-    <w:p>
-      <w:pPr>
-        <w:bidi w:val="0"/>
+      </w:pPr>
+      <w:r>
         <w:rPr>
           <w:b/>
           <w:bCs/>
@@ -2585,7 +2419,9 @@
           <w:szCs w:val="28"/>
           <w:u w:val="single"/>
         </w:rPr>
-      </w:pPr>
+        <w:t xml:space="preserve">Start </w:t>
+      </w:r>
+      <w:proofErr w:type="gramStart"/>
       <w:r>
         <w:rPr>
           <w:b/>
@@ -2594,8 +2430,9 @@
           <w:szCs w:val="28"/>
           <w:u w:val="single"/>
         </w:rPr>
-        <w:t>Get Room State</w:t>
-      </w:r>
+        <w:t>game</w:t>
+      </w:r>
+      <w:proofErr w:type="gramEnd"/>
     </w:p>
     <w:p>
       <w:pPr>
@@ -2620,23 +2457,23 @@
           <w:szCs w:val="24"/>
           <w:u w:val="single"/>
         </w:rPr>
-        <w:t>12</w:t>
-      </w:r>
-      <w:r>
-        <w:rPr>
-          <w:sz w:val="24"/>
-          <w:szCs w:val="24"/>
-          <w:u w:val="single"/>
-        </w:rPr>
-        <w:t>0 –</w:t>
-      </w:r>
-      <w:r>
-        <w:rPr>
-          <w:sz w:val="24"/>
-          <w:szCs w:val="24"/>
-          <w:u w:val="single"/>
-        </w:rPr>
-        <w:t>12</w:t>
+        <w:t>110</w:t>
+      </w:r>
+      <w:r>
+        <w:rPr>
+          <w:sz w:val="24"/>
+          <w:szCs w:val="24"/>
+          <w:u w:val="single"/>
+        </w:rPr>
+        <w:t xml:space="preserve"> –</w:t>
+      </w:r>
+      <w:r>
+        <w:rPr>
+          <w:sz w:val="24"/>
+          <w:szCs w:val="24"/>
+          <w:u w:val="single"/>
+        </w:rPr>
+        <w:t xml:space="preserve"> 11</w:t>
       </w:r>
       <w:r>
         <w:rPr>
@@ -2662,7 +2499,7 @@
           <w:sz w:val="24"/>
           <w:szCs w:val="24"/>
         </w:rPr>
-        <w:t>12</w:t>
+        <w:t>11</w:t>
       </w:r>
       <w:r>
         <w:rPr>
@@ -2678,14 +2515,14 @@
           <w:sz w:val="24"/>
           <w:szCs w:val="24"/>
         </w:rPr>
-        <w:t xml:space="preserve"> – get </w:t>
-      </w:r>
-      <w:r>
-        <w:rPr>
-          <w:sz w:val="24"/>
-          <w:szCs w:val="24"/>
-        </w:rPr>
-        <w:t>room state</w:t>
+        <w:t xml:space="preserve"> – </w:t>
+      </w:r>
+      <w:r>
+        <w:rPr>
+          <w:sz w:val="24"/>
+          <w:szCs w:val="24"/>
+        </w:rPr>
+        <w:t>start game</w:t>
       </w:r>
       <w:r>
         <w:rPr>
@@ -2710,67 +2547,21 @@
           <w:sz w:val="24"/>
           <w:szCs w:val="24"/>
         </w:rPr>
-        <w:t>12</w:t>
-      </w:r>
-      <w:r>
-        <w:rPr>
-          <w:b/>
-          <w:bCs/>
-          <w:sz w:val="24"/>
-          <w:szCs w:val="24"/>
-        </w:rPr>
-        <w:t xml:space="preserve">1 - </w:t>
-      </w:r>
-      <w:r>
-        <w:rPr>
-          <w:sz w:val="24"/>
-          <w:szCs w:val="24"/>
-        </w:rPr>
-        <w:t xml:space="preserve">get </w:t>
-      </w:r>
-      <w:r>
-        <w:rPr>
-          <w:sz w:val="24"/>
-          <w:szCs w:val="24"/>
-        </w:rPr>
-        <w:t xml:space="preserve">room state </w:t>
-      </w:r>
-      <w:r>
-        <w:rPr>
-          <w:sz w:val="24"/>
-          <w:szCs w:val="24"/>
-        </w:rPr>
-        <w:t>response from server</w:t>
-      </w:r>
-    </w:p>
-    <w:p>
-      <w:pPr>
-        <w:bidi w:val="0"/>
-        <w:rPr>
-          <w:sz w:val="24"/>
-          <w:szCs w:val="24"/>
-        </w:rPr>
-      </w:pPr>
-      <w:r>
-        <w:rPr>
-          <w:b/>
-          <w:bCs/>
-          <w:sz w:val="24"/>
-          <w:szCs w:val="24"/>
-        </w:rPr>
-        <w:t>12</w:t>
-      </w:r>
-      <w:r>
-        <w:rPr>
-          <w:b/>
-          <w:bCs/>
-          <w:sz w:val="24"/>
-          <w:szCs w:val="24"/>
-        </w:rPr>
-        <w:t>5</w:t>
-      </w:r>
-      <w:r>
-        <w:rPr>
+        <w:t>1</w:t>
+      </w:r>
+      <w:r>
+        <w:rPr>
+          <w:b/>
+          <w:bCs/>
+          <w:sz w:val="24"/>
+          <w:szCs w:val="24"/>
+        </w:rPr>
+        <w:t>11</w:t>
+      </w:r>
+      <w:r>
+        <w:rPr>
+          <w:b/>
+          <w:bCs/>
           <w:sz w:val="24"/>
           <w:szCs w:val="24"/>
         </w:rPr>
@@ -2778,6 +2569,8 @@
       </w:r>
       <w:r>
         <w:rPr>
+          <w:b/>
+          <w:bCs/>
           <w:sz w:val="24"/>
           <w:szCs w:val="24"/>
         </w:rPr>
@@ -2785,20 +2578,8 @@
       </w:r>
       <w:r>
         <w:rPr>
-          <w:sz w:val="24"/>
-          <w:szCs w:val="24"/>
-        </w:rPr>
-        <w:t xml:space="preserve"> get</w:t>
-      </w:r>
-      <w:r>
-        <w:rPr>
-          <w:sz w:val="24"/>
-          <w:szCs w:val="24"/>
-        </w:rPr>
-        <w:t xml:space="preserve"> room state</w:t>
-      </w:r>
-      <w:r>
-        <w:rPr>
+          <w:b/>
+          <w:bCs/>
           <w:sz w:val="24"/>
           <w:szCs w:val="24"/>
         </w:rPr>
@@ -2809,44 +2590,61 @@
           <w:sz w:val="24"/>
           <w:szCs w:val="24"/>
         </w:rPr>
-        <w:t>error from server</w:t>
-      </w:r>
-    </w:p>
-    <w:p>
-      <w:pPr>
-        <w:bidi w:val="0"/>
-        <w:rPr>
-          <w:sz w:val="24"/>
-          <w:szCs w:val="24"/>
-        </w:rPr>
-      </w:pPr>
-    </w:p>
-    <w:p>
-      <w:pPr>
-        <w:bidi w:val="0"/>
-        <w:rPr>
-          <w:sz w:val="24"/>
-          <w:szCs w:val="24"/>
-        </w:rPr>
-      </w:pPr>
-    </w:p>
-    <w:p>
-      <w:pPr>
-        <w:bidi w:val="0"/>
-        <w:rPr>
-          <w:sz w:val="24"/>
-          <w:szCs w:val="24"/>
-        </w:rPr>
-      </w:pPr>
-    </w:p>
-    <w:p>
-      <w:pPr>
-        <w:bidi w:val="0"/>
-        <w:rPr>
-          <w:sz w:val="24"/>
-          <w:szCs w:val="24"/>
-        </w:rPr>
-      </w:pPr>
+        <w:t>start game</w:t>
+      </w:r>
+      <w:r>
+        <w:rPr>
+          <w:sz w:val="24"/>
+          <w:szCs w:val="24"/>
+        </w:rPr>
+        <w:t xml:space="preserve"> response from server</w:t>
+      </w:r>
+    </w:p>
+    <w:p>
+      <w:pPr>
+        <w:bidi w:val="0"/>
+        <w:rPr>
+          <w:sz w:val="24"/>
+          <w:szCs w:val="24"/>
+        </w:rPr>
+      </w:pPr>
+      <w:r>
+        <w:rPr>
+          <w:b/>
+          <w:bCs/>
+          <w:sz w:val="24"/>
+          <w:szCs w:val="24"/>
+        </w:rPr>
+        <w:t>115</w:t>
+      </w:r>
+      <w:r>
+        <w:rPr>
+          <w:sz w:val="24"/>
+          <w:szCs w:val="24"/>
+        </w:rPr>
+        <w:t xml:space="preserve"> </w:t>
+      </w:r>
+      <w:r>
+        <w:rPr>
+          <w:sz w:val="24"/>
+          <w:szCs w:val="24"/>
+        </w:rPr>
+        <w:t>–</w:t>
+      </w:r>
+      <w:r>
+        <w:rPr>
+          <w:sz w:val="24"/>
+          <w:szCs w:val="24"/>
+        </w:rPr>
+        <w:t xml:space="preserve"> </w:t>
+      </w:r>
+      <w:r>
+        <w:rPr>
+          <w:sz w:val="24"/>
+          <w:szCs w:val="24"/>
+        </w:rPr>
+        <w:t>start game error from server</w:t>
+      </w:r>
     </w:p>
     <w:p>
       <w:pPr>
@@ -2876,6 +2674,334 @@
           <w:szCs w:val="28"/>
           <w:u w:val="single"/>
         </w:rPr>
+        <w:t>Get Room State</w:t>
+      </w:r>
+    </w:p>
+    <w:p>
+      <w:pPr>
+        <w:bidi w:val="0"/>
+        <w:rPr>
+          <w:sz w:val="24"/>
+          <w:szCs w:val="24"/>
+          <w:u w:val="single"/>
+        </w:rPr>
+      </w:pPr>
+      <w:r>
+        <w:rPr>
+          <w:sz w:val="24"/>
+          <w:szCs w:val="24"/>
+          <w:u w:val="single"/>
+        </w:rPr>
+        <w:t xml:space="preserve">Code range </w:t>
+      </w:r>
+      <w:r>
+        <w:rPr>
+          <w:sz w:val="24"/>
+          <w:szCs w:val="24"/>
+          <w:u w:val="single"/>
+        </w:rPr>
+        <w:t>12</w:t>
+      </w:r>
+      <w:r>
+        <w:rPr>
+          <w:sz w:val="24"/>
+          <w:szCs w:val="24"/>
+          <w:u w:val="single"/>
+        </w:rPr>
+        <w:t>0 –</w:t>
+      </w:r>
+      <w:r>
+        <w:rPr>
+          <w:sz w:val="24"/>
+          <w:szCs w:val="24"/>
+          <w:u w:val="single"/>
+        </w:rPr>
+        <w:t>12</w:t>
+      </w:r>
+      <w:r>
+        <w:rPr>
+          <w:sz w:val="24"/>
+          <w:szCs w:val="24"/>
+          <w:u w:val="single"/>
+        </w:rPr>
+        <w:t>9</w:t>
+      </w:r>
+    </w:p>
+    <w:p>
+      <w:pPr>
+        <w:bidi w:val="0"/>
+        <w:rPr>
+          <w:sz w:val="24"/>
+          <w:szCs w:val="24"/>
+        </w:rPr>
+      </w:pPr>
+      <w:r>
+        <w:rPr>
+          <w:b/>
+          <w:bCs/>
+          <w:sz w:val="24"/>
+          <w:szCs w:val="24"/>
+        </w:rPr>
+        <w:t>12</w:t>
+      </w:r>
+      <w:r>
+        <w:rPr>
+          <w:b/>
+          <w:bCs/>
+          <w:sz w:val="24"/>
+          <w:szCs w:val="24"/>
+        </w:rPr>
+        <w:t>0</w:t>
+      </w:r>
+      <w:r>
+        <w:rPr>
+          <w:sz w:val="24"/>
+          <w:szCs w:val="24"/>
+        </w:rPr>
+        <w:t xml:space="preserve"> – get </w:t>
+      </w:r>
+      <w:r>
+        <w:rPr>
+          <w:sz w:val="24"/>
+          <w:szCs w:val="24"/>
+        </w:rPr>
+        <w:t>room state</w:t>
+      </w:r>
+      <w:r>
+        <w:rPr>
+          <w:sz w:val="24"/>
+          <w:szCs w:val="24"/>
+        </w:rPr>
+        <w:t xml:space="preserve"> request from client</w:t>
+      </w:r>
+    </w:p>
+    <w:p>
+      <w:pPr>
+        <w:bidi w:val="0"/>
+        <w:rPr>
+          <w:sz w:val="24"/>
+          <w:szCs w:val="24"/>
+        </w:rPr>
+      </w:pPr>
+      <w:r>
+        <w:rPr>
+          <w:b/>
+          <w:bCs/>
+          <w:sz w:val="24"/>
+          <w:szCs w:val="24"/>
+        </w:rPr>
+        <w:t>12</w:t>
+      </w:r>
+      <w:r>
+        <w:rPr>
+          <w:b/>
+          <w:bCs/>
+          <w:sz w:val="24"/>
+          <w:szCs w:val="24"/>
+        </w:rPr>
+        <w:t xml:space="preserve">1 - </w:t>
+      </w:r>
+      <w:r>
+        <w:rPr>
+          <w:sz w:val="24"/>
+          <w:szCs w:val="24"/>
+        </w:rPr>
+        <w:t xml:space="preserve">get </w:t>
+      </w:r>
+      <w:r>
+        <w:rPr>
+          <w:sz w:val="24"/>
+          <w:szCs w:val="24"/>
+        </w:rPr>
+        <w:t xml:space="preserve">room state </w:t>
+      </w:r>
+      <w:r>
+        <w:rPr>
+          <w:sz w:val="24"/>
+          <w:szCs w:val="24"/>
+        </w:rPr>
+        <w:t>response from server</w:t>
+      </w:r>
+    </w:p>
+    <w:p>
+      <w:pPr>
+        <w:bidi w:val="0"/>
+        <w:rPr>
+          <w:sz w:val="24"/>
+          <w:szCs w:val="24"/>
+        </w:rPr>
+      </w:pPr>
+      <w:r>
+        <w:rPr>
+          <w:b/>
+          <w:bCs/>
+          <w:sz w:val="24"/>
+          <w:szCs w:val="24"/>
+        </w:rPr>
+        <w:t>12</w:t>
+      </w:r>
+      <w:r>
+        <w:rPr>
+          <w:b/>
+          <w:bCs/>
+          <w:sz w:val="24"/>
+          <w:szCs w:val="24"/>
+        </w:rPr>
+        <w:t>5</w:t>
+      </w:r>
+      <w:r>
+        <w:rPr>
+          <w:sz w:val="24"/>
+          <w:szCs w:val="24"/>
+        </w:rPr>
+        <w:t xml:space="preserve"> </w:t>
+      </w:r>
+      <w:r>
+        <w:rPr>
+          <w:sz w:val="24"/>
+          <w:szCs w:val="24"/>
+        </w:rPr>
+        <w:t>–</w:t>
+      </w:r>
+      <w:r>
+        <w:rPr>
+          <w:sz w:val="24"/>
+          <w:szCs w:val="24"/>
+        </w:rPr>
+        <w:t xml:space="preserve"> get</w:t>
+      </w:r>
+      <w:r>
+        <w:rPr>
+          <w:sz w:val="24"/>
+          <w:szCs w:val="24"/>
+        </w:rPr>
+        <w:t xml:space="preserve"> room state</w:t>
+      </w:r>
+      <w:r>
+        <w:rPr>
+          <w:sz w:val="24"/>
+          <w:szCs w:val="24"/>
+        </w:rPr>
+        <w:t xml:space="preserve"> </w:t>
+      </w:r>
+      <w:r>
+        <w:rPr>
+          <w:sz w:val="24"/>
+          <w:szCs w:val="24"/>
+        </w:rPr>
+        <w:t xml:space="preserve">server </w:t>
+      </w:r>
+      <w:r>
+        <w:rPr>
+          <w:sz w:val="24"/>
+          <w:szCs w:val="24"/>
+        </w:rPr>
+        <w:t>error from server</w:t>
+      </w:r>
+    </w:p>
+    <w:p>
+      <w:pPr>
+        <w:bidi w:val="0"/>
+        <w:rPr>
+          <w:sz w:val="24"/>
+          <w:szCs w:val="24"/>
+        </w:rPr>
+      </w:pPr>
+      <w:r>
+        <w:rPr>
+          <w:b/>
+          <w:bCs/>
+          <w:sz w:val="24"/>
+          <w:szCs w:val="24"/>
+        </w:rPr>
+        <w:t>12</w:t>
+      </w:r>
+      <w:r>
+        <w:rPr>
+          <w:b/>
+          <w:bCs/>
+          <w:sz w:val="24"/>
+          <w:szCs w:val="24"/>
+        </w:rPr>
+        <w:t>6</w:t>
+      </w:r>
+      <w:r>
+        <w:rPr>
+          <w:sz w:val="24"/>
+          <w:szCs w:val="24"/>
+        </w:rPr>
+        <w:t xml:space="preserve"> – get room state </w:t>
+      </w:r>
+      <w:r>
+        <w:rPr>
+          <w:sz w:val="24"/>
+          <w:szCs w:val="24"/>
+        </w:rPr>
+        <w:t xml:space="preserve">room </w:t>
+      </w:r>
+      <w:r>
+        <w:rPr>
+          <w:sz w:val="24"/>
+          <w:szCs w:val="24"/>
+        </w:rPr>
+        <w:t>error from server</w:t>
+      </w:r>
+    </w:p>
+    <w:p>
+      <w:pPr>
+        <w:bidi w:val="0"/>
+        <w:rPr>
+          <w:sz w:val="24"/>
+          <w:szCs w:val="24"/>
+        </w:rPr>
+      </w:pPr>
+    </w:p>
+    <w:p>
+      <w:pPr>
+        <w:bidi w:val="0"/>
+        <w:rPr>
+          <w:sz w:val="24"/>
+          <w:szCs w:val="24"/>
+        </w:rPr>
+      </w:pPr>
+    </w:p>
+    <w:p>
+      <w:pPr>
+        <w:bidi w:val="0"/>
+        <w:rPr>
+          <w:sz w:val="24"/>
+          <w:szCs w:val="24"/>
+        </w:rPr>
+      </w:pPr>
+    </w:p>
+    <w:p>
+      <w:pPr>
+        <w:bidi w:val="0"/>
+        <w:rPr>
+          <w:sz w:val="24"/>
+          <w:szCs w:val="24"/>
+        </w:rPr>
+      </w:pPr>
+    </w:p>
+    <w:p>
+      <w:pPr>
+        <w:bidi w:val="0"/>
+        <w:rPr>
+          <w:b/>
+          <w:bCs/>
+          <w:sz w:val="28"/>
+          <w:szCs w:val="28"/>
+          <w:u w:val="single"/>
+        </w:rPr>
+      </w:pPr>
+      <w:r>
+        <w:rPr>
+          <w:b/>
+          <w:bCs/>
+          <w:sz w:val="28"/>
+          <w:szCs w:val="28"/>
+          <w:u w:val="single"/>
+        </w:rPr>
         <w:lastRenderedPageBreak/>
         <w:t>Leave Room</w:t>
       </w:r>
@@ -3153,66 +3279,25 @@
           <w:szCs w:val="24"/>
           <w:u w:val="single"/>
         </w:rPr>
-        <w:t>Code range 1</w:t>
-      </w:r>
-      <w:r>
-        <w:rPr>
-          <w:sz w:val="24"/>
-          <w:szCs w:val="24"/>
-          <w:u w:val="single"/>
-        </w:rPr>
-        <w:t>4</w:t>
-      </w:r>
-      <w:r>
-        <w:rPr>
-          <w:sz w:val="24"/>
-          <w:szCs w:val="24"/>
-          <w:u w:val="single"/>
-        </w:rPr>
-        <w:t>0 – 1</w:t>
-      </w:r>
-      <w:r>
-        <w:rPr>
-          <w:sz w:val="24"/>
-          <w:szCs w:val="24"/>
-          <w:u w:val="single"/>
-        </w:rPr>
-        <w:t>4</w:t>
-      </w:r>
-      <w:r>
-        <w:rPr>
-          <w:sz w:val="24"/>
-          <w:szCs w:val="24"/>
-          <w:u w:val="single"/>
-        </w:rPr>
-        <w:t>9</w:t>
-      </w:r>
-    </w:p>
-    <w:p>
-      <w:pPr>
-        <w:bidi w:val="0"/>
-        <w:rPr>
-          <w:sz w:val="24"/>
-          <w:szCs w:val="24"/>
-        </w:rPr>
-      </w:pPr>
-      <w:r>
-        <w:rPr>
-          <w:b/>
-          <w:bCs/>
-          <w:sz w:val="24"/>
-          <w:szCs w:val="24"/>
-        </w:rPr>
-        <w:t>1</w:t>
-      </w:r>
-      <w:r>
-        <w:rPr>
-          <w:b/>
-          <w:bCs/>
-          <w:sz w:val="24"/>
-          <w:szCs w:val="24"/>
-        </w:rPr>
-        <w:t>4</w:t>
+        <w:t>Code range 140 – 149</w:t>
+      </w:r>
+    </w:p>
+    <w:p>
+      <w:pPr>
+        <w:bidi w:val="0"/>
+        <w:rPr>
+          <w:sz w:val="24"/>
+          <w:szCs w:val="24"/>
+        </w:rPr>
+      </w:pPr>
+      <w:r>
+        <w:rPr>
+          <w:b/>
+          <w:bCs/>
+          <w:sz w:val="24"/>
+          <w:szCs w:val="24"/>
+        </w:rPr>
+        <w:t>14</w:t>
       </w:r>
       <w:r>
         <w:rPr>
@@ -3228,156 +3313,57 @@
           <w:sz w:val="24"/>
           <w:szCs w:val="24"/>
         </w:rPr>
-        <w:t xml:space="preserve"> –</w:t>
-      </w:r>
-      <w:r>
-        <w:rPr>
-          <w:sz w:val="24"/>
-          <w:szCs w:val="24"/>
-        </w:rPr>
-        <w:t xml:space="preserve"> get game results </w:t>
-      </w:r>
-      <w:r>
-        <w:rPr>
-          <w:sz w:val="24"/>
-          <w:szCs w:val="24"/>
-        </w:rPr>
-        <w:t>request from client</w:t>
-      </w:r>
-    </w:p>
-    <w:p>
-      <w:pPr>
-        <w:bidi w:val="0"/>
-        <w:rPr>
-          <w:sz w:val="24"/>
-          <w:szCs w:val="24"/>
-        </w:rPr>
-      </w:pPr>
-      <w:r>
-        <w:rPr>
-          <w:b/>
-          <w:bCs/>
-          <w:sz w:val="24"/>
-          <w:szCs w:val="24"/>
-        </w:rPr>
-        <w:t>1</w:t>
-      </w:r>
-      <w:r>
-        <w:rPr>
-          <w:b/>
-          <w:bCs/>
-          <w:sz w:val="24"/>
-          <w:szCs w:val="24"/>
-        </w:rPr>
-        <w:t>4</w:t>
-      </w:r>
-      <w:r>
-        <w:rPr>
-          <w:b/>
-          <w:bCs/>
-          <w:sz w:val="24"/>
-          <w:szCs w:val="24"/>
-        </w:rPr>
-        <w:t xml:space="preserve">1 – </w:t>
-      </w:r>
-      <w:r>
-        <w:rPr>
-          <w:sz w:val="24"/>
-          <w:szCs w:val="24"/>
-        </w:rPr>
-        <w:t>get game results</w:t>
-      </w:r>
-      <w:r>
-        <w:rPr>
-          <w:sz w:val="24"/>
-          <w:szCs w:val="24"/>
-        </w:rPr>
-        <w:t xml:space="preserve"> response from server</w:t>
-      </w:r>
-    </w:p>
-    <w:p>
-      <w:pPr>
-        <w:bidi w:val="0"/>
-        <w:rPr>
-          <w:sz w:val="24"/>
-          <w:szCs w:val="24"/>
-        </w:rPr>
-      </w:pPr>
-      <w:r>
-        <w:rPr>
-          <w:b/>
-          <w:bCs/>
-          <w:sz w:val="24"/>
-          <w:szCs w:val="24"/>
-        </w:rPr>
-        <w:t>1</w:t>
-      </w:r>
-      <w:r>
-        <w:rPr>
-          <w:b/>
-          <w:bCs/>
-          <w:sz w:val="24"/>
-          <w:szCs w:val="24"/>
-        </w:rPr>
-        <w:t>4</w:t>
-      </w:r>
-      <w:r>
-        <w:rPr>
-          <w:b/>
-          <w:bCs/>
-          <w:sz w:val="24"/>
-          <w:szCs w:val="24"/>
-        </w:rPr>
-        <w:t>5</w:t>
-      </w:r>
-      <w:r>
-        <w:rPr>
-          <w:sz w:val="24"/>
-          <w:szCs w:val="24"/>
-        </w:rPr>
-        <w:t xml:space="preserve"> </w:t>
-      </w:r>
-      <w:r>
-        <w:rPr>
-          <w:sz w:val="24"/>
-          <w:szCs w:val="24"/>
-        </w:rPr>
-        <w:t>–</w:t>
-      </w:r>
-      <w:r>
-        <w:rPr>
-          <w:sz w:val="24"/>
-          <w:szCs w:val="24"/>
-        </w:rPr>
-        <w:t xml:space="preserve"> </w:t>
-      </w:r>
-      <w:r>
-        <w:rPr>
-          <w:sz w:val="24"/>
-          <w:szCs w:val="24"/>
-        </w:rPr>
-        <w:t>get game</w:t>
-      </w:r>
-      <w:r>
-        <w:rPr>
-          <w:sz w:val="24"/>
-          <w:szCs w:val="24"/>
-        </w:rPr>
-        <w:t xml:space="preserve"> </w:t>
-      </w:r>
-      <w:r>
-        <w:rPr>
-          <w:sz w:val="24"/>
-          <w:szCs w:val="24"/>
-        </w:rPr>
-        <w:t xml:space="preserve">results </w:t>
-      </w:r>
-      <w:r>
-        <w:rPr>
-          <w:sz w:val="24"/>
-          <w:szCs w:val="24"/>
-        </w:rPr>
-        <w:t>error from server</w:t>
+        <w:t xml:space="preserve"> – get game results request from client</w:t>
+      </w:r>
+    </w:p>
+    <w:p>
+      <w:pPr>
+        <w:bidi w:val="0"/>
+        <w:rPr>
+          <w:sz w:val="24"/>
+          <w:szCs w:val="24"/>
+        </w:rPr>
+      </w:pPr>
+      <w:r>
+        <w:rPr>
+          <w:b/>
+          <w:bCs/>
+          <w:sz w:val="24"/>
+          <w:szCs w:val="24"/>
+        </w:rPr>
+        <w:t xml:space="preserve">141 – </w:t>
+      </w:r>
+      <w:r>
+        <w:rPr>
+          <w:sz w:val="24"/>
+          <w:szCs w:val="24"/>
+        </w:rPr>
+        <w:t>get game results response from server</w:t>
+      </w:r>
+    </w:p>
+    <w:p>
+      <w:pPr>
+        <w:bidi w:val="0"/>
+        <w:rPr>
+          <w:sz w:val="24"/>
+          <w:szCs w:val="24"/>
+        </w:rPr>
+      </w:pPr>
+      <w:r>
+        <w:rPr>
+          <w:b/>
+          <w:bCs/>
+          <w:sz w:val="24"/>
+          <w:szCs w:val="24"/>
+        </w:rPr>
+        <w:t>145</w:t>
+      </w:r>
+      <w:r>
+        <w:rPr>
+          <w:sz w:val="24"/>
+          <w:szCs w:val="24"/>
+        </w:rPr>
+        <w:t xml:space="preserve"> – get game results error from server</w:t>
       </w:r>
     </w:p>
     <w:p>
@@ -5020,7 +5006,7 @@
   <w:style w:type="paragraph" w:default="1" w:styleId="a">
     <w:name w:val="Normal"/>
     <w:qFormat/>
-    <w:rsid w:val="00DD305C"/>
+    <w:rsid w:val="000F7A60"/>
     <w:pPr>
       <w:bidi/>
     </w:pPr>

</xml_diff>